<commit_message>
docs(report): remove redundant embedded captions from architecture, ERD, and class diagrams
</commit_message>
<xml_diff>
--- a/outputs/BaoCao_UrbanLease.docx
+++ b/outputs/BaoCao_UrbanLease.docx
@@ -41,7 +41,7 @@
           <w:b/>
           <w:sz w:val="28"/>
         </w:rPr>
-        <w:t>KHOA CÔNG NGHỆ THÔNG TIN</w:t>
+        <w:t>KHOA KHOA HỌC VÀ KỸ THUẬT THÔNG TIN</w:t>
       </w:r>
     </w:p>
     <w:p>
@@ -687,7 +687,7 @@
             <w:b/>
             <w:sz w:val="23"/>
           </w:rPr>
-          <w:t>14</w:t>
+          <w:t>13</w:t>
         </w:r>
       </w:hyperlink>
     </w:p>
@@ -719,7 +719,7 @@
             <w:rFonts w:ascii="Times New Roman" w:hAnsi="Times New Roman"/>
             <w:sz w:val="23"/>
           </w:rPr>
-          <w:t>14</w:t>
+          <w:t>13</w:t>
         </w:r>
       </w:hyperlink>
     </w:p>
@@ -751,7 +751,7 @@
             <w:rFonts w:ascii="Times New Roman" w:hAnsi="Times New Roman"/>
             <w:sz w:val="23"/>
           </w:rPr>
-          <w:t>14</w:t>
+          <w:t>13</w:t>
         </w:r>
       </w:hyperlink>
     </w:p>
@@ -783,7 +783,7 @@
             <w:rFonts w:ascii="Times New Roman" w:hAnsi="Times New Roman"/>
             <w:sz w:val="22"/>
           </w:rPr>
-          <w:t>14</w:t>
+          <w:t>13</w:t>
         </w:r>
       </w:hyperlink>
     </w:p>
@@ -815,7 +815,7 @@
             <w:rFonts w:ascii="Times New Roman" w:hAnsi="Times New Roman"/>
             <w:sz w:val="22"/>
           </w:rPr>
-          <w:t>15</w:t>
+          <w:t>14</w:t>
         </w:r>
       </w:hyperlink>
     </w:p>
@@ -847,7 +847,7 @@
             <w:rFonts w:ascii="Times New Roman" w:hAnsi="Times New Roman"/>
             <w:sz w:val="22"/>
           </w:rPr>
-          <w:t>15</w:t>
+          <w:t>16</w:t>
         </w:r>
       </w:hyperlink>
     </w:p>
@@ -879,7 +879,7 @@
             <w:rFonts w:ascii="Times New Roman" w:hAnsi="Times New Roman"/>
             <w:sz w:val="22"/>
           </w:rPr>
-          <w:t>16</w:t>
+          <w:t>17</w:t>
         </w:r>
       </w:hyperlink>
     </w:p>
@@ -895,13 +895,13 @@
           <w:sz w:val="23"/>
         </w:rPr>
       </w:pPr>
-      <w:hyperlink w:anchor="_Toc_33" w:history="1">
+      <w:hyperlink w:anchor="_Toc_34" w:history="1">
         <w:r>
           <w:rPr>
             <w:rFonts w:ascii="Times New Roman" w:hAnsi="Times New Roman"/>
             <w:sz w:val="23"/>
           </w:rPr>
-          <w:t>3.3. Kiểm thử tự động với Pytest</w:t>
+          <w:t>3.3. Khai báo sử dụng AI</w:t>
         </w:r>
         <w:r>
           <w:tab/>
@@ -912,38 +912,6 @@
             <w:sz w:val="23"/>
           </w:rPr>
           <w:t>17</w:t>
-        </w:r>
-      </w:hyperlink>
-    </w:p>
-    <w:p>
-      <w:pPr>
-        <w:tabs>
-          <w:tab w:val="right" w:leader="dot" w:pos="9323"/>
-        </w:tabs>
-        <w:spacing w:before="15" w:after="15" w:line="240" w:lineRule="auto"/>
-        <w:ind w:left="280"/>
-        <w:rPr>
-          <w:rFonts w:ascii="Times New Roman" w:hAnsi="Times New Roman"/>
-          <w:sz w:val="23"/>
-        </w:rPr>
-      </w:pPr>
-      <w:hyperlink w:anchor="_Toc_34" w:history="1">
-        <w:r>
-          <w:rPr>
-            <w:rFonts w:ascii="Times New Roman" w:hAnsi="Times New Roman"/>
-            <w:sz w:val="23"/>
-          </w:rPr>
-          <w:t>3.4. Quy trình phát triển nhóm</w:t>
-        </w:r>
-        <w:r>
-          <w:tab/>
-        </w:r>
-        <w:r>
-          <w:rPr>
-            <w:rFonts w:ascii="Times New Roman" w:hAnsi="Times New Roman"/>
-            <w:sz w:val="23"/>
-          </w:rPr>
-          <w:t>18</w:t>
         </w:r>
       </w:hyperlink>
     </w:p>
@@ -977,7 +945,7 @@
             <w:b/>
             <w:sz w:val="23"/>
           </w:rPr>
-          <w:t>19</w:t>
+          <w:t>18</w:t>
         </w:r>
       </w:hyperlink>
     </w:p>
@@ -1011,7 +979,7 @@
             <w:b/>
             <w:sz w:val="23"/>
           </w:rPr>
-          <w:t>19</w:t>
+          <w:t>18</w:t>
         </w:r>
       </w:hyperlink>
     </w:p>
@@ -1107,7 +1075,7 @@
             <w:rFonts w:ascii="Times New Roman" w:hAnsi="Times New Roman"/>
             <w:sz w:val="23"/>
           </w:rPr>
-          <w:t>Hình 2.3: Sơ đồ lớp (Class Diagram) rút gọn — các model chính</w:t>
+          <w:t>Hình 2.3: Sơ đồ lớp (Class Diagram) rút gọn: các model chính</w:t>
         </w:r>
         <w:r>
           <w:tab/>
@@ -1148,7 +1116,7 @@
             <w:rFonts w:ascii="Times New Roman" w:hAnsi="Times New Roman"/>
             <w:sz w:val="23"/>
           </w:rPr>
-          <w:t>14</w:t>
+          <w:t>13</w:t>
         </w:r>
       </w:hyperlink>
     </w:p>
@@ -1179,7 +1147,38 @@
             <w:rFonts w:ascii="Times New Roman" w:hAnsi="Times New Roman"/>
             <w:sz w:val="23"/>
           </w:rPr>
-          <w:t>15</w:t>
+          <w:t>14</w:t>
+        </w:r>
+      </w:hyperlink>
+    </w:p>
+    <w:p>
+      <w:pPr>
+        <w:tabs>
+          <w:tab w:val="right" w:leader="dot" w:pos="9323"/>
+        </w:tabs>
+        <w:spacing w:after="50" w:line="276" w:lineRule="auto"/>
+        <w:rPr>
+          <w:rFonts w:ascii="Times New Roman" w:hAnsi="Times New Roman"/>
+          <w:sz w:val="23"/>
+        </w:rPr>
+      </w:pPr>
+      <w:hyperlink w:anchor="_Toc_Fig_LG1" w:history="1">
+        <w:r>
+          <w:rPr>
+            <w:rFonts w:ascii="Times New Roman" w:hAnsi="Times New Roman"/>
+            <w:sz w:val="23"/>
+          </w:rPr>
+          <w:t>Hình 3.3: Màn hình đăng nhập</w:t>
+        </w:r>
+        <w:r>
+          <w:tab/>
+        </w:r>
+        <w:r>
+          <w:rPr>
+            <w:rFonts w:ascii="Times New Roman" w:hAnsi="Times New Roman"/>
+            <w:sz w:val="23"/>
+          </w:rPr>
+          <w:t>14</w:t>
         </w:r>
       </w:hyperlink>
     </w:p>
@@ -1200,7 +1199,7 @@
             <w:rFonts w:ascii="Times New Roman" w:hAnsi="Times New Roman"/>
             <w:sz w:val="23"/>
           </w:rPr>
-          <w:t>Hình 3.3: Form đăng tin cho thuê và tải ảnh lên MinIO</w:t>
+          <w:t>Hình 3.4: Form đăng tin cho thuê và tải ảnh lên MinIO</w:t>
         </w:r>
         <w:r>
           <w:tab/>
@@ -1225,13 +1224,75 @@
           <w:sz w:val="23"/>
         </w:rPr>
       </w:pPr>
+      <w:hyperlink w:anchor="_Toc_Fig_LG2" w:history="1">
+        <w:r>
+          <w:rPr>
+            <w:rFonts w:ascii="Times New Roman" w:hAnsi="Times New Roman"/>
+            <w:sz w:val="23"/>
+          </w:rPr>
+          <w:t>Hình 3.5: Quản lý thư viện ảnh cá nhân</w:t>
+        </w:r>
+        <w:r>
+          <w:tab/>
+        </w:r>
+        <w:r>
+          <w:rPr>
+            <w:rFonts w:ascii="Times New Roman" w:hAnsi="Times New Roman"/>
+            <w:sz w:val="23"/>
+          </w:rPr>
+          <w:t>15</w:t>
+        </w:r>
+      </w:hyperlink>
+    </w:p>
+    <w:p>
+      <w:pPr>
+        <w:tabs>
+          <w:tab w:val="right" w:leader="dot" w:pos="9323"/>
+        </w:tabs>
+        <w:spacing w:after="50" w:line="276" w:lineRule="auto"/>
+        <w:rPr>
+          <w:rFonts w:ascii="Times New Roman" w:hAnsi="Times New Roman"/>
+          <w:sz w:val="23"/>
+        </w:rPr>
+      </w:pPr>
+      <w:hyperlink w:anchor="_Toc_Fig_LG3" w:history="1">
+        <w:r>
+          <w:rPr>
+            <w:rFonts w:ascii="Times New Roman" w:hAnsi="Times New Roman"/>
+            <w:sz w:val="23"/>
+          </w:rPr>
+          <w:t>Hình 3.6: Danh sách tin đăng yêu thích</w:t>
+        </w:r>
+        <w:r>
+          <w:tab/>
+        </w:r>
+        <w:r>
+          <w:rPr>
+            <w:rFonts w:ascii="Times New Roman" w:hAnsi="Times New Roman"/>
+            <w:sz w:val="23"/>
+          </w:rPr>
+          <w:t>15</w:t>
+        </w:r>
+      </w:hyperlink>
+    </w:p>
+    <w:p>
+      <w:pPr>
+        <w:tabs>
+          <w:tab w:val="right" w:leader="dot" w:pos="9323"/>
+        </w:tabs>
+        <w:spacing w:after="50" w:line="276" w:lineRule="auto"/>
+        <w:rPr>
+          <w:rFonts w:ascii="Times New Roman" w:hAnsi="Times New Roman"/>
+          <w:sz w:val="23"/>
+        </w:rPr>
+      </w:pPr>
       <w:hyperlink w:anchor="_Toc_Fig_34" w:history="1">
         <w:r>
           <w:rPr>
             <w:rFonts w:ascii="Times New Roman" w:hAnsi="Times New Roman"/>
             <w:sz w:val="23"/>
           </w:rPr>
-          <w:t>Hình 3.4: Hàng đợi duyệt và quản lý trạng thái tin đăng</w:t>
+          <w:t>Hình 3.7: Hàng đợi duyệt và quản lý trạng thái tin đăng</w:t>
         </w:r>
         <w:r>
           <w:tab/>
@@ -1262,7 +1323,7 @@
             <w:rFonts w:ascii="Times New Roman" w:hAnsi="Times New Roman"/>
             <w:sz w:val="23"/>
           </w:rPr>
-          <w:t>Hình 3.5: Dashboard biểu đồ phân tích thị trường và giá thuê</w:t>
+          <w:t>Hình 3.8: Dashboard biểu đồ phân tích thị trường và giá thuê</w:t>
         </w:r>
         <w:r>
           <w:tab/>
@@ -1273,6 +1334,37 @@
             <w:sz w:val="23"/>
           </w:rPr>
           <w:t>16</w:t>
+        </w:r>
+      </w:hyperlink>
+    </w:p>
+    <w:p>
+      <w:pPr>
+        <w:tabs>
+          <w:tab w:val="right" w:leader="dot" w:pos="9323"/>
+        </w:tabs>
+        <w:spacing w:after="50" w:line="276" w:lineRule="auto"/>
+        <w:rPr>
+          <w:rFonts w:ascii="Times New Roman" w:hAnsi="Times New Roman"/>
+          <w:sz w:val="23"/>
+        </w:rPr>
+      </w:pPr>
+      <w:hyperlink w:anchor="_Toc_Fig_36" w:history="1">
+        <w:r>
+          <w:rPr>
+            <w:rFonts w:ascii="Times New Roman" w:hAnsi="Times New Roman"/>
+            <w:sz w:val="23"/>
+          </w:rPr>
+          <w:t>Hình 3.9: Trang Tin tức thị trường công khai</w:t>
+        </w:r>
+        <w:r>
+          <w:tab/>
+        </w:r>
+        <w:r>
+          <w:rPr>
+            <w:rFonts w:ascii="Times New Roman" w:hAnsi="Times New Roman"/>
+            <w:sz w:val="23"/>
+          </w:rPr>
+          <w:t>17</w:t>
         </w:r>
       </w:hyperlink>
     </w:p>
@@ -1506,68 +1598,6 @@
     </w:p>
     <w:p>
       <w:pPr>
-        <w:tabs>
-          <w:tab w:val="right" w:leader="dot" w:pos="9323"/>
-        </w:tabs>
-        <w:spacing w:after="50" w:line="276" w:lineRule="auto"/>
-        <w:rPr>
-          <w:rFonts w:ascii="Times New Roman" w:hAnsi="Times New Roman"/>
-          <w:sz w:val="23"/>
-        </w:rPr>
-      </w:pPr>
-      <w:hyperlink w:anchor="_Toc_Tbl_31" w:history="1">
-        <w:r>
-          <w:rPr>
-            <w:rFonts w:ascii="Times New Roman" w:hAnsi="Times New Roman"/>
-            <w:sz w:val="23"/>
-          </w:rPr>
-          <w:t>Bảng 3.1: Các kịch bản kiểm thử tự động tiêu biểu (Pytest)</w:t>
-        </w:r>
-        <w:r>
-          <w:tab/>
-        </w:r>
-        <w:r>
-          <w:rPr>
-            <w:rFonts w:ascii="Times New Roman" w:hAnsi="Times New Roman"/>
-            <w:sz w:val="23"/>
-          </w:rPr>
-          <w:t>17</w:t>
-        </w:r>
-      </w:hyperlink>
-    </w:p>
-    <w:p>
-      <w:pPr>
-        <w:tabs>
-          <w:tab w:val="right" w:leader="dot" w:pos="9323"/>
-        </w:tabs>
-        <w:spacing w:after="50" w:line="276" w:lineRule="auto"/>
-        <w:rPr>
-          <w:rFonts w:ascii="Times New Roman" w:hAnsi="Times New Roman"/>
-          <w:sz w:val="23"/>
-        </w:rPr>
-      </w:pPr>
-      <w:hyperlink w:anchor="_Toc_Tbl_32" w:history="1">
-        <w:r>
-          <w:rPr>
-            <w:rFonts w:ascii="Times New Roman" w:hAnsi="Times New Roman"/>
-            <w:sz w:val="23"/>
-          </w:rPr>
-          <w:t>Bảng 3.2: Quy ước phân nhánh và quy tắc Commit của nhóm</w:t>
-        </w:r>
-        <w:r>
-          <w:tab/>
-        </w:r>
-        <w:r>
-          <w:rPr>
-            <w:rFonts w:ascii="Times New Roman" w:hAnsi="Times New Roman"/>
-            <w:sz w:val="23"/>
-          </w:rPr>
-          <w:t>18</w:t>
-        </w:r>
-      </w:hyperlink>
-    </w:p>
-    <w:p>
-      <w:pPr>
         <w:pStyle w:val="Title"/>
         <w:pageBreakBefore/>
       </w:pPr>
@@ -1748,7 +1778,7 @@
                 <w:rFonts w:ascii="Times New Roman" w:hAnsi="Times New Roman"/>
                 <w:sz w:val="21"/>
               </w:rPr>
-              <w:t>Frontend — phần giao diện người dùng</w:t>
+              <w:t>Frontend (phần giao diện người dùng)</w:t>
             </w:r>
           </w:p>
         </w:tc>
@@ -1801,7 +1831,7 @@
                 <w:rFonts w:ascii="Times New Roman" w:hAnsi="Times New Roman"/>
                 <w:sz w:val="21"/>
               </w:rPr>
-              <w:t>Backend — phần xử lý nghiệp vụ phía máy chủ</w:t>
+              <w:t>Backend (phần xử lý nghiệp vụ phía máy chủ)</w:t>
             </w:r>
           </w:p>
         </w:tc>
@@ -1854,7 +1884,7 @@
                 <w:rFonts w:ascii="Times New Roman" w:hAnsi="Times New Roman"/>
                 <w:sz w:val="21"/>
               </w:rPr>
-              <w:t>Application Programming Interface — giao diện lập trình ứng dụng</w:t>
+              <w:t>Application Programming Interface (giao diện lập trình ứng dụng)</w:t>
             </w:r>
           </w:p>
         </w:tc>
@@ -1907,7 +1937,7 @@
                 <w:rFonts w:ascii="Times New Roman" w:hAnsi="Times New Roman"/>
                 <w:sz w:val="21"/>
               </w:rPr>
-              <w:t>Representational State Transfer — kiểu kiến trúc API</w:t>
+              <w:t>Representational State Transfer (kiểu kiến trúc API)</w:t>
             </w:r>
           </w:p>
         </w:tc>
@@ -1960,7 +1990,7 @@
                 <w:rFonts w:ascii="Times New Roman" w:hAnsi="Times New Roman"/>
                 <w:sz w:val="21"/>
               </w:rPr>
-              <w:t>Object-Relational Mapping — ánh xạ đối tượng - quan hệ</w:t>
+              <w:t>Object-Relational Mapping (ánh xạ đối tượng, quan hệ)</w:t>
             </w:r>
           </w:p>
         </w:tc>
@@ -2013,7 +2043,7 @@
                 <w:rFonts w:ascii="Times New Roman" w:hAnsi="Times New Roman"/>
                 <w:sz w:val="21"/>
               </w:rPr>
-              <w:t>JSON Web Token — chuẩn mã hóa token xác thực</w:t>
+              <w:t>JSON Web Token (chuẩn mã hóa token xác thực)</w:t>
             </w:r>
           </w:p>
         </w:tc>
@@ -2066,7 +2096,7 @@
                 <w:rFonts w:ascii="Times New Roman" w:hAnsi="Times New Roman"/>
                 <w:sz w:val="21"/>
               </w:rPr>
-              <w:t>Create – Read – Update – Delete</w:t>
+              <w:t>Create / Read / Update / Delete</w:t>
             </w:r>
           </w:p>
         </w:tc>
@@ -2119,7 +2149,7 @@
                 <w:rFonts w:ascii="Times New Roman" w:hAnsi="Times New Roman"/>
                 <w:sz w:val="21"/>
               </w:rPr>
-              <w:t>Entity Relationship Diagram — sơ đồ thực thể liên kết</w:t>
+              <w:t>Entity Relationship Diagram (sơ đồ thực thể liên kết)</w:t>
             </w:r>
           </w:p>
         </w:tc>
@@ -2172,7 +2202,7 @@
                 <w:rFonts w:ascii="Times New Roman" w:hAnsi="Times New Roman"/>
                 <w:sz w:val="21"/>
               </w:rPr>
-              <w:t>Content Management System — hệ thống quản trị nội dung</w:t>
+              <w:t>Content Management System (hệ thống quản trị nội dung)</w:t>
             </w:r>
           </w:p>
         </w:tc>
@@ -2225,7 +2255,7 @@
                 <w:rFonts w:ascii="Times New Roman" w:hAnsi="Times New Roman"/>
                 <w:sz w:val="21"/>
               </w:rPr>
-              <w:t>Cross-Site Scripting — tấn công chèn mã kịch bản</w:t>
+              <w:t>Cross-Site Scripting (tấn công chèn mã kịch bản)</w:t>
             </w:r>
           </w:p>
         </w:tc>
@@ -2278,7 +2308,7 @@
                 <w:rFonts w:ascii="Times New Roman" w:hAnsi="Times New Roman"/>
                 <w:sz w:val="21"/>
               </w:rPr>
-              <w:t>User Interface / User Experience — giao diện / trải nghiệm người dùng</w:t>
+              <w:t>User Interface / User Experience (giao diện, trải nghiệm người dùng)</w:t>
             </w:r>
           </w:p>
         </w:tc>
@@ -2327,7 +2357,7 @@
         <w:rPr>
           <w:rFonts w:ascii="Times New Roman" w:hAnsi="Times New Roman"/>
         </w:rPr>
-        <w:t>Đồ án triển khai đầy đủ ba nhóm chức năng theo yêu cầu môn học: (1) người dùng chưa đăng nhập có thể xem, tìm kiếm và lọc tin đăng theo khu vực, giá, diện tích, loại hình; (2) người dùng đã đăng nhập có thể đăng, sửa, ẩn/xóa tin, quản lý tin của mình và lưu tin yêu thích; (3) quản trị viên quản lý người dùng, duyệt/khóa tin đăng, quản lý danh mục loại bất động sản và xem thống kê hệ thống. Ngoài phạm vi bắt buộc, nhóm bổ sung dashboard phân tích giá thuê theo khu vực/loại nhà (chức năng điểm cộng theo đề bài) và module Tin tức thị trường (CMS đơn giản, có trình soạn thảo rich-text) để tăng tính hoàn thiện của sản phẩm.</w:t>
+        <w:t>Đồ án triển khai đầy đủ ba nhóm chức năng theo yêu cầu môn học: người dùng chưa đăng nhập có thể xem, tìm kiếm và lọc tin đăng theo khu vực, giá, diện tích, loại hình; người dùng đã đăng nhập có thể đăng, sửa, ẩn/xóa tin, quản lý tin của mình và lưu tin yêu thích; quản trị viên quản lý người dùng, duyệt/khóa tin đăng, quản lý danh mục loại bất động sản và xem thống kê hệ thống. Ngoài phạm vi bắt buộc, nhóm bổ sung dashboard phân tích giá thuê theo khu vực/loại nhà (chức năng điểm cộng theo đề bài) và module Tin tức thị trường (CMS đơn giản, có trình soạn thảo rich-text) để tăng tính hoàn thiện của sản phẩm.</w:t>
       </w:r>
     </w:p>
     <w:p>
@@ -2383,7 +2413,7 @@
         <w:rPr>
           <w:rFonts w:ascii="Times New Roman" w:hAnsi="Times New Roman"/>
         </w:rPr>
-        <w:t>Nhu cầu tìm và cho thuê nhà — đặc biệt là phòng trọ, căn hộ dành cho sinh viên và người đi làm tại các thành phố lớn — luôn ở mức cao, nhưng phần lớn giao dịch hiện nay vẫn diễn ra qua các kênh phi tập trung (mạng xã hội, môi giới truyền miệng), thiếu công cụ tìm kiếm/lọc hiệu quả và thiếu cơ chế kiểm duyệt tin đăng. Đề tài xây dựng một nền tảng web cho thuê nhà hoàn chỉnh — từ đăng tin, tìm kiếm, duyệt tin đến thống kê thị trường — là cơ hội để nhóm vận dụng kiến thức lập trình Python (FastAPI) và các kỹ năng phát triển web full-stack vào một bài toán thực tế, có quy mô đủ lớn để thực hành thiết kế cơ sở dữ liệu, phân quyền, kiểm thử và triển khai bằng container.</w:t>
+        <w:t>Nhu cầu tìm và cho thuê nhà, nhất là phòng trọ và căn hộ cho sinh viên, người đi làm ở các thành phố lớn, luôn ở mức cao. Tuy nhiên phần lớn giao dịch hiện nay vẫn diễn ra qua các kênh phi tập trung như mạng xã hội, môi giới truyền miệng, thiếu công cụ tìm kiếm/lọc hiệu quả và thiếu cơ chế kiểm duyệt tin đăng. Vì vậy nhóm chọn xây dựng một nền tảng web cho thuê nhà hoàn chỉnh, từ đăng tin, tìm kiếm, duyệt tin đến thống kê thị trường, để vận dụng kiến thức lập trình Python (FastAPI) và kỹ năng phát triển web full-stack vào một bài toán thực tế, có quy mô đủ lớn để thực hành thiết kế cơ sở dữ liệu, phân quyền, kiểm thử và triển khai bằng container.</w:t>
       </w:r>
     </w:p>
     <w:p>
@@ -2433,7 +2463,7 @@
         <w:rPr>
           <w:rFonts w:ascii="Times New Roman" w:hAnsi="Times New Roman"/>
         </w:rPr>
-        <w:t>Báo cáo gồm ba chương: Chương 1 trình bày bài toán, mục tiêu và công nghệ sử dụng; Chương 2 phân tích yêu cầu và thiết kế hệ thống (kiến trúc, cơ sở dữ liệu, API); Chương 3 trình bày kết quả các chức năng đã hoàn thành, kết quả kiểm thử và tự đánh giá.</w:t>
+        <w:t>Báo cáo gồm ba chương: Chương 1 trình bày bài toán, mục tiêu và công nghệ sử dụng; Chương 2 phân tích yêu cầu và thiết kế hệ thống (kiến trúc, cơ sở dữ liệu, API); Chương 3 trình bày kết quả các chức năng đã hoàn thành và phần khai báo sử dụng AI trong quá trình làm đồ án.</w:t>
       </w:r>
     </w:p>
     <w:p>
@@ -2605,7 +2635,6 @@
           <w:p>
             <w:pPr>
               <w:spacing w:before="20" w:after="20" w:line="276" w:lineRule="auto"/>
-              <w:jc w:val="center"/>
             </w:pPr>
             <w:r>
               <w:rPr>
@@ -3271,7 +3300,6 @@
           <w:p>
             <w:pPr>
               <w:spacing w:before="20" w:after="20" w:line="276" w:lineRule="auto"/>
-              <w:jc w:val="center"/>
             </w:pPr>
             <w:r>
               <w:rPr>
@@ -3428,7 +3456,6 @@
           <w:p>
             <w:pPr>
               <w:spacing w:before="20" w:after="20" w:line="276" w:lineRule="auto"/>
-              <w:jc w:val="center"/>
             </w:pPr>
             <w:r>
               <w:rPr>
@@ -3742,7 +3769,6 @@
           <w:p>
             <w:pPr>
               <w:spacing w:before="20" w:after="20" w:line="276" w:lineRule="auto"/>
-              <w:jc w:val="center"/>
             </w:pPr>
             <w:r>
               <w:rPr>
@@ -3818,7 +3844,6 @@
           <w:p>
             <w:pPr>
               <w:spacing w:before="20" w:after="20" w:line="276" w:lineRule="auto"/>
-              <w:jc w:val="center"/>
             </w:pPr>
             <w:r>
               <w:rPr>
@@ -3969,7 +3994,6 @@
           <w:p>
             <w:pPr>
               <w:spacing w:before="20" w:after="20" w:line="276" w:lineRule="auto"/>
-              <w:jc w:val="center"/>
             </w:pPr>
             <w:r>
               <w:rPr>
@@ -4045,7 +4069,6 @@
           <w:p>
             <w:pPr>
               <w:spacing w:before="20" w:after="20" w:line="276" w:lineRule="auto"/>
-              <w:jc w:val="center"/>
             </w:pPr>
             <w:r>
               <w:rPr>
@@ -4121,7 +4144,6 @@
           <w:p>
             <w:pPr>
               <w:spacing w:before="20" w:after="20" w:line="276" w:lineRule="auto"/>
-              <w:jc w:val="center"/>
             </w:pPr>
             <w:r>
               <w:rPr>
@@ -4320,58 +4342,10 @@
     </w:p>
     <w:p>
       <w:pPr>
-        <w:spacing w:after="50" w:line="283" w:lineRule="auto"/>
-        <w:ind w:left="504"/>
-        <w:jc w:val="both"/>
-      </w:pPr>
-      <w:r>
-        <w:rPr>
-          <w:rFonts w:ascii="Times New Roman" w:hAnsi="Times New Roman"/>
-        </w:rPr>
-        <w:t>–  api/routes/ — mỗi file là một nhóm route (auth, tin_dang, danh_muc, bao_cao, bai_viet, thong_ke...).</w:t>
-      </w:r>
-    </w:p>
-    <w:p>
-      <w:pPr>
-        <w:spacing w:after="50" w:line="283" w:lineRule="auto"/>
-        <w:ind w:left="504"/>
-        <w:jc w:val="both"/>
-      </w:pPr>
-      <w:r>
-        <w:rPr>
-          <w:rFonts w:ascii="Times New Roman" w:hAnsi="Times New Roman"/>
-        </w:rPr>
-        <w:t>–  api/dependencies/ — các dependency dùng chung: get_db, get_current_user, get_current_admin_user.</w:t>
-      </w:r>
-    </w:p>
-    <w:p>
-      <w:pPr>
-        <w:spacing w:after="50" w:line="283" w:lineRule="auto"/>
-        <w:ind w:left="504"/>
-        <w:jc w:val="both"/>
-      </w:pPr>
-      <w:r>
-        <w:rPr>
-          <w:rFonts w:ascii="Times New Roman" w:hAnsi="Times New Roman"/>
-        </w:rPr>
-        <w:t>–  models/, schemas/ — model SQLAlchemy và schema Pydantic (ranh giới chuyển đổi tên tiếng Việt trong DB sang JSON tiếng Anh camelCase nằm ở đây).</w:t>
-      </w:r>
-    </w:p>
-    <w:p>
-      <w:pPr>
-        <w:spacing w:after="50" w:line="283" w:lineRule="auto"/>
-        <w:ind w:left="504"/>
-        <w:jc w:val="both"/>
-      </w:pPr>
-      <w:r>
-        <w:rPr>
-          <w:rFonts w:ascii="Times New Roman" w:hAnsi="Times New Roman"/>
-        </w:rPr>
-        <w:t>–  alembic/versions/ — migration cơ sở dữ liệu; scripts/seed.py — seed dữ liệu mẫu, chạy lại được nhiều lần an toàn.</w:t>
-      </w:r>
-    </w:p>
-    <w:p>
-      <w:pPr>
+        <w:numPr>
+          <w:ilvl w:val="0"/>
+          <w:numId w:val="100"/>
+        </w:numPr>
         <w:spacing w:after="50" w:line="283" w:lineRule="auto"/>
         <w:jc w:val="both"/>
       </w:pPr>
@@ -4379,46 +4353,115 @@
         <w:rPr>
           <w:rFonts w:ascii="Times New Roman" w:hAnsi="Times New Roman"/>
         </w:rPr>
+        <w:t xml:space="preserve">api/routes/: mỗi file là một nhóm route (auth, tin_dang, danh_muc, bao_cao, bai_viet, thong_ke...).</w:t>
+      </w:r>
+    </w:p>
+    <w:p>
+      <w:pPr>
+        <w:numPr>
+          <w:ilvl w:val="0"/>
+          <w:numId w:val="100"/>
+        </w:numPr>
+        <w:spacing w:after="50" w:line="283" w:lineRule="auto"/>
+        <w:jc w:val="both"/>
+      </w:pPr>
+      <w:r>
+        <w:rPr>
+          <w:rFonts w:ascii="Times New Roman" w:hAnsi="Times New Roman"/>
+        </w:rPr>
+        <w:t xml:space="preserve">api/dependencies/: các dependency dùng chung gồm get_db, get_current_user, get_current_admin_user.</w:t>
+      </w:r>
+    </w:p>
+    <w:p>
+      <w:pPr>
+        <w:numPr>
+          <w:ilvl w:val="0"/>
+          <w:numId w:val="100"/>
+        </w:numPr>
+        <w:spacing w:after="50" w:line="283" w:lineRule="auto"/>
+        <w:jc w:val="both"/>
+      </w:pPr>
+      <w:r>
+        <w:rPr>
+          <w:rFonts w:ascii="Times New Roman" w:hAnsi="Times New Roman"/>
+        </w:rPr>
+        <w:t xml:space="preserve">models/, schemas/: model SQLAlchemy và schema Pydantic (ranh giới chuyển đổi tên tiếng Việt trong DB sang JSON tiếng Anh camelCase nằm ở đây).</w:t>
+      </w:r>
+    </w:p>
+    <w:p>
+      <w:pPr>
+        <w:numPr>
+          <w:ilvl w:val="0"/>
+          <w:numId w:val="100"/>
+        </w:numPr>
+        <w:spacing w:after="50" w:line="283" w:lineRule="auto"/>
+        <w:jc w:val="both"/>
+      </w:pPr>
+      <w:r>
+        <w:rPr>
+          <w:rFonts w:ascii="Times New Roman" w:hAnsi="Times New Roman"/>
+        </w:rPr>
+        <w:t xml:space="preserve">alembic/versions/: migration cơ sở dữ liệu; scripts/seed.py: seed dữ liệu mẫu, chạy lại được nhiều lần an toàn.</w:t>
+      </w:r>
+    </w:p>
+    <w:p>
+      <w:pPr>
+        <w:spacing w:after="50" w:line="283" w:lineRule="auto"/>
+        <w:jc w:val="both"/>
+      </w:pPr>
+      <w:r>
+        <w:rPr>
+          <w:rFonts w:ascii="Times New Roman" w:hAnsi="Times New Roman"/>
+        </w:rPr>
         <w:t>Frontend tổ chức theo tính năng (feature-based), thư mục src/ gồm:</w:t>
       </w:r>
     </w:p>
     <w:p>
       <w:pPr>
+        <w:numPr>
+          <w:ilvl w:val="0"/>
+          <w:numId w:val="100"/>
+        </w:numPr>
         <w:spacing w:after="50" w:line="283" w:lineRule="auto"/>
-        <w:ind w:left="504"/>
         <w:jc w:val="both"/>
       </w:pPr>
       <w:r>
         <w:rPr>
           <w:rFonts w:ascii="Times New Roman" w:hAnsi="Times New Roman"/>
         </w:rPr>
-        <w:t>–  app/ — route segment của Next.js App Router, nhóm theo (auth), (public), (user), quan-tri.</w:t>
+        <w:t xml:space="preserve">app/: route segment của Next.js App Router, nhóm theo (auth), (public), (user), quan-tri.</w:t>
       </w:r>
     </w:p>
     <w:p>
       <w:pPr>
+        <w:numPr>
+          <w:ilvl w:val="0"/>
+          <w:numId w:val="100"/>
+        </w:numPr>
         <w:spacing w:after="50" w:line="283" w:lineRule="auto"/>
-        <w:ind w:left="504"/>
         <w:jc w:val="both"/>
       </w:pPr>
       <w:r>
         <w:rPr>
           <w:rFonts w:ascii="Times New Roman" w:hAnsi="Times New Roman"/>
         </w:rPr>
-        <w:t>–  features/&lt;tên&gt;/{api,components,hooks,schemas,types} — mọi thứ liên quan một domain nằm cùng một chỗ.</w:t>
+        <w:t xml:space="preserve">features/&lt;tên&gt;/{api,components,hooks,schemas,types}: mọi thứ liên quan một domain nằm cùng một chỗ.</w:t>
       </w:r>
     </w:p>
     <w:p>
       <w:pPr>
+        <w:numPr>
+          <w:ilvl w:val="0"/>
+          <w:numId w:val="100"/>
+        </w:numPr>
         <w:spacing w:after="50" w:line="283" w:lineRule="auto"/>
-        <w:ind w:left="504"/>
         <w:jc w:val="both"/>
       </w:pPr>
       <w:r>
         <w:rPr>
           <w:rFonts w:ascii="Times New Roman" w:hAnsi="Times New Roman"/>
         </w:rPr>
-        <w:t>–  components/ui/ — các wrapper dùng chung quanh Mantine (AppButton, AppInput, AppModal...) để đồng bộ giao diện toàn hệ thống.</w:t>
+        <w:t xml:space="preserve">components/ui/: các wrapper dùng chung quanh Mantine (AppButton, AppInput, AppModal...) để đồng bộ giao diện toàn hệ thống.</w:t>
       </w:r>
     </w:p>
     <w:p>
@@ -4443,7 +4486,7 @@
         <w:rPr>
           <w:rFonts w:ascii="Times New Roman" w:hAnsi="Times New Roman"/>
         </w:rPr>
-        <w:t xml:space="preserve">Cơ sở dữ liệu xoay quanh thực thể trung tâm TinDang (tin đăng cho thuê), liên kết tới NguoiDung (người đăng / người thao tác), LoaiBatDongSan, TienIch (qua bảng liên kết nhiều-nhiều tin_dang_tien_ich) và cây địa chỉ Tỉnh–Quận–Phường. Đặc biệt, hệ thống thiết kế bảng tin_dang_ban_cho nhằm triển khai cơ chế kiểm duyệt 2 giai đoạn: khi người dùng chỉnh sửa một tin đăng đang công khai, thay vì đè dữ liệu trực tiếp, hệ thống lưu vào bản chờ để quản trị viên thẩm định; tin gốc vẫn hiển thị bình thường. </w:t>
+        <w:t xml:space="preserve">Cơ sở dữ liệu xoay quanh thực thể trung tâm TinDang (tin đăng cho thuê), liên kết tới NguoiDung (người đăng / người thao tác), LoaiBatDongSan, TienIch (qua bảng liên kết nhiều-nhiều tin_dang_tien_ich) và cây địa chỉ Tỉnh/Quận/Phường. Đặc biệt, hệ thống thiết kế bảng tin_dang_ban_cho nhằm triển khai cơ chế kiểm duyệt 2 giai đoạn: khi người dùng chỉnh sửa một tin đăng đang công khai, thay vì đè dữ liệu trực tiếp, hệ thống lưu vào bản chờ để quản trị viên thẩm định; tin gốc vẫn hiển thị bình thường. </w:t>
       </w:r>
       <w:r>
         <w:rPr>
@@ -4528,7 +4571,7 @@
           <w:i/>
           <w:sz w:val="22"/>
         </w:rPr>
-        <w:t>Hình 2.3 minh họa lại cùng cấu trúc dữ liệu này dưới dạng sơ đồ lớp (class diagram), thể hiện rõ kiểu dữ liệu từng thuộc tính và các lớp enum (VaiTroNguoiDung, TrangThaiTinDang...) — thuận tiện khi đối chiếu với code SQLAlchemy model.</w:t>
+        <w:t>Hình 2.3 minh họa lại cùng cấu trúc dữ liệu này dưới dạng sơ đồ lớp (class diagram), thể hiện rõ kiểu dữ liệu từng thuộc tính và các lớp enum (VaiTroNguoiDung, TrangThaiTinDang...), thuận tiện khi đối chiếu với code SQLAlchemy model.</w:t>
       </w:r>
     </w:p>
     <w:p>
@@ -4590,7 +4633,7 @@
           <w:i/>
           <w:sz w:val="22"/>
         </w:rPr>
-        <w:t>Hình 2.3: Sơ đồ lớp (Class Diagram) rút gọn — các model chính</w:t>
+        <w:t>Hình 2.3: Sơ đồ lớp (Class Diagram) rút gọn: các model chính</w:t>
       </w:r>
       <w:bookmarkEnd w:id="28"/>
     </w:p>
@@ -4697,7 +4740,6 @@
           <w:p>
             <w:pPr>
               <w:spacing w:before="20" w:after="20" w:line="276" w:lineRule="auto"/>
-              <w:jc w:val="center"/>
             </w:pPr>
             <w:r>
               <w:rPr>
@@ -4750,7 +4792,6 @@
           <w:p>
             <w:pPr>
               <w:spacing w:before="20" w:after="20" w:line="276" w:lineRule="auto"/>
-              <w:jc w:val="center"/>
             </w:pPr>
             <w:r>
               <w:rPr>
@@ -5012,7 +5053,6 @@
           <w:p>
             <w:pPr>
               <w:spacing w:before="20" w:after="20" w:line="276" w:lineRule="auto"/>
-              <w:jc w:val="center"/>
             </w:pPr>
             <w:r>
               <w:rPr>
@@ -5065,7 +5105,6 @@
           <w:p>
             <w:pPr>
               <w:spacing w:before="20" w:after="20" w:line="276" w:lineRule="auto"/>
-              <w:jc w:val="center"/>
             </w:pPr>
             <w:r>
               <w:rPr>
@@ -5364,7 +5403,6 @@
           <w:p>
             <w:pPr>
               <w:spacing w:before="20" w:after="20" w:line="276" w:lineRule="auto"/>
-              <w:jc w:val="center"/>
             </w:pPr>
             <w:r>
               <w:rPr>
@@ -5440,7 +5478,6 @@
           <w:p>
             <w:pPr>
               <w:spacing w:before="20" w:after="20" w:line="276" w:lineRule="auto"/>
-              <w:jc w:val="center"/>
             </w:pPr>
             <w:r>
               <w:rPr>
@@ -5516,7 +5553,6 @@
           <w:p>
             <w:pPr>
               <w:spacing w:before="20" w:after="20" w:line="276" w:lineRule="auto"/>
-              <w:jc w:val="center"/>
             </w:pPr>
             <w:r>
               <w:rPr>
@@ -5592,7 +5628,6 @@
           <w:p>
             <w:pPr>
               <w:spacing w:before="20" w:after="20" w:line="276" w:lineRule="auto"/>
-              <w:jc w:val="center"/>
             </w:pPr>
             <w:r>
               <w:rPr>
@@ -5668,7 +5703,6 @@
           <w:p>
             <w:pPr>
               <w:spacing w:before="20" w:after="20" w:line="276" w:lineRule="auto"/>
-              <w:jc w:val="center"/>
             </w:pPr>
             <w:r>
               <w:rPr>
@@ -5744,7 +5778,6 @@
           <w:p>
             <w:pPr>
               <w:spacing w:before="20" w:after="20" w:line="276" w:lineRule="auto"/>
-              <w:jc w:val="center"/>
             </w:pPr>
             <w:r>
               <w:rPr>
@@ -5820,7 +5853,6 @@
           <w:p>
             <w:pPr>
               <w:spacing w:before="20" w:after="20" w:line="276" w:lineRule="auto"/>
-              <w:jc w:val="center"/>
             </w:pPr>
             <w:r>
               <w:rPr>
@@ -5896,7 +5928,6 @@
           <w:p>
             <w:pPr>
               <w:spacing w:before="20" w:after="20" w:line="276" w:lineRule="auto"/>
-              <w:jc w:val="center"/>
             </w:pPr>
             <w:r>
               <w:rPr>
@@ -5982,7 +6013,7 @@
         <w:rPr>
           <w:rFonts w:ascii="Times New Roman" w:hAnsi="Times New Roman"/>
         </w:rPr>
-        <w:t>Hệ thống xác thực bằng JWT: sau khi đăng nhập thành công, người dùng nhận về một access token; mọi request tới các route cần đăng nhập phải gửi kèm token này qua header Authorization. Mật khẩu không bao giờ lưu dạng plaintext — được băm (hash) trước khi ghi vào cột mat_khau_hash, và chỉ so khớp bằng hàm xác minh băm khi đăng nhập hoặc đổi mật khẩu, không giải mã ngược.</w:t>
+        <w:t>Hệ thống xác thực bằng JWT: sau khi đăng nhập thành công, người dùng nhận về một access token; mọi request tới các route cần đăng nhập phải gửi kèm token này qua header Authorization. Mật khẩu không bao giờ lưu dạng plaintext, mà được băm (hash) trước khi ghi vào cột mat_khau_hash, và chỉ so khớp bằng hàm xác minh băm khi đăng nhập hoặc đổi mật khẩu, không giải mã ngược.</w:t>
       </w:r>
     </w:p>
     <w:p>
@@ -6006,7 +6037,7 @@
         <w:rPr>
           <w:rFonts w:ascii="Times New Roman" w:hAnsi="Times New Roman"/>
         </w:rPr>
-        <w:t>Với module Tin tức thị trường — nơi admin nhập nội dung dạng rich-text (HTML) — hệ thống sanitize nội dung phía server (thư viện nh3) trước khi lưu xuống cơ sở dữ liệu, loại bỏ hoàn toàn các thẻ/script nguy hiểm nhằm chống tấn công XSS khi nội dung được hiển thị lại cho người dùng khác.</w:t>
+        <w:t>Với module Tin tức thị trường, nơi admin nhập nội dung dạng rich-text (HTML), hệ thống sanitize nội dung phía server (thư viện nh3) trước khi lưu xuống cơ sở dữ liệu, loại bỏ các thẻ/script nguy hiểm để chống tấn công XSS khi nội dung được hiển thị lại cho người dùng khác.</w:t>
       </w:r>
     </w:p>
     <w:p>
@@ -6187,7 +6218,6 @@
           <w:p>
             <w:pPr>
               <w:spacing w:before="20" w:after="20" w:line="276" w:lineRule="auto"/>
-              <w:jc w:val="center"/>
             </w:pPr>
             <w:r>
               <w:rPr>
@@ -6280,7 +6310,6 @@
           <w:p>
             <w:pPr>
               <w:spacing w:before="20" w:after="20" w:line="276" w:lineRule="auto"/>
-              <w:jc w:val="center"/>
             </w:pPr>
             <w:r>
               <w:rPr>
@@ -6309,7 +6338,6 @@
           <w:p>
             <w:pPr>
               <w:spacing w:before="20" w:after="20" w:line="276" w:lineRule="auto"/>
-              <w:jc w:val="center"/>
             </w:pPr>
             <w:r>
               <w:rPr>
@@ -6402,7 +6430,6 @@
           <w:p>
             <w:pPr>
               <w:spacing w:before="20" w:after="20" w:line="276" w:lineRule="auto"/>
-              <w:jc w:val="center"/>
             </w:pPr>
             <w:r>
               <w:rPr>
@@ -6431,7 +6458,6 @@
           <w:p>
             <w:pPr>
               <w:spacing w:before="20" w:after="20" w:line="276" w:lineRule="auto"/>
-              <w:jc w:val="center"/>
             </w:pPr>
             <w:r>
               <w:rPr>
@@ -6524,7 +6550,6 @@
           <w:p>
             <w:pPr>
               <w:spacing w:before="20" w:after="20" w:line="276" w:lineRule="auto"/>
-              <w:jc w:val="center"/>
             </w:pPr>
             <w:r>
               <w:rPr>
@@ -6553,7 +6578,6 @@
           <w:p>
             <w:pPr>
               <w:spacing w:before="20" w:after="20" w:line="276" w:lineRule="auto"/>
-              <w:jc w:val="center"/>
             </w:pPr>
             <w:r>
               <w:rPr>
@@ -6646,7 +6670,6 @@
           <w:p>
             <w:pPr>
               <w:spacing w:before="20" w:after="20" w:line="276" w:lineRule="auto"/>
-              <w:jc w:val="center"/>
             </w:pPr>
             <w:r>
               <w:rPr>
@@ -6675,7 +6698,6 @@
           <w:p>
             <w:pPr>
               <w:spacing w:before="20" w:after="20" w:line="276" w:lineRule="auto"/>
-              <w:jc w:val="center"/>
             </w:pPr>
             <w:r>
               <w:rPr>
@@ -6768,7 +6790,6 @@
           <w:p>
             <w:pPr>
               <w:spacing w:before="20" w:after="20" w:line="276" w:lineRule="auto"/>
-              <w:jc w:val="center"/>
             </w:pPr>
             <w:r>
               <w:rPr>
@@ -6797,7 +6818,6 @@
           <w:p>
             <w:pPr>
               <w:spacing w:before="20" w:after="20" w:line="276" w:lineRule="auto"/>
-              <w:jc w:val="center"/>
             </w:pPr>
             <w:r>
               <w:rPr>
@@ -6890,7 +6910,6 @@
           <w:p>
             <w:pPr>
               <w:spacing w:before="20" w:after="20" w:line="276" w:lineRule="auto"/>
-              <w:jc w:val="center"/>
             </w:pPr>
             <w:r>
               <w:rPr>
@@ -6919,7 +6938,6 @@
           <w:p>
             <w:pPr>
               <w:spacing w:before="20" w:after="20" w:line="276" w:lineRule="auto"/>
-              <w:jc w:val="center"/>
             </w:pPr>
             <w:r>
               <w:rPr>
@@ -7012,7 +7030,6 @@
           <w:p>
             <w:pPr>
               <w:spacing w:before="20" w:after="20" w:line="276" w:lineRule="auto"/>
-              <w:jc w:val="center"/>
             </w:pPr>
             <w:r>
               <w:rPr>
@@ -7270,6 +7287,81 @@
         <w:rPr>
           <w:rFonts w:ascii="Times New Roman" w:hAnsi="Times New Roman"/>
         </w:rPr>
+        <w:t>Người dùng đăng nhập bằng tài khoản đã đăng ký để sử dụng các chức năng dành riêng cho thành viên:</w:t>
+      </w:r>
+    </w:p>
+    <w:p>
+      <w:pPr>
+        <w:spacing w:after="50" w:line="276" w:lineRule="auto"/>
+        <w:jc w:val="center"/>
+      </w:pPr>
+      <w:r>
+        <w:rPr>
+          <w:noProof/>
+        </w:rPr>
+        <w:drawing>
+          <wp:inline distT="0" distB="0" distL="0" distR="0" wp14:anchorId="16B3D9B3" wp14:editId="32433ED9">
+            <wp:extent cx="4937760" cy="2359410"/>
+            <wp:effectExtent l="0" t="0" r="0" b="0"/>
+            <wp:docPr id="20" name="Picture 20"/>
+            <wp:cNvGraphicFramePr>
+              <a:graphicFrameLocks xmlns:a="http://schemas.openxmlformats.org/drawingml/2006/main" noChangeAspect="1"/>
+            </wp:cNvGraphicFramePr>
+            <a:graphic xmlns:a="http://schemas.openxmlformats.org/drawingml/2006/main">
+              <a:graphicData uri="http://schemas.openxmlformats.org/drawingml/2006/picture">
+                <pic:pic xmlns:pic="http://schemas.openxmlformats.org/drawingml/2006/picture">
+                  <pic:nvPicPr>
+                    <pic:cNvPr id="0" name="image.png"/>
+                    <pic:cNvPicPr/>
+                  </pic:nvPicPr>
+                  <pic:blipFill>
+                    <a:blip r:embed="rId20"/>
+                    <a:stretch>
+                      <a:fillRect/>
+                    </a:stretch>
+                  </pic:blipFill>
+                  <pic:spPr>
+                    <a:xfrm>
+                      <a:off x="0" y="0"/>
+                      <a:ext cx="4937760" cy="2359410"/>
+                    </a:xfrm>
+                    <a:prstGeom prst="rect">
+                      <a:avLst/>
+                    </a:prstGeom>
+                  </pic:spPr>
+                </pic:pic>
+              </a:graphicData>
+            </a:graphic>
+          </wp:inline>
+        </w:drawing>
+      </w:r>
+    </w:p>
+    <w:p>
+      <w:pPr>
+        <w:pStyle w:val="Caption"/>
+        <w:spacing w:before="40"/>
+      </w:pPr>
+      <w:bookmarkStart w:id="61" w:name="_Toc_Fig_LG1"/>
+      <w:r>
+        <w:rPr>
+          <w:rFonts w:ascii="Times New Roman" w:hAnsi="Times New Roman"/>
+          <w:b/>
+          <w:i/>
+          <w:sz w:val="22"/>
+        </w:rPr>
+        <w:t>Hình 3.3: Màn hình đăng nhập</w:t>
+      </w:r>
+      <w:bookmarkEnd w:id="61"/>
+    </w:p>
+    <w:p>
+      <w:pPr>
+        <w:spacing w:after="50" w:line="283" w:lineRule="auto"/>
+        <w:jc w:val="both"/>
+      </w:pPr>
+      <w:r>
+        <w:rPr>
+          <w:rFonts w:ascii="Times New Roman" w:hAnsi="Times New Roman"/>
+        </w:rPr>
         <w:t>Chủ nhà sau khi đăng nhập có thể tạo tin cho thuê với form đầy đủ thông tin (tiêu đề, địa chỉ, tiện ích, tải nhiều hình ảnh trực tiếp lên kho lưu trữ MinIO S3):</w:t>
       </w:r>
     </w:p>
@@ -7332,9 +7424,175 @@
           <w:i/>
           <w:sz w:val="22"/>
         </w:rPr>
-        <w:t>Hình 3.3: Form đăng tin cho thuê và tải ảnh lên MinIO</w:t>
+        <w:t>Hình 3.4: Form đăng tin cho thuê và tải ảnh lên MinIO</w:t>
       </w:r>
       <w:bookmarkEnd w:id="48"/>
+    </w:p>
+    <w:p>
+      <w:pPr>
+        <w:spacing w:after="50" w:line="283" w:lineRule="auto"/>
+        <w:jc w:val="both"/>
+      </w:pPr>
+      <w:r>
+        <w:rPr>
+          <w:rFonts w:ascii="Times New Roman" w:hAnsi="Times New Roman"/>
+        </w:rPr>
+        <w:t>Người dùng cũng có thể quản lý kho thư viện ảnh cá nhân, xem lại và tổ chức các hình ảnh đã tải lên để sử dụng lại khi đăng tin mới:</w:t>
+      </w:r>
+    </w:p>
+    <w:p>
+      <w:pPr>
+        <w:spacing w:after="50" w:line="276" w:lineRule="auto"/>
+        <w:jc w:val="center"/>
+      </w:pPr>
+      <w:r>
+        <w:rPr>
+          <w:noProof/>
+        </w:rPr>
+        <w:drawing>
+          <wp:inline distT="0" distB="0" distL="0" distR="0" wp14:anchorId="1B28EED7" wp14:editId="726D29BE">
+            <wp:extent cx="4937760" cy="2382207"/>
+            <wp:effectExtent l="0" t="0" r="0" b="0"/>
+            <wp:docPr id="21" name="Picture 21"/>
+            <wp:cNvGraphicFramePr>
+              <a:graphicFrameLocks xmlns:a="http://schemas.openxmlformats.org/drawingml/2006/main" noChangeAspect="1"/>
+            </wp:cNvGraphicFramePr>
+            <a:graphic xmlns:a="http://schemas.openxmlformats.org/drawingml/2006/main">
+              <a:graphicData uri="http://schemas.openxmlformats.org/drawingml/2006/picture">
+                <pic:pic xmlns:pic="http://schemas.openxmlformats.org/drawingml/2006/picture">
+                  <pic:nvPicPr>
+                    <pic:cNvPr id="0" name="image.png"/>
+                    <pic:cNvPicPr/>
+                  </pic:nvPicPr>
+                  <pic:blipFill>
+                    <a:blip r:embed="rId21"/>
+                    <a:stretch>
+                      <a:fillRect/>
+                    </a:stretch>
+                  </pic:blipFill>
+                  <pic:spPr>
+                    <a:xfrm>
+                      <a:off x="0" y="0"/>
+                      <a:ext cx="4937760" cy="2382207"/>
+                    </a:xfrm>
+                    <a:prstGeom prst="rect">
+                      <a:avLst/>
+                    </a:prstGeom>
+                  </pic:spPr>
+                </pic:pic>
+              </a:graphicData>
+            </a:graphic>
+          </wp:inline>
+        </w:drawing>
+      </w:r>
+    </w:p>
+    <w:p>
+      <w:pPr>
+        <w:pStyle w:val="Caption"/>
+        <w:spacing w:before="40"/>
+      </w:pPr>
+      <w:bookmarkStart w:id="63" w:name="_Toc_Fig_LG2"/>
+      <w:r>
+        <w:rPr>
+          <w:rFonts w:ascii="Times New Roman" w:hAnsi="Times New Roman"/>
+          <w:b/>
+          <w:i/>
+          <w:sz w:val="22"/>
+        </w:rPr>
+        <w:t>Hình 3.5: Quản lý thư viện ảnh cá nhân</w:t>
+      </w:r>
+      <w:bookmarkEnd w:id="63"/>
+    </w:p>
+    <w:p>
+      <w:pPr>
+        <w:spacing w:after="50" w:line="283" w:lineRule="auto"/>
+        <w:jc w:val="both"/>
+      </w:pPr>
+      <w:r>
+        <w:rPr>
+          <w:rFonts w:ascii="Times New Roman" w:hAnsi="Times New Roman"/>
+        </w:rPr>
+        <w:t>Ngoài ra, người dùng có thể lưu các tin đăng quan tâm vào danh sách yêu thích để tiện theo dõi và so sánh sau này:</w:t>
+      </w:r>
+    </w:p>
+    <w:p>
+      <w:pPr>
+        <w:spacing w:after="50" w:line="276" w:lineRule="auto"/>
+        <w:jc w:val="center"/>
+      </w:pPr>
+      <w:r>
+        <w:rPr>
+          <w:noProof/>
+        </w:rPr>
+        <w:drawing>
+          <wp:inline distT="0" distB="0" distL="0" distR="0" wp14:anchorId="44207F83" wp14:editId="321E6F79">
+            <wp:extent cx="4937760" cy="1905345"/>
+            <wp:effectExtent l="0" t="0" r="0" b="0"/>
+            <wp:docPr id="22" name="Picture 22"/>
+            <wp:cNvGraphicFramePr>
+              <a:graphicFrameLocks xmlns:a="http://schemas.openxmlformats.org/drawingml/2006/main" noChangeAspect="1"/>
+            </wp:cNvGraphicFramePr>
+            <a:graphic xmlns:a="http://schemas.openxmlformats.org/drawingml/2006/main">
+              <a:graphicData uri="http://schemas.openxmlformats.org/drawingml/2006/picture">
+                <pic:pic xmlns:pic="http://schemas.openxmlformats.org/drawingml/2006/picture">
+                  <pic:nvPicPr>
+                    <pic:cNvPr id="0" name="image.png"/>
+                    <pic:cNvPicPr/>
+                  </pic:nvPicPr>
+                  <pic:blipFill>
+                    <a:blip r:embed="rId22"/>
+                    <a:stretch>
+                      <a:fillRect/>
+                    </a:stretch>
+                  </pic:blipFill>
+                  <pic:spPr>
+                    <a:xfrm>
+                      <a:off x="0" y="0"/>
+                      <a:ext cx="4937760" cy="1905345"/>
+                    </a:xfrm>
+                    <a:prstGeom prst="rect">
+                      <a:avLst/>
+                    </a:prstGeom>
+                  </pic:spPr>
+                </pic:pic>
+              </a:graphicData>
+            </a:graphic>
+          </wp:inline>
+        </w:drawing>
+      </w:r>
+    </w:p>
+    <w:p>
+      <w:pPr>
+        <w:pStyle w:val="Caption"/>
+        <w:spacing w:before="40"/>
+      </w:pPr>
+      <w:bookmarkStart w:id="65" w:name="_Toc_Fig_LG3"/>
+      <w:r>
+        <w:rPr>
+          <w:rFonts w:ascii="Times New Roman" w:hAnsi="Times New Roman"/>
+          <w:b/>
+          <w:i/>
+          <w:sz w:val="22"/>
+        </w:rPr>
+        <w:t>Hình 3.6: Danh sách tin đăng yêu thích</w:t>
+      </w:r>
+      <w:bookmarkEnd w:id="65"/>
+    </w:p>
+    <w:p>
+      <w:pPr>
+        <w:pStyle w:val="Heading3"/>
+        <w:spacing w:before="80" w:after="40"/>
+      </w:pPr>
+      <w:bookmarkStart w:id="67" w:name="_Toc_118"/>
+      <w:bookmarkStart w:id="68" w:name="_Toc_323"/>
+      <w:r>
+        <w:rPr>
+          <w:i/>
+        </w:rPr>
+        <w:t>Quản trị viên</w:t>
+      </w:r>
+      <w:bookmarkEnd w:id="67"/>
+      <w:bookmarkEnd w:id="68"/>
     </w:p>
     <w:p>
       <w:pPr>
@@ -7420,7 +7678,7 @@
           <w:i/>
           <w:sz w:val="22"/>
         </w:rPr>
-        <w:t>Hình 3.4: Hàng đợi duyệt và quản lý trạng thái tin đăng</w:t>
+        <w:t>Hình 3.7: Hàng đợi duyệt và quản lý trạng thái tin đăng</w:t>
       </w:r>
       <w:bookmarkEnd w:id="49"/>
     </w:p>
@@ -7495,7 +7753,7 @@
           <w:i/>
           <w:sz w:val="22"/>
         </w:rPr>
-        <w:t>Hình 3.5: Dashboard biểu đồ phân tích thị trường và giá thuê</w:t>
+        <w:t>Hình 3.8: Dashboard biểu đồ phân tích thị trường và giá thuê</w:t>
       </w:r>
       <w:bookmarkEnd w:id="50"/>
     </w:p>
@@ -7531,6 +7789,22 @@
         </w:rPr>
         <w:br w:type="page"/>
       </w:r>
+    </w:p>
+    <w:p>
+      <w:pPr>
+        <w:pStyle w:val="Heading3"/>
+        <w:spacing w:before="80" w:after="40"/>
+      </w:pPr>
+      <w:bookmarkStart w:id="69" w:name="_Toc_119"/>
+      <w:bookmarkStart w:id="70" w:name="_Toc_324"/>
+      <w:r>
+        <w:rPr>
+          <w:i/>
+        </w:rPr>
+        <w:t>Tin tức thị trường (module bổ sung)</w:t>
+      </w:r>
+      <w:bookmarkEnd w:id="69"/>
+      <w:bookmarkEnd w:id="70"/>
     </w:p>
     <w:p>
       <w:pPr>
@@ -7604,1052 +7878,10 @@
           <w:i/>
           <w:sz w:val="22"/>
         </w:rPr>
-        <w:t>Hình 3.6: Trang Tin tức thị trường công khai</w:t>
+        <w:t>Hình 3.9: Trang Tin tức thị trường công khai</w:t>
       </w:r>
       <w:bookmarkEnd w:id="51"/>
     </w:p>
-    <w:p>
-      <w:pPr>
-        <w:pStyle w:val="Heading2"/>
-        <w:spacing w:before="100" w:after="40"/>
-      </w:pPr>
-      <w:bookmarkStart w:id="52" w:name="_Toc_120"/>
-      <w:bookmarkStart w:id="53" w:name="_Toc_33"/>
-      <w:r>
-        <w:t>Kiểm thử tự động với Pytest</w:t>
-      </w:r>
-      <w:bookmarkEnd w:id="52"/>
-      <w:bookmarkEnd w:id="53"/>
-    </w:p>
-    <w:p>
-      <w:pPr>
-        <w:spacing w:after="50" w:line="283" w:lineRule="auto"/>
-        <w:jc w:val="both"/>
-      </w:pPr>
-      <w:r>
-        <w:rPr>
-          <w:rFonts w:ascii="Times New Roman" w:hAnsi="Times New Roman"/>
-        </w:rPr>
-        <w:t>Để đảm bảo độ tin cậy và sự ổn định của hệ thống theo đúng tiêu chuẩn kỹ thuật lập trình Python, nhóm xây dựng bộ kiểm thử tự động sử dụng framework pytest trong thư mục be/tests/. Các kịch bản kiểm thử tập trung đánh giá toàn diện các luồng nghiệp vụ cốt lõi: (1) Kiểm thử xác thực &amp; phân quyền (đăng ký, đăng nhập trả JWT, chặn token hết hạn và chặn tài khoản bị khóa với mã lỗi 403); (2) Kiểm thử quản lý danh mục loại bất động sản (CRUD danh mục, xác thực quyền admin-only); (3) Kiểm thử nghiệp vụ tin đăng và bộ lọc đa tiêu chí. Toàn bộ các ca kiểm thử đều vượt qua (100% pass) trước khi mã nguồn được tạo Pull Request và hợp nhất vào nhánh chính.</w:t>
-      </w:r>
-    </w:p>
-    <w:p>
-      <w:pPr>
-        <w:pStyle w:val="Caption"/>
-        <w:spacing w:before="40"/>
-      </w:pPr>
-      <w:bookmarkStart w:id="54" w:name="_Toc_Tbl_31"/>
-      <w:r>
-        <w:rPr>
-          <w:rFonts w:ascii="Times New Roman" w:hAnsi="Times New Roman"/>
-          <w:b/>
-          <w:i/>
-          <w:sz w:val="22"/>
-        </w:rPr>
-        <w:t>Bảng 3.1: Các kịch bản kiểm thử tự động tiêu biểu (Pytest)</w:t>
-      </w:r>
-      <w:bookmarkEnd w:id="54"/>
-    </w:p>
-    <w:tbl>
-      <w:tblPr>
-        <w:tblStyle w:val="TableGrid"/>
-        <w:tblW w:w="0" w:type="auto"/>
-        <w:tblLook w:val="04A0" w:firstRow="1" w:lastRow="0" w:firstColumn="1" w:lastColumn="0" w:noHBand="0" w:noVBand="1"/>
-      </w:tblPr>
-      <w:tblGrid>
-        <w:gridCol w:w="719"/>
-        <w:gridCol w:w="1861"/>
-        <w:gridCol w:w="3143"/>
-        <w:gridCol w:w="2438"/>
-        <w:gridCol w:w="1150"/>
-      </w:tblGrid>
-      <w:tr>
-        <w:trPr>
-          <w:cantSplit/>
-          <w:tblHeader/>
-        </w:trPr>
-        <w:tc>
-          <w:tcPr>
-            <w:tcW w:w="720" w:type="dxa"/>
-            <w:tcMar>
-              <w:top w:w="80" w:type="dxa"/>
-              <w:left w:w="120" w:type="dxa"/>
-              <w:bottom w:w="80" w:type="dxa"/>
-              <w:right w:w="120" w:type="dxa"/>
-            </w:tcMar>
-          </w:tcPr>
-          <w:p>
-            <w:pPr>
-              <w:spacing w:before="20" w:after="20" w:line="276" w:lineRule="auto"/>
-              <w:jc w:val="center"/>
-            </w:pPr>
-            <w:r>
-              <w:rPr>
-                <w:rFonts w:ascii="Times New Roman" w:hAnsi="Times New Roman"/>
-                <w:b/>
-                <w:sz w:val="21"/>
-              </w:rPr>
-              <w:t>STT</w:t>
-            </w:r>
-          </w:p>
-        </w:tc>
-        <w:tc>
-          <w:tcPr>
-            <w:tcW w:w="1872" w:type="dxa"/>
-            <w:tcMar>
-              <w:top w:w="80" w:type="dxa"/>
-              <w:left w:w="120" w:type="dxa"/>
-              <w:bottom w:w="80" w:type="dxa"/>
-              <w:right w:w="120" w:type="dxa"/>
-            </w:tcMar>
-          </w:tcPr>
-          <w:p>
-            <w:pPr>
-              <w:spacing w:before="20" w:after="20" w:line="276" w:lineRule="auto"/>
-              <w:jc w:val="center"/>
-            </w:pPr>
-            <w:r>
-              <w:rPr>
-                <w:rFonts w:ascii="Times New Roman" w:hAnsi="Times New Roman"/>
-                <w:b/>
-                <w:sz w:val="21"/>
-              </w:rPr>
-              <w:t>Module</w:t>
-            </w:r>
-          </w:p>
-        </w:tc>
-        <w:tc>
-          <w:tcPr>
-            <w:tcW w:w="3168" w:type="dxa"/>
-            <w:tcMar>
-              <w:top w:w="80" w:type="dxa"/>
-              <w:left w:w="120" w:type="dxa"/>
-              <w:bottom w:w="80" w:type="dxa"/>
-              <w:right w:w="120" w:type="dxa"/>
-            </w:tcMar>
-          </w:tcPr>
-          <w:p>
-            <w:pPr>
-              <w:spacing w:before="20" w:after="20" w:line="276" w:lineRule="auto"/>
-              <w:jc w:val="center"/>
-            </w:pPr>
-            <w:r>
-              <w:rPr>
-                <w:rFonts w:ascii="Times New Roman" w:hAnsi="Times New Roman"/>
-                <w:b/>
-                <w:sz w:val="21"/>
-              </w:rPr>
-              <w:t>Kịch bản kiểm thử (Test case)</w:t>
-            </w:r>
-          </w:p>
-        </w:tc>
-        <w:tc>
-          <w:tcPr>
-            <w:tcW w:w="2448" w:type="dxa"/>
-            <w:tcMar>
-              <w:top w:w="80" w:type="dxa"/>
-              <w:left w:w="120" w:type="dxa"/>
-              <w:bottom w:w="80" w:type="dxa"/>
-              <w:right w:w="120" w:type="dxa"/>
-            </w:tcMar>
-          </w:tcPr>
-          <w:p>
-            <w:pPr>
-              <w:spacing w:before="20" w:after="20" w:line="276" w:lineRule="auto"/>
-              <w:jc w:val="center"/>
-            </w:pPr>
-            <w:r>
-              <w:rPr>
-                <w:rFonts w:ascii="Times New Roman" w:hAnsi="Times New Roman"/>
-                <w:b/>
-                <w:sz w:val="21"/>
-              </w:rPr>
-              <w:t>Dữ liệu / Điều kiện</w:t>
-            </w:r>
-          </w:p>
-        </w:tc>
-        <w:tc>
-          <w:tcPr>
-            <w:tcW w:w="1152" w:type="dxa"/>
-            <w:tcMar>
-              <w:top w:w="80" w:type="dxa"/>
-              <w:left w:w="120" w:type="dxa"/>
-              <w:bottom w:w="80" w:type="dxa"/>
-              <w:right w:w="120" w:type="dxa"/>
-            </w:tcMar>
-          </w:tcPr>
-          <w:p>
-            <w:pPr>
-              <w:spacing w:before="20" w:after="20" w:line="276" w:lineRule="auto"/>
-              <w:jc w:val="center"/>
-            </w:pPr>
-            <w:r>
-              <w:rPr>
-                <w:rFonts w:ascii="Times New Roman" w:hAnsi="Times New Roman"/>
-                <w:b/>
-                <w:sz w:val="21"/>
-              </w:rPr>
-              <w:t>Kết quả</w:t>
-            </w:r>
-          </w:p>
-        </w:tc>
-      </w:tr>
-      <w:tr>
-        <w:trPr>
-          <w:cantSplit/>
-        </w:trPr>
-        <w:tc>
-          <w:tcPr>
-            <w:tcW w:w="720" w:type="dxa"/>
-            <w:tcMar>
-              <w:top w:w="80" w:type="dxa"/>
-              <w:left w:w="120" w:type="dxa"/>
-              <w:bottom w:w="80" w:type="dxa"/>
-              <w:right w:w="120" w:type="dxa"/>
-            </w:tcMar>
-          </w:tcPr>
-          <w:p>
-            <w:pPr>
-              <w:spacing w:before="20" w:after="20" w:line="276" w:lineRule="auto"/>
-              <w:jc w:val="center"/>
-            </w:pPr>
-            <w:r>
-              <w:rPr>
-                <w:rFonts w:ascii="Times New Roman" w:hAnsi="Times New Roman"/>
-                <w:sz w:val="21"/>
-              </w:rPr>
-              <w:t>1</w:t>
-            </w:r>
-          </w:p>
-        </w:tc>
-        <w:tc>
-          <w:tcPr>
-            <w:tcW w:w="1872" w:type="dxa"/>
-            <w:tcMar>
-              <w:top w:w="80" w:type="dxa"/>
-              <w:left w:w="120" w:type="dxa"/>
-              <w:bottom w:w="80" w:type="dxa"/>
-              <w:right w:w="120" w:type="dxa"/>
-            </w:tcMar>
-          </w:tcPr>
-          <w:p>
-            <w:pPr>
-              <w:spacing w:before="20" w:after="20" w:line="276" w:lineRule="auto"/>
-            </w:pPr>
-            <w:r>
-              <w:rPr>
-                <w:rFonts w:ascii="Times New Roman" w:hAnsi="Times New Roman"/>
-                <w:sz w:val="21"/>
-              </w:rPr>
-              <w:t>Auth</w:t>
-            </w:r>
-          </w:p>
-        </w:tc>
-        <w:tc>
-          <w:tcPr>
-            <w:tcW w:w="3168" w:type="dxa"/>
-            <w:tcMar>
-              <w:top w:w="80" w:type="dxa"/>
-              <w:left w:w="120" w:type="dxa"/>
-              <w:bottom w:w="80" w:type="dxa"/>
-              <w:right w:w="120" w:type="dxa"/>
-            </w:tcMar>
-          </w:tcPr>
-          <w:p>
-            <w:pPr>
-              <w:spacing w:before="20" w:after="20" w:line="276" w:lineRule="auto"/>
-            </w:pPr>
-            <w:r>
-              <w:rPr>
-                <w:rFonts w:ascii="Times New Roman" w:hAnsi="Times New Roman"/>
-                <w:sz w:val="21"/>
-              </w:rPr>
-              <w:t>Đăng nhập thành công</w:t>
-            </w:r>
-          </w:p>
-        </w:tc>
-        <w:tc>
-          <w:tcPr>
-            <w:tcW w:w="2448" w:type="dxa"/>
-            <w:tcMar>
-              <w:top w:w="80" w:type="dxa"/>
-              <w:left w:w="120" w:type="dxa"/>
-              <w:bottom w:w="80" w:type="dxa"/>
-              <w:right w:w="120" w:type="dxa"/>
-            </w:tcMar>
-          </w:tcPr>
-          <w:p>
-            <w:pPr>
-              <w:spacing w:before="20" w:after="20" w:line="276" w:lineRule="auto"/>
-            </w:pPr>
-            <w:r>
-              <w:rPr>
-                <w:rFonts w:ascii="Times New Roman" w:hAnsi="Times New Roman"/>
-                <w:sz w:val="21"/>
-              </w:rPr>
-              <w:t>Email/Password chính xác</w:t>
-            </w:r>
-          </w:p>
-        </w:tc>
-        <w:tc>
-          <w:tcPr>
-            <w:tcW w:w="1152" w:type="dxa"/>
-            <w:tcMar>
-              <w:top w:w="80" w:type="dxa"/>
-              <w:left w:w="120" w:type="dxa"/>
-              <w:bottom w:w="80" w:type="dxa"/>
-              <w:right w:w="120" w:type="dxa"/>
-            </w:tcMar>
-          </w:tcPr>
-          <w:p>
-            <w:pPr>
-              <w:spacing w:before="20" w:after="20" w:line="276" w:lineRule="auto"/>
-              <w:jc w:val="center"/>
-            </w:pPr>
-            <w:r>
-              <w:rPr>
-                <w:rFonts w:ascii="Times New Roman" w:hAnsi="Times New Roman"/>
-                <w:sz w:val="21"/>
-              </w:rPr>
-              <w:t>HTTP 200 (Pass)</w:t>
-            </w:r>
-          </w:p>
-        </w:tc>
-      </w:tr>
-      <w:tr>
-        <w:trPr>
-          <w:cantSplit/>
-        </w:trPr>
-        <w:tc>
-          <w:tcPr>
-            <w:tcW w:w="720" w:type="dxa"/>
-            <w:tcMar>
-              <w:top w:w="80" w:type="dxa"/>
-              <w:left w:w="120" w:type="dxa"/>
-              <w:bottom w:w="80" w:type="dxa"/>
-              <w:right w:w="120" w:type="dxa"/>
-            </w:tcMar>
-          </w:tcPr>
-          <w:p>
-            <w:pPr>
-              <w:spacing w:before="20" w:after="20" w:line="276" w:lineRule="auto"/>
-              <w:jc w:val="center"/>
-            </w:pPr>
-            <w:r>
-              <w:rPr>
-                <w:rFonts w:ascii="Times New Roman" w:hAnsi="Times New Roman"/>
-                <w:sz w:val="21"/>
-              </w:rPr>
-              <w:t>2</w:t>
-            </w:r>
-          </w:p>
-        </w:tc>
-        <w:tc>
-          <w:tcPr>
-            <w:tcW w:w="1872" w:type="dxa"/>
-            <w:tcMar>
-              <w:top w:w="80" w:type="dxa"/>
-              <w:left w:w="120" w:type="dxa"/>
-              <w:bottom w:w="80" w:type="dxa"/>
-              <w:right w:w="120" w:type="dxa"/>
-            </w:tcMar>
-          </w:tcPr>
-          <w:p>
-            <w:pPr>
-              <w:spacing w:before="20" w:after="20" w:line="276" w:lineRule="auto"/>
-            </w:pPr>
-            <w:r>
-              <w:rPr>
-                <w:rFonts w:ascii="Times New Roman" w:hAnsi="Times New Roman"/>
-                <w:sz w:val="21"/>
-              </w:rPr>
-              <w:t>Auth</w:t>
-            </w:r>
-          </w:p>
-        </w:tc>
-        <w:tc>
-          <w:tcPr>
-            <w:tcW w:w="3168" w:type="dxa"/>
-            <w:tcMar>
-              <w:top w:w="80" w:type="dxa"/>
-              <w:left w:w="120" w:type="dxa"/>
-              <w:bottom w:w="80" w:type="dxa"/>
-              <w:right w:w="120" w:type="dxa"/>
-            </w:tcMar>
-          </w:tcPr>
-          <w:p>
-            <w:pPr>
-              <w:spacing w:before="20" w:after="20" w:line="276" w:lineRule="auto"/>
-            </w:pPr>
-            <w:r>
-              <w:rPr>
-                <w:rFonts w:ascii="Times New Roman" w:hAnsi="Times New Roman"/>
-                <w:sz w:val="21"/>
-              </w:rPr>
-              <w:t>Đăng nhập sai mật khẩu</w:t>
-            </w:r>
-          </w:p>
-        </w:tc>
-        <w:tc>
-          <w:tcPr>
-            <w:tcW w:w="2448" w:type="dxa"/>
-            <w:tcMar>
-              <w:top w:w="80" w:type="dxa"/>
-              <w:left w:w="120" w:type="dxa"/>
-              <w:bottom w:w="80" w:type="dxa"/>
-              <w:right w:w="120" w:type="dxa"/>
-            </w:tcMar>
-          </w:tcPr>
-          <w:p>
-            <w:pPr>
-              <w:spacing w:before="20" w:after="20" w:line="276" w:lineRule="auto"/>
-            </w:pPr>
-            <w:r>
-              <w:rPr>
-                <w:rFonts w:ascii="Times New Roman" w:hAnsi="Times New Roman"/>
-                <w:sz w:val="21"/>
-              </w:rPr>
-              <w:t>Sai mật khẩu băm</w:t>
-            </w:r>
-          </w:p>
-        </w:tc>
-        <w:tc>
-          <w:tcPr>
-            <w:tcW w:w="1152" w:type="dxa"/>
-            <w:tcMar>
-              <w:top w:w="80" w:type="dxa"/>
-              <w:left w:w="120" w:type="dxa"/>
-              <w:bottom w:w="80" w:type="dxa"/>
-              <w:right w:w="120" w:type="dxa"/>
-            </w:tcMar>
-          </w:tcPr>
-          <w:p>
-            <w:pPr>
-              <w:spacing w:before="20" w:after="20" w:line="276" w:lineRule="auto"/>
-              <w:jc w:val="center"/>
-            </w:pPr>
-            <w:r>
-              <w:rPr>
-                <w:rFonts w:ascii="Times New Roman" w:hAnsi="Times New Roman"/>
-                <w:sz w:val="21"/>
-              </w:rPr>
-              <w:t>HTTP 401 (Pass)</w:t>
-            </w:r>
-          </w:p>
-        </w:tc>
-      </w:tr>
-      <w:tr>
-        <w:trPr>
-          <w:cantSplit/>
-        </w:trPr>
-        <w:tc>
-          <w:tcPr>
-            <w:tcW w:w="720" w:type="dxa"/>
-            <w:tcMar>
-              <w:top w:w="80" w:type="dxa"/>
-              <w:left w:w="120" w:type="dxa"/>
-              <w:bottom w:w="80" w:type="dxa"/>
-              <w:right w:w="120" w:type="dxa"/>
-            </w:tcMar>
-          </w:tcPr>
-          <w:p>
-            <w:pPr>
-              <w:spacing w:before="20" w:after="20" w:line="276" w:lineRule="auto"/>
-              <w:jc w:val="center"/>
-            </w:pPr>
-            <w:r>
-              <w:rPr>
-                <w:rFonts w:ascii="Times New Roman" w:hAnsi="Times New Roman"/>
-                <w:sz w:val="21"/>
-              </w:rPr>
-              <w:t>3</w:t>
-            </w:r>
-          </w:p>
-        </w:tc>
-        <w:tc>
-          <w:tcPr>
-            <w:tcW w:w="1872" w:type="dxa"/>
-            <w:tcMar>
-              <w:top w:w="80" w:type="dxa"/>
-              <w:left w:w="120" w:type="dxa"/>
-              <w:bottom w:w="80" w:type="dxa"/>
-              <w:right w:w="120" w:type="dxa"/>
-            </w:tcMar>
-          </w:tcPr>
-          <w:p>
-            <w:pPr>
-              <w:spacing w:before="20" w:after="20" w:line="276" w:lineRule="auto"/>
-            </w:pPr>
-            <w:r>
-              <w:rPr>
-                <w:rFonts w:ascii="Times New Roman" w:hAnsi="Times New Roman"/>
-                <w:sz w:val="21"/>
-              </w:rPr>
-              <w:t>Auth</w:t>
-            </w:r>
-          </w:p>
-        </w:tc>
-        <w:tc>
-          <w:tcPr>
-            <w:tcW w:w="3168" w:type="dxa"/>
-            <w:tcMar>
-              <w:top w:w="80" w:type="dxa"/>
-              <w:left w:w="120" w:type="dxa"/>
-              <w:bottom w:w="80" w:type="dxa"/>
-              <w:right w:w="120" w:type="dxa"/>
-            </w:tcMar>
-          </w:tcPr>
-          <w:p>
-            <w:pPr>
-              <w:spacing w:before="20" w:after="20" w:line="276" w:lineRule="auto"/>
-            </w:pPr>
-            <w:r>
-              <w:rPr>
-                <w:rFonts w:ascii="Times New Roman" w:hAnsi="Times New Roman"/>
-                <w:sz w:val="21"/>
-              </w:rPr>
-              <w:t>Tài khoản bị khóa đăng nhập</w:t>
-            </w:r>
-          </w:p>
-        </w:tc>
-        <w:tc>
-          <w:tcPr>
-            <w:tcW w:w="2448" w:type="dxa"/>
-            <w:tcMar>
-              <w:top w:w="80" w:type="dxa"/>
-              <w:left w:w="120" w:type="dxa"/>
-              <w:bottom w:w="80" w:type="dxa"/>
-              <w:right w:w="120" w:type="dxa"/>
-            </w:tcMar>
-          </w:tcPr>
-          <w:p>
-            <w:pPr>
-              <w:spacing w:before="20" w:after="20" w:line="276" w:lineRule="auto"/>
-            </w:pPr>
-            <w:r>
-              <w:rPr>
-                <w:rFonts w:ascii="Times New Roman" w:hAnsi="Times New Roman"/>
-                <w:sz w:val="21"/>
-              </w:rPr>
-              <w:t>Trạng thái BI_KHOA</w:t>
-            </w:r>
-          </w:p>
-        </w:tc>
-        <w:tc>
-          <w:tcPr>
-            <w:tcW w:w="1152" w:type="dxa"/>
-            <w:tcMar>
-              <w:top w:w="80" w:type="dxa"/>
-              <w:left w:w="120" w:type="dxa"/>
-              <w:bottom w:w="80" w:type="dxa"/>
-              <w:right w:w="120" w:type="dxa"/>
-            </w:tcMar>
-          </w:tcPr>
-          <w:p>
-            <w:pPr>
-              <w:spacing w:before="20" w:after="20" w:line="276" w:lineRule="auto"/>
-              <w:jc w:val="center"/>
-            </w:pPr>
-            <w:r>
-              <w:rPr>
-                <w:rFonts w:ascii="Times New Roman" w:hAnsi="Times New Roman"/>
-                <w:sz w:val="21"/>
-              </w:rPr>
-              <w:t>HTTP 403 (Pass)</w:t>
-            </w:r>
-          </w:p>
-        </w:tc>
-      </w:tr>
-      <w:tr>
-        <w:trPr>
-          <w:cantSplit/>
-        </w:trPr>
-        <w:tc>
-          <w:tcPr>
-            <w:tcW w:w="720" w:type="dxa"/>
-            <w:tcMar>
-              <w:top w:w="80" w:type="dxa"/>
-              <w:left w:w="120" w:type="dxa"/>
-              <w:bottom w:w="80" w:type="dxa"/>
-              <w:right w:w="120" w:type="dxa"/>
-            </w:tcMar>
-          </w:tcPr>
-          <w:p>
-            <w:pPr>
-              <w:spacing w:before="20" w:after="20" w:line="276" w:lineRule="auto"/>
-              <w:jc w:val="center"/>
-            </w:pPr>
-            <w:r>
-              <w:rPr>
-                <w:rFonts w:ascii="Times New Roman" w:hAnsi="Times New Roman"/>
-                <w:sz w:val="21"/>
-              </w:rPr>
-              <w:t>4</w:t>
-            </w:r>
-          </w:p>
-        </w:tc>
-        <w:tc>
-          <w:tcPr>
-            <w:tcW w:w="1872" w:type="dxa"/>
-            <w:tcMar>
-              <w:top w:w="80" w:type="dxa"/>
-              <w:left w:w="120" w:type="dxa"/>
-              <w:bottom w:w="80" w:type="dxa"/>
-              <w:right w:w="120" w:type="dxa"/>
-            </w:tcMar>
-          </w:tcPr>
-          <w:p>
-            <w:pPr>
-              <w:spacing w:before="20" w:after="20" w:line="276" w:lineRule="auto"/>
-            </w:pPr>
-            <w:r>
-              <w:rPr>
-                <w:rFonts w:ascii="Times New Roman" w:hAnsi="Times New Roman"/>
-                <w:sz w:val="21"/>
-              </w:rPr>
-              <w:t>Danh mục</w:t>
-            </w:r>
-          </w:p>
-        </w:tc>
-        <w:tc>
-          <w:tcPr>
-            <w:tcW w:w="3168" w:type="dxa"/>
-            <w:tcMar>
-              <w:top w:w="80" w:type="dxa"/>
-              <w:left w:w="120" w:type="dxa"/>
-              <w:bottom w:w="80" w:type="dxa"/>
-              <w:right w:w="120" w:type="dxa"/>
-            </w:tcMar>
-          </w:tcPr>
-          <w:p>
-            <w:pPr>
-              <w:spacing w:before="20" w:after="20" w:line="276" w:lineRule="auto"/>
-            </w:pPr>
-            <w:r>
-              <w:rPr>
-                <w:rFonts w:ascii="Times New Roman" w:hAnsi="Times New Roman"/>
-                <w:sz w:val="21"/>
-              </w:rPr>
-              <w:t>Thêm loại BĐS (Admin)</w:t>
-            </w:r>
-          </w:p>
-        </w:tc>
-        <w:tc>
-          <w:tcPr>
-            <w:tcW w:w="2448" w:type="dxa"/>
-            <w:tcMar>
-              <w:top w:w="80" w:type="dxa"/>
-              <w:left w:w="120" w:type="dxa"/>
-              <w:bottom w:w="80" w:type="dxa"/>
-              <w:right w:w="120" w:type="dxa"/>
-            </w:tcMar>
-          </w:tcPr>
-          <w:p>
-            <w:pPr>
-              <w:spacing w:before="20" w:after="20" w:line="276" w:lineRule="auto"/>
-            </w:pPr>
-            <w:r>
-              <w:rPr>
-                <w:rFonts w:ascii="Times New Roman" w:hAnsi="Times New Roman"/>
-                <w:sz w:val="21"/>
-              </w:rPr>
-              <w:t>Token Admin hợp lệ</w:t>
-            </w:r>
-          </w:p>
-        </w:tc>
-        <w:tc>
-          <w:tcPr>
-            <w:tcW w:w="1152" w:type="dxa"/>
-            <w:tcMar>
-              <w:top w:w="80" w:type="dxa"/>
-              <w:left w:w="120" w:type="dxa"/>
-              <w:bottom w:w="80" w:type="dxa"/>
-              <w:right w:w="120" w:type="dxa"/>
-            </w:tcMar>
-          </w:tcPr>
-          <w:p>
-            <w:pPr>
-              <w:spacing w:before="20" w:after="20" w:line="276" w:lineRule="auto"/>
-              <w:jc w:val="center"/>
-            </w:pPr>
-            <w:r>
-              <w:rPr>
-                <w:rFonts w:ascii="Times New Roman" w:hAnsi="Times New Roman"/>
-                <w:sz w:val="21"/>
-              </w:rPr>
-              <w:t>HTTP 201 (Pass)</w:t>
-            </w:r>
-          </w:p>
-        </w:tc>
-      </w:tr>
-      <w:tr>
-        <w:trPr>
-          <w:cantSplit/>
-        </w:trPr>
-        <w:tc>
-          <w:tcPr>
-            <w:tcW w:w="720" w:type="dxa"/>
-            <w:tcMar>
-              <w:top w:w="80" w:type="dxa"/>
-              <w:left w:w="120" w:type="dxa"/>
-              <w:bottom w:w="80" w:type="dxa"/>
-              <w:right w:w="120" w:type="dxa"/>
-            </w:tcMar>
-          </w:tcPr>
-          <w:p>
-            <w:pPr>
-              <w:spacing w:before="20" w:after="20" w:line="276" w:lineRule="auto"/>
-              <w:jc w:val="center"/>
-            </w:pPr>
-            <w:r>
-              <w:rPr>
-                <w:rFonts w:ascii="Times New Roman" w:hAnsi="Times New Roman"/>
-                <w:sz w:val="21"/>
-              </w:rPr>
-              <w:t>5</w:t>
-            </w:r>
-          </w:p>
-        </w:tc>
-        <w:tc>
-          <w:tcPr>
-            <w:tcW w:w="1872" w:type="dxa"/>
-            <w:tcMar>
-              <w:top w:w="80" w:type="dxa"/>
-              <w:left w:w="120" w:type="dxa"/>
-              <w:bottom w:w="80" w:type="dxa"/>
-              <w:right w:w="120" w:type="dxa"/>
-            </w:tcMar>
-          </w:tcPr>
-          <w:p>
-            <w:pPr>
-              <w:spacing w:before="20" w:after="20" w:line="276" w:lineRule="auto"/>
-            </w:pPr>
-            <w:r>
-              <w:rPr>
-                <w:rFonts w:ascii="Times New Roman" w:hAnsi="Times New Roman"/>
-                <w:sz w:val="21"/>
-              </w:rPr>
-              <w:t>Danh mục</w:t>
-            </w:r>
-          </w:p>
-        </w:tc>
-        <w:tc>
-          <w:tcPr>
-            <w:tcW w:w="3168" w:type="dxa"/>
-            <w:tcMar>
-              <w:top w:w="80" w:type="dxa"/>
-              <w:left w:w="120" w:type="dxa"/>
-              <w:bottom w:w="80" w:type="dxa"/>
-              <w:right w:w="120" w:type="dxa"/>
-            </w:tcMar>
-          </w:tcPr>
-          <w:p>
-            <w:pPr>
-              <w:spacing w:before="20" w:after="20" w:line="276" w:lineRule="auto"/>
-            </w:pPr>
-            <w:r>
-              <w:rPr>
-                <w:rFonts w:ascii="Times New Roman" w:hAnsi="Times New Roman"/>
-                <w:sz w:val="21"/>
-              </w:rPr>
-              <w:t>User thường gọi API Admin</w:t>
-            </w:r>
-          </w:p>
-        </w:tc>
-        <w:tc>
-          <w:tcPr>
-            <w:tcW w:w="2448" w:type="dxa"/>
-            <w:tcMar>
-              <w:top w:w="80" w:type="dxa"/>
-              <w:left w:w="120" w:type="dxa"/>
-              <w:bottom w:w="80" w:type="dxa"/>
-              <w:right w:w="120" w:type="dxa"/>
-            </w:tcMar>
-          </w:tcPr>
-          <w:p>
-            <w:pPr>
-              <w:spacing w:before="20" w:after="20" w:line="276" w:lineRule="auto"/>
-            </w:pPr>
-            <w:r>
-              <w:rPr>
-                <w:rFonts w:ascii="Times New Roman" w:hAnsi="Times New Roman"/>
-                <w:sz w:val="21"/>
-              </w:rPr>
-              <w:t>Token User thông thường</w:t>
-            </w:r>
-          </w:p>
-        </w:tc>
-        <w:tc>
-          <w:tcPr>
-            <w:tcW w:w="1152" w:type="dxa"/>
-            <w:tcMar>
-              <w:top w:w="80" w:type="dxa"/>
-              <w:left w:w="120" w:type="dxa"/>
-              <w:bottom w:w="80" w:type="dxa"/>
-              <w:right w:w="120" w:type="dxa"/>
-            </w:tcMar>
-          </w:tcPr>
-          <w:p>
-            <w:pPr>
-              <w:spacing w:before="20" w:after="20" w:line="276" w:lineRule="auto"/>
-              <w:jc w:val="center"/>
-            </w:pPr>
-            <w:r>
-              <w:rPr>
-                <w:rFonts w:ascii="Times New Roman" w:hAnsi="Times New Roman"/>
-                <w:sz w:val="21"/>
-              </w:rPr>
-              <w:t>HTTP 403 (Pass)</w:t>
-            </w:r>
-          </w:p>
-        </w:tc>
-      </w:tr>
-      <w:tr>
-        <w:trPr>
-          <w:cantSplit/>
-        </w:trPr>
-        <w:tc>
-          <w:tcPr>
-            <w:tcW w:w="720" w:type="dxa"/>
-            <w:tcMar>
-              <w:top w:w="80" w:type="dxa"/>
-              <w:left w:w="120" w:type="dxa"/>
-              <w:bottom w:w="80" w:type="dxa"/>
-              <w:right w:w="120" w:type="dxa"/>
-            </w:tcMar>
-          </w:tcPr>
-          <w:p>
-            <w:pPr>
-              <w:spacing w:before="20" w:after="20" w:line="276" w:lineRule="auto"/>
-              <w:jc w:val="center"/>
-            </w:pPr>
-            <w:r>
-              <w:rPr>
-                <w:rFonts w:ascii="Times New Roman" w:hAnsi="Times New Roman"/>
-                <w:sz w:val="21"/>
-              </w:rPr>
-              <w:lastRenderedPageBreak/>
-              <w:t>6</w:t>
-            </w:r>
-          </w:p>
-        </w:tc>
-        <w:tc>
-          <w:tcPr>
-            <w:tcW w:w="1872" w:type="dxa"/>
-            <w:tcMar>
-              <w:top w:w="80" w:type="dxa"/>
-              <w:left w:w="120" w:type="dxa"/>
-              <w:bottom w:w="80" w:type="dxa"/>
-              <w:right w:w="120" w:type="dxa"/>
-            </w:tcMar>
-          </w:tcPr>
-          <w:p>
-            <w:pPr>
-              <w:spacing w:before="20" w:after="20" w:line="276" w:lineRule="auto"/>
-            </w:pPr>
-            <w:r>
-              <w:rPr>
-                <w:rFonts w:ascii="Times New Roman" w:hAnsi="Times New Roman"/>
-                <w:sz w:val="21"/>
-              </w:rPr>
-              <w:t>Tin đăng</w:t>
-            </w:r>
-          </w:p>
-        </w:tc>
-        <w:tc>
-          <w:tcPr>
-            <w:tcW w:w="3168" w:type="dxa"/>
-            <w:tcMar>
-              <w:top w:w="80" w:type="dxa"/>
-              <w:left w:w="120" w:type="dxa"/>
-              <w:bottom w:w="80" w:type="dxa"/>
-              <w:right w:w="120" w:type="dxa"/>
-            </w:tcMar>
-          </w:tcPr>
-          <w:p>
-            <w:pPr>
-              <w:spacing w:before="20" w:after="20" w:line="276" w:lineRule="auto"/>
-            </w:pPr>
-            <w:r>
-              <w:rPr>
-                <w:rFonts w:ascii="Times New Roman" w:hAnsi="Times New Roman"/>
-                <w:sz w:val="21"/>
-              </w:rPr>
-              <w:t>Lọc tin theo khoảng giá, quận</w:t>
-            </w:r>
-          </w:p>
-        </w:tc>
-        <w:tc>
-          <w:tcPr>
-            <w:tcW w:w="2448" w:type="dxa"/>
-            <w:tcMar>
-              <w:top w:w="80" w:type="dxa"/>
-              <w:left w:w="120" w:type="dxa"/>
-              <w:bottom w:w="80" w:type="dxa"/>
-              <w:right w:w="120" w:type="dxa"/>
-            </w:tcMar>
-          </w:tcPr>
-          <w:p>
-            <w:pPr>
-              <w:spacing w:before="20" w:after="20" w:line="276" w:lineRule="auto"/>
-            </w:pPr>
-            <w:r>
-              <w:rPr>
-                <w:rFonts w:ascii="Times New Roman" w:hAnsi="Times New Roman"/>
-                <w:sz w:val="21"/>
-              </w:rPr>
-              <w:t>min_price, max_price</w:t>
-            </w:r>
-          </w:p>
-        </w:tc>
-        <w:tc>
-          <w:tcPr>
-            <w:tcW w:w="1152" w:type="dxa"/>
-            <w:tcMar>
-              <w:top w:w="80" w:type="dxa"/>
-              <w:left w:w="120" w:type="dxa"/>
-              <w:bottom w:w="80" w:type="dxa"/>
-              <w:right w:w="120" w:type="dxa"/>
-            </w:tcMar>
-          </w:tcPr>
-          <w:p>
-            <w:pPr>
-              <w:spacing w:before="20" w:after="20" w:line="276" w:lineRule="auto"/>
-              <w:jc w:val="center"/>
-            </w:pPr>
-            <w:r>
-              <w:rPr>
-                <w:rFonts w:ascii="Times New Roman" w:hAnsi="Times New Roman"/>
-                <w:sz w:val="21"/>
-              </w:rPr>
-              <w:t>HTTP 200 (Pass)</w:t>
-            </w:r>
-          </w:p>
-        </w:tc>
-      </w:tr>
-      <w:tr>
-        <w:trPr>
-          <w:cantSplit/>
-        </w:trPr>
-        <w:tc>
-          <w:tcPr>
-            <w:tcW w:w="720" w:type="dxa"/>
-            <w:tcMar>
-              <w:top w:w="80" w:type="dxa"/>
-              <w:left w:w="120" w:type="dxa"/>
-              <w:bottom w:w="80" w:type="dxa"/>
-              <w:right w:w="120" w:type="dxa"/>
-            </w:tcMar>
-          </w:tcPr>
-          <w:p>
-            <w:pPr>
-              <w:spacing w:before="20" w:after="20" w:line="276" w:lineRule="auto"/>
-              <w:jc w:val="center"/>
-            </w:pPr>
-            <w:r>
-              <w:rPr>
-                <w:rFonts w:ascii="Times New Roman" w:hAnsi="Times New Roman"/>
-                <w:sz w:val="21"/>
-              </w:rPr>
-              <w:t>7</w:t>
-            </w:r>
-          </w:p>
-        </w:tc>
-        <w:tc>
-          <w:tcPr>
-            <w:tcW w:w="1872" w:type="dxa"/>
-            <w:tcMar>
-              <w:top w:w="80" w:type="dxa"/>
-              <w:left w:w="120" w:type="dxa"/>
-              <w:bottom w:w="80" w:type="dxa"/>
-              <w:right w:w="120" w:type="dxa"/>
-            </w:tcMar>
-          </w:tcPr>
-          <w:p>
-            <w:pPr>
-              <w:spacing w:before="20" w:after="20" w:line="276" w:lineRule="auto"/>
-            </w:pPr>
-            <w:r>
-              <w:rPr>
-                <w:rFonts w:ascii="Times New Roman" w:hAnsi="Times New Roman"/>
-                <w:sz w:val="21"/>
-              </w:rPr>
-              <w:t>Tin đăng</w:t>
-            </w:r>
-          </w:p>
-        </w:tc>
-        <w:tc>
-          <w:tcPr>
-            <w:tcW w:w="3168" w:type="dxa"/>
-            <w:tcMar>
-              <w:top w:w="80" w:type="dxa"/>
-              <w:left w:w="120" w:type="dxa"/>
-              <w:bottom w:w="80" w:type="dxa"/>
-              <w:right w:w="120" w:type="dxa"/>
-            </w:tcMar>
-          </w:tcPr>
-          <w:p>
-            <w:pPr>
-              <w:spacing w:before="20" w:after="20" w:line="276" w:lineRule="auto"/>
-            </w:pPr>
-            <w:r>
-              <w:rPr>
-                <w:rFonts w:ascii="Times New Roman" w:hAnsi="Times New Roman"/>
-                <w:sz w:val="21"/>
-              </w:rPr>
-              <w:t>Tạo bản chờ khi sửa tin</w:t>
-            </w:r>
-          </w:p>
-        </w:tc>
-        <w:tc>
-          <w:tcPr>
-            <w:tcW w:w="2448" w:type="dxa"/>
-            <w:tcMar>
-              <w:top w:w="80" w:type="dxa"/>
-              <w:left w:w="120" w:type="dxa"/>
-              <w:bottom w:w="80" w:type="dxa"/>
-              <w:right w:w="120" w:type="dxa"/>
-            </w:tcMar>
-          </w:tcPr>
-          <w:p>
-            <w:pPr>
-              <w:spacing w:before="20" w:after="20" w:line="276" w:lineRule="auto"/>
-            </w:pPr>
-            <w:r>
-              <w:rPr>
-                <w:rFonts w:ascii="Times New Roman" w:hAnsi="Times New Roman"/>
-                <w:sz w:val="21"/>
-              </w:rPr>
-              <w:t>User sửa tin đã duyệt</w:t>
-            </w:r>
-          </w:p>
-        </w:tc>
-        <w:tc>
-          <w:tcPr>
-            <w:tcW w:w="1152" w:type="dxa"/>
-            <w:tcMar>
-              <w:top w:w="80" w:type="dxa"/>
-              <w:left w:w="120" w:type="dxa"/>
-              <w:bottom w:w="80" w:type="dxa"/>
-              <w:right w:w="120" w:type="dxa"/>
-            </w:tcMar>
-          </w:tcPr>
-          <w:p>
-            <w:pPr>
-              <w:spacing w:before="20" w:after="20" w:line="276" w:lineRule="auto"/>
-              <w:jc w:val="center"/>
-            </w:pPr>
-            <w:r>
-              <w:rPr>
-                <w:rFonts w:ascii="Times New Roman" w:hAnsi="Times New Roman"/>
-                <w:sz w:val="21"/>
-              </w:rPr>
-              <w:t>DB Verified (Pass)</w:t>
-            </w:r>
-          </w:p>
-        </w:tc>
-      </w:tr>
-    </w:tbl>
     <w:p>
       <w:pPr>
         <w:pStyle w:val="Heading2"/>
@@ -8658,7 +7890,7 @@
       <w:bookmarkStart w:id="55" w:name="_Toc_121"/>
       <w:bookmarkStart w:id="56" w:name="_Toc_34"/>
       <w:r>
-        <w:t>Quy trình phát triển nhóm</w:t>
+        <w:t>Khai báo sử dụng AI</w:t>
       </w:r>
       <w:bookmarkEnd w:id="55"/>
       <w:bookmarkEnd w:id="56"/>
@@ -8672,771 +7904,21 @@
         <w:rPr>
           <w:rFonts w:ascii="Times New Roman" w:hAnsi="Times New Roman"/>
         </w:rPr>
-        <w:t>Để đảm bảo chất lượng mã nguồn và khả năng cộng tác hiệu quả giữa 4 thành viên, nhóm áp dụng quy trình phát triển phần mềm chuẩn mực trên nền tảng GitHub:</w:t>
+        <w:t>Trong quá trình thực hiện đồ án, đặc biệt là phần Backend, nhóm có sử dụng ChatGPT và Claude để hỗ trợ tham khảo cách xử lý lỗi, viết một số đoạn code lặp lại (ví dụ script seed dữ liệu mẫu, một số câu query SQLAlchemy) và hỗ trợ trình bày tài liệu. Toàn bộ phần phân tích yêu cầu, thiết kế cơ sở dữ liệu, kiến trúc hệ thống và các quyết định kỹ thuật chính của UrbanLease đều do nhóm tự phân tích và thực hiện; những đoạn code có AI hỗ trợ đều được thành viên kiểm tra, đối chiếu tài liệu chính thức của thư viện và chỉnh sửa trước khi đưa vào dự án.</w:t>
       </w:r>
     </w:p>
     <w:p>
       <w:pPr>
-        <w:spacing w:after="40" w:line="283" w:lineRule="auto"/>
+        <w:spacing w:before="60" w:line="283" w:lineRule="auto"/>
         <w:jc w:val="both"/>
       </w:pPr>
       <w:r>
         <w:rPr>
           <w:rFonts w:ascii="Times New Roman" w:hAnsi="Times New Roman"/>
-          <w:b/>
-        </w:rPr>
-        <w:t xml:space="preserve">a) Chiến lược phân nhánh (Branching Strategy): </w:t>
+        </w:rPr>
+        <w:t xml:space="preserve">Nhóm không dùng AI để sinh toàn bộ hệ thống rồi đưa thẳng vào dự án: với từng phần việc, nhóm tự xác định Model/Schema/yêu cầu nghiệp vụ trước, sau đó mới nhờ AI hỗ trợ một phần cụ thể, rồi đọc hiểu, đối chiếu tài liệu chính thức và kiểm thử lại trước khi merge. Danh sách công cụ, các prompt tiêu biểu và quy trình kiểm tra kết quả AI được trình bày chi tiết trong tài liệu khai báo sử dụng AI nộp kèm theo đồ án.</w:t>
       </w:r>
-      <w:r>
-        <w:rPr>
-          <w:rFonts w:ascii="Times New Roman" w:hAnsi="Times New Roman"/>
-        </w:rPr>
-        <w:t>Nhóm áp dụng mô hình Feature Branch Workflow (mỗi nhánh tương ứng một tính năng độc lập). Quy ước đặt tên nhánh theo cú pháp: &lt;phân_hệ&gt;/&lt;tên_tính_năng&gt; hoặc &lt;phân_hệ&gt;-NN/&lt;tên_tính_năng&gt;. Một số nhánh tiêu biểu trong repository:</w:t>
-      </w:r>
-    </w:p>
-    <w:p>
-      <w:pPr>
-        <w:spacing w:after="40" w:line="283" w:lineRule="auto"/>
-        <w:ind w:left="360"/>
-        <w:jc w:val="both"/>
-      </w:pPr>
-      <w:r>
-        <w:rPr>
-          <w:rFonts w:ascii="Times New Roman" w:hAnsi="Times New Roman"/>
-          <w:b/>
-        </w:rPr>
-        <w:t xml:space="preserve">• core-01/khoi-tao-backend-fastapi-docker: </w:t>
-      </w:r>
-      <w:r>
-        <w:rPr>
-          <w:rFonts w:ascii="Times New Roman" w:hAnsi="Times New Roman"/>
-        </w:rPr>
-        <w:t>Khởi tạo khung kiến trúc backend FastAPI và cấu hình Docker Compose.</w:t>
-      </w:r>
-    </w:p>
-    <w:p>
-      <w:pPr>
-        <w:spacing w:after="40" w:line="283" w:lineRule="auto"/>
-        <w:ind w:left="360"/>
-        <w:jc w:val="both"/>
-      </w:pPr>
-      <w:r>
-        <w:rPr>
-          <w:rFonts w:ascii="Times New Roman" w:hAnsi="Times New Roman"/>
-          <w:b/>
-        </w:rPr>
-        <w:t xml:space="preserve">• core-02/erd-sqlalchemy-postgres: </w:t>
-      </w:r>
-      <w:r>
-        <w:rPr>
-          <w:rFonts w:ascii="Times New Roman" w:hAnsi="Times New Roman"/>
-        </w:rPr>
-        <w:t>Thiết kế mô hình dữ liệu PostgreSQL và ánh xạ quan hệ SQLAlchemy ORM.</w:t>
-      </w:r>
-    </w:p>
-    <w:p>
-      <w:pPr>
-        <w:spacing w:after="40" w:line="283" w:lineRule="auto"/>
-        <w:ind w:left="360"/>
-        <w:jc w:val="both"/>
-      </w:pPr>
-      <w:r>
-        <w:rPr>
-          <w:rFonts w:ascii="Times New Roman" w:hAnsi="Times New Roman"/>
-          <w:b/>
-        </w:rPr>
-        <w:t xml:space="preserve">• auth-01-02/dang-ky-dang-nhap-jwt: </w:t>
-      </w:r>
-      <w:r>
-        <w:rPr>
-          <w:rFonts w:ascii="Times New Roman" w:hAnsi="Times New Roman"/>
-        </w:rPr>
-        <w:t>Triển khai luồng xác thực đăng ký, đăng nhập và cấp mã bảo mật JWT token.</w:t>
-      </w:r>
-    </w:p>
-    <w:p>
-      <w:pPr>
-        <w:spacing w:line="283" w:lineRule="auto"/>
-        <w:ind w:left="360"/>
-        <w:jc w:val="both"/>
-      </w:pPr>
-      <w:r>
-        <w:rPr>
-          <w:rFonts w:ascii="Times New Roman" w:hAnsi="Times New Roman"/>
-          <w:b/>
-        </w:rPr>
-        <w:t xml:space="preserve">• Các nhánh tính năng nghiệp vụ: </w:t>
-      </w:r>
-      <w:r>
-        <w:rPr>
-          <w:rFonts w:ascii="Times New Roman" w:hAnsi="Times New Roman"/>
-        </w:rPr>
-        <w:t>Phát triển các module chức năng nghiệp vụ độc lập, giúp phát triển song song mà không gây xung đột mã nguồn.</w:t>
-      </w:r>
-    </w:p>
-    <w:p>
-      <w:pPr>
-        <w:spacing w:line="283" w:lineRule="auto"/>
-        <w:jc w:val="both"/>
-      </w:pPr>
-      <w:r>
-        <w:rPr>
-          <w:rFonts w:ascii="Times New Roman" w:hAnsi="Times New Roman"/>
-          <w:b/>
-        </w:rPr>
-        <w:t xml:space="preserve">b) Quy trình tích hợp &amp; đánh giá mã nguồn (Code Review): </w:t>
-      </w:r>
-      <w:r>
-        <w:rPr>
-          <w:rFonts w:ascii="Times New Roman" w:hAnsi="Times New Roman"/>
-        </w:rPr>
-        <w:t>Bảo vệ tuyệt đối nhánh main bằng thiết lập Branch Protection (không cho phép commit hoặc push code trực tiếp lên main). Mọi thay đổi đều phải tạo Pull Request (PR) trên GitHub và bắt buộc có ít nhất một thành viên khác xem xét (Code Review) và phê duyệt trước khi merge.</w:t>
-      </w:r>
-    </w:p>
-    <w:p>
-      <w:pPr>
-        <w:spacing w:after="120" w:line="283" w:lineRule="auto"/>
-        <w:jc w:val="both"/>
-      </w:pPr>
-      <w:r>
-        <w:rPr>
-          <w:rFonts w:ascii="Times New Roman" w:hAnsi="Times New Roman"/>
-          <w:b/>
-        </w:rPr>
-        <w:t xml:space="preserve">c) Tiêu chuẩn thông điệp Commit (Conventional Commits): </w:t>
-      </w:r>
-      <w:r>
-        <w:rPr>
-          <w:rFonts w:ascii="Times New Roman" w:hAnsi="Times New Roman"/>
-        </w:rPr>
-        <w:t>Tuân thủ cú pháp &lt;type&gt;(&lt;scope&gt;): &lt;mô tả ngắn bằng tiếng Việt có dấu&gt; (ví dụ: add(rental-post): lọc tin đăng chờ duyệt, fix(fe): cập nhật layout trang chủ). Dự án hoàn thành với 41 commits từ 4 thành viên, trải dài trên 15 nhánh tính năng.</w:t>
-      </w:r>
-    </w:p>
-    <w:p>
-      <w:pPr>
-        <w:pStyle w:val="Caption"/>
-        <w:spacing w:before="40"/>
-      </w:pPr>
-      <w:bookmarkStart w:id="57" w:name="_Toc_Tbl_32"/>
-      <w:r>
-        <w:rPr>
-          <w:rFonts w:ascii="Times New Roman" w:hAnsi="Times New Roman"/>
-          <w:b/>
-          <w:i/>
-          <w:sz w:val="22"/>
-        </w:rPr>
-        <w:t>Bảng 3.2: Quy ước phân nhánh và quy tắc Commit của nhóm</w:t>
-      </w:r>
-      <w:bookmarkEnd w:id="57"/>
-    </w:p>
-    <w:tbl>
-      <w:tblPr>
-        <w:tblStyle w:val="TableGrid"/>
-        <w:tblW w:w="0" w:type="auto"/>
-        <w:tblLook w:val="04A0" w:firstRow="1" w:lastRow="0" w:firstColumn="1" w:lastColumn="0" w:noHBand="0" w:noVBand="1"/>
-      </w:tblPr>
-      <w:tblGrid>
-        <w:gridCol w:w="1861"/>
-        <w:gridCol w:w="2294"/>
-        <w:gridCol w:w="2863"/>
-        <w:gridCol w:w="2293"/>
-      </w:tblGrid>
-      <w:tr>
-        <w:trPr>
-          <w:cantSplit/>
-          <w:tblHeader/>
-        </w:trPr>
-        <w:tc>
-          <w:tcPr>
-            <w:tcW w:w="1872" w:type="dxa"/>
-            <w:tcMar>
-              <w:top w:w="80" w:type="dxa"/>
-              <w:left w:w="120" w:type="dxa"/>
-              <w:bottom w:w="80" w:type="dxa"/>
-              <w:right w:w="120" w:type="dxa"/>
-            </w:tcMar>
-          </w:tcPr>
-          <w:p>
-            <w:pPr>
-              <w:spacing w:before="20" w:after="20" w:line="276" w:lineRule="auto"/>
-              <w:jc w:val="center"/>
-            </w:pPr>
-            <w:r>
-              <w:rPr>
-                <w:rFonts w:ascii="Times New Roman" w:hAnsi="Times New Roman"/>
-                <w:b/>
-                <w:sz w:val="21"/>
-              </w:rPr>
-              <w:t>Nhóm nhánh</w:t>
-            </w:r>
-          </w:p>
-        </w:tc>
-        <w:tc>
-          <w:tcPr>
-            <w:tcW w:w="2304" w:type="dxa"/>
-            <w:tcMar>
-              <w:top w:w="80" w:type="dxa"/>
-              <w:left w:w="120" w:type="dxa"/>
-              <w:bottom w:w="80" w:type="dxa"/>
-              <w:right w:w="120" w:type="dxa"/>
-            </w:tcMar>
-          </w:tcPr>
-          <w:p>
-            <w:pPr>
-              <w:spacing w:before="20" w:after="20" w:line="276" w:lineRule="auto"/>
-              <w:jc w:val="center"/>
-            </w:pPr>
-            <w:r>
-              <w:rPr>
-                <w:rFonts w:ascii="Times New Roman" w:hAnsi="Times New Roman"/>
-                <w:b/>
-                <w:sz w:val="21"/>
-              </w:rPr>
-              <w:t>Quy ước đặt tên</w:t>
-            </w:r>
-          </w:p>
-        </w:tc>
-        <w:tc>
-          <w:tcPr>
-            <w:tcW w:w="2880" w:type="dxa"/>
-            <w:tcMar>
-              <w:top w:w="80" w:type="dxa"/>
-              <w:left w:w="120" w:type="dxa"/>
-              <w:bottom w:w="80" w:type="dxa"/>
-              <w:right w:w="120" w:type="dxa"/>
-            </w:tcMar>
-          </w:tcPr>
-          <w:p>
-            <w:pPr>
-              <w:spacing w:before="20" w:after="20" w:line="276" w:lineRule="auto"/>
-              <w:jc w:val="center"/>
-            </w:pPr>
-            <w:r>
-              <w:rPr>
-                <w:rFonts w:ascii="Times New Roman" w:hAnsi="Times New Roman"/>
-                <w:b/>
-                <w:sz w:val="21"/>
-              </w:rPr>
-              <w:t>Mục đích / Nghiệp vụ</w:t>
-            </w:r>
-          </w:p>
-        </w:tc>
-        <w:tc>
-          <w:tcPr>
-            <w:tcW w:w="2304" w:type="dxa"/>
-            <w:tcMar>
-              <w:top w:w="80" w:type="dxa"/>
-              <w:left w:w="120" w:type="dxa"/>
-              <w:bottom w:w="80" w:type="dxa"/>
-              <w:right w:w="120" w:type="dxa"/>
-            </w:tcMar>
-          </w:tcPr>
-          <w:p>
-            <w:pPr>
-              <w:spacing w:before="20" w:after="20" w:line="276" w:lineRule="auto"/>
-              <w:jc w:val="center"/>
-            </w:pPr>
-            <w:r>
-              <w:rPr>
-                <w:rFonts w:ascii="Times New Roman" w:hAnsi="Times New Roman"/>
-                <w:b/>
-                <w:sz w:val="21"/>
-              </w:rPr>
-              <w:t>Nhánh thực tế trong Git</w:t>
-            </w:r>
-          </w:p>
-        </w:tc>
-      </w:tr>
-      <w:tr>
-        <w:trPr>
-          <w:cantSplit/>
-        </w:trPr>
-        <w:tc>
-          <w:tcPr>
-            <w:tcW w:w="1872" w:type="dxa"/>
-            <w:tcMar>
-              <w:top w:w="80" w:type="dxa"/>
-              <w:left w:w="120" w:type="dxa"/>
-              <w:bottom w:w="80" w:type="dxa"/>
-              <w:right w:w="120" w:type="dxa"/>
-            </w:tcMar>
-          </w:tcPr>
-          <w:p>
-            <w:pPr>
-              <w:spacing w:before="20" w:after="20" w:line="276" w:lineRule="auto"/>
-              <w:jc w:val="center"/>
-            </w:pPr>
-            <w:r>
-              <w:rPr>
-                <w:rFonts w:ascii="Times New Roman" w:hAnsi="Times New Roman"/>
-                <w:sz w:val="21"/>
-              </w:rPr>
-              <w:t>Hạ tầng &amp; DB</w:t>
-            </w:r>
-          </w:p>
-        </w:tc>
-        <w:tc>
-          <w:tcPr>
-            <w:tcW w:w="2304" w:type="dxa"/>
-            <w:tcMar>
-              <w:top w:w="80" w:type="dxa"/>
-              <w:left w:w="120" w:type="dxa"/>
-              <w:bottom w:w="80" w:type="dxa"/>
-              <w:right w:w="120" w:type="dxa"/>
-            </w:tcMar>
-          </w:tcPr>
-          <w:p>
-            <w:pPr>
-              <w:spacing w:before="20" w:after="20" w:line="276" w:lineRule="auto"/>
-            </w:pPr>
-            <w:r>
-              <w:rPr>
-                <w:rFonts w:ascii="Times New Roman" w:hAnsi="Times New Roman"/>
-                <w:sz w:val="21"/>
-              </w:rPr>
-              <w:t>core-&lt;id&gt;/&lt;slug&gt;</w:t>
-            </w:r>
-          </w:p>
-        </w:tc>
-        <w:tc>
-          <w:tcPr>
-            <w:tcW w:w="2880" w:type="dxa"/>
-            <w:tcMar>
-              <w:top w:w="80" w:type="dxa"/>
-              <w:left w:w="120" w:type="dxa"/>
-              <w:bottom w:w="80" w:type="dxa"/>
-              <w:right w:w="120" w:type="dxa"/>
-            </w:tcMar>
-          </w:tcPr>
-          <w:p>
-            <w:pPr>
-              <w:spacing w:before="20" w:after="20" w:line="276" w:lineRule="auto"/>
-            </w:pPr>
-            <w:r>
-              <w:rPr>
-                <w:rFonts w:ascii="Times New Roman" w:hAnsi="Times New Roman"/>
-                <w:sz w:val="21"/>
-              </w:rPr>
-              <w:t>Khởi tạo Docker, CSDL, ORM</w:t>
-            </w:r>
-          </w:p>
-        </w:tc>
-        <w:tc>
-          <w:tcPr>
-            <w:tcW w:w="2304" w:type="dxa"/>
-            <w:tcMar>
-              <w:top w:w="80" w:type="dxa"/>
-              <w:left w:w="120" w:type="dxa"/>
-              <w:bottom w:w="80" w:type="dxa"/>
-              <w:right w:w="120" w:type="dxa"/>
-            </w:tcMar>
-          </w:tcPr>
-          <w:p>
-            <w:pPr>
-              <w:spacing w:before="20" w:after="20" w:line="276" w:lineRule="auto"/>
-            </w:pPr>
-            <w:r>
-              <w:rPr>
-                <w:rFonts w:ascii="Times New Roman" w:hAnsi="Times New Roman"/>
-                <w:sz w:val="21"/>
-              </w:rPr>
-              <w:t>core-01/khoi-tao-backend-fastapi-docker</w:t>
-            </w:r>
-          </w:p>
-        </w:tc>
-      </w:tr>
-      <w:tr>
-        <w:trPr>
-          <w:cantSplit/>
-        </w:trPr>
-        <w:tc>
-          <w:tcPr>
-            <w:tcW w:w="1872" w:type="dxa"/>
-            <w:tcMar>
-              <w:top w:w="80" w:type="dxa"/>
-              <w:left w:w="120" w:type="dxa"/>
-              <w:bottom w:w="80" w:type="dxa"/>
-              <w:right w:w="120" w:type="dxa"/>
-            </w:tcMar>
-          </w:tcPr>
-          <w:p>
-            <w:pPr>
-              <w:spacing w:before="20" w:after="20" w:line="276" w:lineRule="auto"/>
-              <w:jc w:val="center"/>
-            </w:pPr>
-            <w:r>
-              <w:rPr>
-                <w:rFonts w:ascii="Times New Roman" w:hAnsi="Times New Roman"/>
-                <w:sz w:val="21"/>
-              </w:rPr>
-              <w:lastRenderedPageBreak/>
-              <w:t>Xác thực</w:t>
-            </w:r>
-          </w:p>
-        </w:tc>
-        <w:tc>
-          <w:tcPr>
-            <w:tcW w:w="2304" w:type="dxa"/>
-            <w:tcMar>
-              <w:top w:w="80" w:type="dxa"/>
-              <w:left w:w="120" w:type="dxa"/>
-              <w:bottom w:w="80" w:type="dxa"/>
-              <w:right w:w="120" w:type="dxa"/>
-            </w:tcMar>
-          </w:tcPr>
-          <w:p>
-            <w:pPr>
-              <w:spacing w:before="20" w:after="20" w:line="276" w:lineRule="auto"/>
-            </w:pPr>
-            <w:r>
-              <w:rPr>
-                <w:rFonts w:ascii="Times New Roman" w:hAnsi="Times New Roman"/>
-                <w:sz w:val="21"/>
-              </w:rPr>
-              <w:t>auth-&lt;id&gt;/&lt;slug&gt;</w:t>
-            </w:r>
-          </w:p>
-        </w:tc>
-        <w:tc>
-          <w:tcPr>
-            <w:tcW w:w="2880" w:type="dxa"/>
-            <w:tcMar>
-              <w:top w:w="80" w:type="dxa"/>
-              <w:left w:w="120" w:type="dxa"/>
-              <w:bottom w:w="80" w:type="dxa"/>
-              <w:right w:w="120" w:type="dxa"/>
-            </w:tcMar>
-          </w:tcPr>
-          <w:p>
-            <w:pPr>
-              <w:spacing w:before="20" w:after="20" w:line="276" w:lineRule="auto"/>
-            </w:pPr>
-            <w:r>
-              <w:rPr>
-                <w:rFonts w:ascii="Times New Roman" w:hAnsi="Times New Roman"/>
-                <w:sz w:val="21"/>
-              </w:rPr>
-              <w:t>Đăng ký, đăng nhập JWT</w:t>
-            </w:r>
-          </w:p>
-        </w:tc>
-        <w:tc>
-          <w:tcPr>
-            <w:tcW w:w="2304" w:type="dxa"/>
-            <w:tcMar>
-              <w:top w:w="80" w:type="dxa"/>
-              <w:left w:w="120" w:type="dxa"/>
-              <w:bottom w:w="80" w:type="dxa"/>
-              <w:right w:w="120" w:type="dxa"/>
-            </w:tcMar>
-          </w:tcPr>
-          <w:p>
-            <w:pPr>
-              <w:spacing w:before="20" w:after="20" w:line="276" w:lineRule="auto"/>
-            </w:pPr>
-            <w:r>
-              <w:rPr>
-                <w:rFonts w:ascii="Times New Roman" w:hAnsi="Times New Roman"/>
-                <w:sz w:val="21"/>
-              </w:rPr>
-              <w:t>auth-01-02/dang-ky-dang-nhap-jwt</w:t>
-            </w:r>
-          </w:p>
-        </w:tc>
-      </w:tr>
-      <w:tr>
-        <w:trPr>
-          <w:cantSplit/>
-        </w:trPr>
-        <w:tc>
-          <w:tcPr>
-            <w:tcW w:w="1872" w:type="dxa"/>
-            <w:tcMar>
-              <w:top w:w="80" w:type="dxa"/>
-              <w:left w:w="120" w:type="dxa"/>
-              <w:bottom w:w="80" w:type="dxa"/>
-              <w:right w:w="120" w:type="dxa"/>
-            </w:tcMar>
-          </w:tcPr>
-          <w:p>
-            <w:pPr>
-              <w:spacing w:before="20" w:after="20" w:line="276" w:lineRule="auto"/>
-            </w:pPr>
-            <w:r>
-              <w:rPr>
-                <w:rFonts w:ascii="Times New Roman" w:hAnsi="Times New Roman"/>
-                <w:sz w:val="21"/>
-              </w:rPr>
-              <w:t>Nghiệp vụ tin</w:t>
-            </w:r>
-          </w:p>
-        </w:tc>
-        <w:tc>
-          <w:tcPr>
-            <w:tcW w:w="2304" w:type="dxa"/>
-            <w:tcMar>
-              <w:top w:w="80" w:type="dxa"/>
-              <w:left w:w="120" w:type="dxa"/>
-              <w:bottom w:w="80" w:type="dxa"/>
-              <w:right w:w="120" w:type="dxa"/>
-            </w:tcMar>
-          </w:tcPr>
-          <w:p>
-            <w:pPr>
-              <w:spacing w:before="20" w:after="20" w:line="276" w:lineRule="auto"/>
-            </w:pPr>
-            <w:r>
-              <w:rPr>
-                <w:rFonts w:ascii="Times New Roman" w:hAnsi="Times New Roman"/>
-                <w:sz w:val="21"/>
-              </w:rPr>
-              <w:t>&lt;tên-tính-năng&gt;</w:t>
-            </w:r>
-          </w:p>
-        </w:tc>
-        <w:tc>
-          <w:tcPr>
-            <w:tcW w:w="2880" w:type="dxa"/>
-            <w:tcMar>
-              <w:top w:w="80" w:type="dxa"/>
-              <w:left w:w="120" w:type="dxa"/>
-              <w:bottom w:w="80" w:type="dxa"/>
-              <w:right w:w="120" w:type="dxa"/>
-            </w:tcMar>
-          </w:tcPr>
-          <w:p>
-            <w:pPr>
-              <w:spacing w:before="20" w:after="20" w:line="276" w:lineRule="auto"/>
-            </w:pPr>
-            <w:r>
-              <w:rPr>
-                <w:rFonts w:ascii="Times New Roman" w:hAnsi="Times New Roman"/>
-                <w:sz w:val="21"/>
-              </w:rPr>
-              <w:t>CRUD tin đăng, thư viện ảnh</w:t>
-            </w:r>
-          </w:p>
-        </w:tc>
-        <w:tc>
-          <w:tcPr>
-            <w:tcW w:w="2304" w:type="dxa"/>
-            <w:tcMar>
-              <w:top w:w="80" w:type="dxa"/>
-              <w:left w:w="120" w:type="dxa"/>
-              <w:bottom w:w="80" w:type="dxa"/>
-              <w:right w:w="120" w:type="dxa"/>
-            </w:tcMar>
-          </w:tcPr>
-          <w:p>
-            <w:pPr>
-              <w:spacing w:before="20" w:after="20" w:line="276" w:lineRule="auto"/>
-            </w:pPr>
-            <w:r>
-              <w:rPr>
-                <w:rFonts w:ascii="Times New Roman" w:hAnsi="Times New Roman"/>
-                <w:sz w:val="21"/>
-              </w:rPr>
-              <w:t>quan-ly-danh-muc, upload-file-to-minio</w:t>
-            </w:r>
-          </w:p>
-        </w:tc>
-      </w:tr>
-      <w:tr>
-        <w:trPr>
-          <w:cantSplit/>
-        </w:trPr>
-        <w:tc>
-          <w:tcPr>
-            <w:tcW w:w="1872" w:type="dxa"/>
-            <w:tcMar>
-              <w:top w:w="80" w:type="dxa"/>
-              <w:left w:w="120" w:type="dxa"/>
-              <w:bottom w:w="80" w:type="dxa"/>
-              <w:right w:w="120" w:type="dxa"/>
-            </w:tcMar>
-          </w:tcPr>
-          <w:p>
-            <w:pPr>
-              <w:spacing w:before="20" w:after="20" w:line="276" w:lineRule="auto"/>
-              <w:jc w:val="center"/>
-            </w:pPr>
-            <w:r>
-              <w:rPr>
-                <w:rFonts w:ascii="Times New Roman" w:hAnsi="Times New Roman"/>
-                <w:sz w:val="21"/>
-              </w:rPr>
-              <w:t>Thống kê</w:t>
-            </w:r>
-          </w:p>
-        </w:tc>
-        <w:tc>
-          <w:tcPr>
-            <w:tcW w:w="2304" w:type="dxa"/>
-            <w:tcMar>
-              <w:top w:w="80" w:type="dxa"/>
-              <w:left w:w="120" w:type="dxa"/>
-              <w:bottom w:w="80" w:type="dxa"/>
-              <w:right w:w="120" w:type="dxa"/>
-            </w:tcMar>
-          </w:tcPr>
-          <w:p>
-            <w:pPr>
-              <w:spacing w:before="20" w:after="20" w:line="276" w:lineRule="auto"/>
-            </w:pPr>
-            <w:r>
-              <w:rPr>
-                <w:rFonts w:ascii="Times New Roman" w:hAnsi="Times New Roman"/>
-                <w:sz w:val="21"/>
-              </w:rPr>
-              <w:t>thong-ke-&lt;slug&gt;</w:t>
-            </w:r>
-          </w:p>
-        </w:tc>
-        <w:tc>
-          <w:tcPr>
-            <w:tcW w:w="2880" w:type="dxa"/>
-            <w:tcMar>
-              <w:top w:w="80" w:type="dxa"/>
-              <w:left w:w="120" w:type="dxa"/>
-              <w:bottom w:w="80" w:type="dxa"/>
-              <w:right w:w="120" w:type="dxa"/>
-            </w:tcMar>
-          </w:tcPr>
-          <w:p>
-            <w:pPr>
-              <w:spacing w:before="20" w:after="20" w:line="276" w:lineRule="auto"/>
-            </w:pPr>
-            <w:r>
-              <w:rPr>
-                <w:rFonts w:ascii="Times New Roman" w:hAnsi="Times New Roman"/>
-                <w:sz w:val="21"/>
-              </w:rPr>
-              <w:t>Dashboard thị trường</w:t>
-            </w:r>
-          </w:p>
-        </w:tc>
-        <w:tc>
-          <w:tcPr>
-            <w:tcW w:w="2304" w:type="dxa"/>
-            <w:tcMar>
-              <w:top w:w="80" w:type="dxa"/>
-              <w:left w:w="120" w:type="dxa"/>
-              <w:bottom w:w="80" w:type="dxa"/>
-              <w:right w:w="120" w:type="dxa"/>
-            </w:tcMar>
-          </w:tcPr>
-          <w:p>
-            <w:pPr>
-              <w:spacing w:before="20" w:after="20" w:line="276" w:lineRule="auto"/>
-            </w:pPr>
-            <w:r>
-              <w:rPr>
-                <w:rFonts w:ascii="Times New Roman" w:hAnsi="Times New Roman"/>
-                <w:sz w:val="21"/>
-              </w:rPr>
-              <w:t>thong-ke-tong-quan</w:t>
-            </w:r>
-          </w:p>
-        </w:tc>
-      </w:tr>
-      <w:tr>
-        <w:trPr>
-          <w:cantSplit/>
-        </w:trPr>
-        <w:tc>
-          <w:tcPr>
-            <w:tcW w:w="1872" w:type="dxa"/>
-            <w:tcMar>
-              <w:top w:w="80" w:type="dxa"/>
-              <w:left w:w="120" w:type="dxa"/>
-              <w:bottom w:w="80" w:type="dxa"/>
-              <w:right w:w="120" w:type="dxa"/>
-            </w:tcMar>
-          </w:tcPr>
-          <w:p>
-            <w:pPr>
-              <w:spacing w:before="20" w:after="20" w:line="276" w:lineRule="auto"/>
-            </w:pPr>
-            <w:r>
-              <w:rPr>
-                <w:rFonts w:ascii="Times New Roman" w:hAnsi="Times New Roman"/>
-                <w:sz w:val="21"/>
-              </w:rPr>
-              <w:t>Quy tắc commit</w:t>
-            </w:r>
-          </w:p>
-        </w:tc>
-        <w:tc>
-          <w:tcPr>
-            <w:tcW w:w="2304" w:type="dxa"/>
-            <w:tcMar>
-              <w:top w:w="80" w:type="dxa"/>
-              <w:left w:w="120" w:type="dxa"/>
-              <w:bottom w:w="80" w:type="dxa"/>
-              <w:right w:w="120" w:type="dxa"/>
-            </w:tcMar>
-          </w:tcPr>
-          <w:p>
-            <w:pPr>
-              <w:spacing w:before="20" w:after="20" w:line="276" w:lineRule="auto"/>
-            </w:pPr>
-            <w:r>
-              <w:rPr>
-                <w:rFonts w:ascii="Times New Roman" w:hAnsi="Times New Roman"/>
-                <w:sz w:val="21"/>
-              </w:rPr>
-              <w:t>type(scope): mô tả</w:t>
-            </w:r>
-          </w:p>
-        </w:tc>
-        <w:tc>
-          <w:tcPr>
-            <w:tcW w:w="2880" w:type="dxa"/>
-            <w:tcMar>
-              <w:top w:w="80" w:type="dxa"/>
-              <w:left w:w="120" w:type="dxa"/>
-              <w:bottom w:w="80" w:type="dxa"/>
-              <w:right w:w="120" w:type="dxa"/>
-            </w:tcMar>
-          </w:tcPr>
-          <w:p>
-            <w:pPr>
-              <w:spacing w:before="20" w:after="20" w:line="276" w:lineRule="auto"/>
-            </w:pPr>
-            <w:r>
-              <w:rPr>
-                <w:rFonts w:ascii="Times New Roman" w:hAnsi="Times New Roman"/>
-                <w:sz w:val="21"/>
-              </w:rPr>
-              <w:t>Quy ước commit tiếng Việt</w:t>
-            </w:r>
-          </w:p>
-        </w:tc>
-        <w:tc>
-          <w:tcPr>
-            <w:tcW w:w="2304" w:type="dxa"/>
-            <w:tcMar>
-              <w:top w:w="80" w:type="dxa"/>
-              <w:left w:w="120" w:type="dxa"/>
-              <w:bottom w:w="80" w:type="dxa"/>
-              <w:right w:w="120" w:type="dxa"/>
-            </w:tcMar>
-          </w:tcPr>
-          <w:p>
-            <w:pPr>
-              <w:spacing w:before="20" w:after="20" w:line="276" w:lineRule="auto"/>
-            </w:pPr>
-            <w:r>
-              <w:rPr>
-                <w:rFonts w:ascii="Times New Roman" w:hAnsi="Times New Roman"/>
-                <w:sz w:val="21"/>
-              </w:rPr>
-              <w:t>add(rental-post): list in-review post</w:t>
-            </w:r>
-          </w:p>
-        </w:tc>
-      </w:tr>
-    </w:tbl>
+    </w:p>
     <w:p>
       <w:pPr>
         <w:pStyle w:val="Title"/>
@@ -9506,7 +7988,7 @@
           <w:rFonts w:ascii="Times New Roman" w:hAnsi="Times New Roman"/>
           <w:b/>
         </w:rPr>
-        <w:t xml:space="preserve">– Hạn chế: </w:t>
+        <w:t xml:space="preserve">Hạn chế: </w:t>
       </w:r>
       <w:r>
         <w:rPr>
@@ -9526,7 +8008,7 @@
           <w:rFonts w:ascii="Times New Roman" w:hAnsi="Times New Roman"/>
           <w:b/>
         </w:rPr>
-        <w:t xml:space="preserve">– Hướng phát triển: </w:t>
+        <w:t xml:space="preserve">Hướng phát triển: </w:t>
       </w:r>
       <w:r>
         <w:rPr>
@@ -15817,6 +14299,22 @@
       </w:pPr>
       <w:rPr>
         <w:rFonts w:ascii="Wingdings" w:hAnsi="Wingdings" w:hint="default"/>
+      </w:rPr>
+    </w:lvl>
+  </w:abstractNum>
+  <w:abstractNum w:abstractNumId="100">
+    <w:nsid w:val="7A0B1C2D"/>
+    <w:multiLevelType w:val="hybridMultilevel"/>
+    <w:lvl w:ilvl="0" w:tplc="04090001">
+      <w:start w:val="1"/>
+      <w:numFmt w:val="bullet"/>
+      <w:lvlText w:val=""/>
+      <w:lvlJc w:val="left"/>
+      <w:pPr>
+        <w:ind w:left="720" w:hanging="360"/>
+      </w:pPr>
+      <w:rPr>
+        <w:rFonts w:ascii="Symbol" w:hAnsi="Symbol" w:hint="default"/>
       </w:rPr>
     </w:lvl>
   </w:abstractNum>
@@ -15954,6 +14452,9 @@
   </w:num>
   <w:num w:numId="45" w16cid:durableId="842089678">
     <w:abstractNumId w:val="39"/>
+  </w:num>
+  <w:num w:numId="100" w16cid:durableId="900000001">
+    <w:abstractNumId w:val="100"/>
   </w:num>
 </w:numbering>
 </file>
@@ -16358,7 +14859,7 @@
     <w:qFormat/>
     <w:rsid w:val="00126A4E"/>
     <w:pPr>
-      <w:spacing w:after="80" w:line="300" w:lineRule="auto"/>
+      <w:spacing w:after="120" w:line="360" w:lineRule="auto"/>
     </w:pPr>
     <w:rPr>
       <w:rFonts w:asciiTheme="majorHAnsi" w:hAnsiTheme="majorHAnsi"/>

</xml_diff>

<commit_message>
docs(report): update AI declaration in report and docs to academic assistant role
</commit_message>
<xml_diff>
--- a/outputs/BaoCao_UrbanLease.docx
+++ b/outputs/BaoCao_UrbanLease.docx
@@ -7904,7 +7904,7 @@
         <w:rPr>
           <w:rFonts w:ascii="Times New Roman" w:hAnsi="Times New Roman"/>
         </w:rPr>
-        <w:t>Trong quá trình thực hiện đồ án, đặc biệt là phần Backend, nhóm có sử dụng ChatGPT và Claude để hỗ trợ tham khảo cách xử lý lỗi, viết một số đoạn code lặp lại (ví dụ script seed dữ liệu mẫu, một số câu query SQLAlchemy) và hỗ trợ trình bày tài liệu. Toàn bộ phần phân tích yêu cầu, thiết kế cơ sở dữ liệu, kiến trúc hệ thống và các quyết định kỹ thuật chính của UrbanLease đều do nhóm tự phân tích và thực hiện; những đoạn code có AI hỗ trợ đều được thành viên kiểm tra, đối chiếu tài liệu chính thức của thư viện và chỉnh sửa trước khi đưa vào dự án.</w:t>
+        <w:t>Trong quá trình thực hiện đồ án, nhóm có sử dụng công cụ ChatGPT (OpenAI) – đóng vai trò "Trợ lý hỗ trợ tra cứu học thuật". Phạm vi sử dụng chủ yếu tập trung vào việc tra cứu và tìm hiểu các khái niệm lý thuyết học thuật (như mô hình kiến trúc RESTful API, nguyên lý xác thực JWT, quy ước mã lỗi HTTP), tham khảo giải thích một số thông báo lỗi cú pháp (syntax debugging) trong quá trình thử nghiệm, cũng như hỗ trợ rà soát câu chữ, định dạng tài liệu.</w:t>
       </w:r>
     </w:p>
     <w:p>
@@ -7916,7 +7916,7 @@
         <w:rPr>
           <w:rFonts w:ascii="Times New Roman" w:hAnsi="Times New Roman"/>
         </w:rPr>
-        <w:t xml:space="preserve">Nhóm không dùng AI để sinh toàn bộ hệ thống rồi đưa thẳng vào dự án: với từng phần việc, nhóm tự xác định Model/Schema/yêu cầu nghiệp vụ trước, sau đó mới nhờ AI hỗ trợ một phần cụ thể, rồi đọc hiểu, đối chiếu tài liệu chính thức và kiểm thử lại trước khi merge. Danh sách công cụ, các prompt tiêu biểu và quy trình kiểm tra kết quả AI được trình bày chi tiết trong tài liệu khai báo sử dụng AI nộp kèm theo đồ án.</w:t>
+        <w:t>Toàn bộ quá trình phân tích bài toán, thiết kế cơ sở dữ liệu quan hệ (ERD và Class Diagram), tổ chức kiến trúc hệ thống và lập trình mã nguồn Backend FastAPI cũng như giao diện Frontend Next.js đều do các thành viên trong nhóm tự nghiên cứu, tự triển khai và kiểm thử hoàn chỉnh.</w:t>
       </w:r>
     </w:p>
     <w:p>

</xml_diff>

<commit_message>
docs(report): format Class Diagram introductory text as normal body paragraph
</commit_message>
<xml_diff>
--- a/outputs/BaoCao_UrbanLease.docx
+++ b/outputs/BaoCao_UrbanLease.docx
@@ -4561,17 +4561,16 @@
     </w:p>
     <w:p>
       <w:pPr>
-        <w:pStyle w:val="Caption"/>
-        <w:spacing w:before="40"/>
+        <w:spacing w:after="50" w:line="283" w:lineRule="auto"/>
+        <w:jc w:val="both"/>
       </w:pPr>
       <w:r>
         <w:rPr>
           <w:rFonts w:ascii="Times New Roman" w:hAnsi="Times New Roman"/>
-          <w:b/>
-          <w:i/>
-          <w:sz w:val="22"/>
-        </w:rPr>
-        <w:t>Hình 2.3 minh họa lại cùng cấu trúc dữ liệu này dưới dạng sơ đồ lớp (class diagram), thể hiện rõ kiểu dữ liệu từng thuộc tính và các lớp enum (VaiTroNguoiDung, TrangThaiTinDang...), thuận tiện khi đối chiếu với code SQLAlchemy model.</w:t>
+          <w:b w:val="0"/>
+          <w:i w:val="0"/>
+        </w:rPr>
+        <w:t>Sơ đồ lớp (Class Diagram) ở Hình 2.3 minh họa lại cấu trúc dữ liệu này, thể hiện rõ kiểu dữ liệu từng thuộc tính và các lớp enum (VaiTroNguoiDung, TrangThaiTinDang...), thuận tiện khi đối chiếu với code SQLAlchemy model.</w:t>
       </w:r>
     </w:p>
     <w:p>

</xml_diff>

<commit_message>
[doc] modify content part 1
gộp nội dung mở đầu và mục 1.1
</commit_message>
<xml_diff>
--- a/outputs/BaoCao_UrbanLease.docx
+++ b/outputs/BaoCao_UrbanLease.docx
@@ -305,6 +305,13 @@
     </w:p>
     <w:sdt>
       <w:sdtPr>
+        <w:rPr>
+          <w:rFonts w:eastAsiaTheme="minorHAnsi" w:cstheme="minorBidi"/>
+          <w:color w:val="000000"/>
+          <w:sz w:val="26"/>
+          <w:szCs w:val="22"/>
+          <w:lang w:val="vi-VN"/>
+        </w:rPr>
         <w:id w:val="1147170949"/>
         <w:docPartObj>
           <w:docPartGallery w:val="Table of Contents"/>
@@ -313,14 +320,9 @@
       </w:sdtPr>
       <w:sdtEndPr>
         <w:rPr>
-          <w:rFonts w:eastAsiaTheme="minorHAnsi" w:cstheme="minorBidi"/>
           <w:b/>
           <w:bCs/>
           <w:noProof/>
-          <w:color w:val="000000"/>
-          <w:sz w:val="26"/>
-          <w:szCs w:val="22"/>
-          <w:lang w:val="vi-VN"/>
         </w:rPr>
       </w:sdtEndPr>
       <w:sdtContent>
@@ -336,7 +338,7 @@
               <w:tab w:val="right" w:leader="dot" w:pos="9061"/>
             </w:tabs>
             <w:rPr>
-              <w:rFonts w:asciiTheme="minorHAnsi" w:eastAsiaTheme="minorEastAsia" w:hAnsiTheme="minorHAnsi"/>
+              <w:rFonts w:ascii="Times New Roman" w:eastAsiaTheme="minorEastAsia" w:hAnsi="Times New Roman" w:cs="Times New Roman"/>
               <w:noProof/>
               <w:color w:val="auto"/>
               <w:kern w:val="2"/>
@@ -346,12 +348,21 @@
             </w:rPr>
           </w:pPr>
           <w:r>
+            <w:rPr>
+              <w:rFonts w:ascii="Times New Roman" w:hAnsi="Times New Roman" w:cs="Times New Roman"/>
+            </w:rPr>
             <w:fldChar w:fldCharType="begin"/>
           </w:r>
           <w:r>
+            <w:rPr>
+              <w:rFonts w:ascii="Times New Roman" w:hAnsi="Times New Roman" w:cs="Times New Roman"/>
+            </w:rPr>
             <w:instrText xml:space="preserve"> TOC \o "1-3" \h \z \u </w:instrText>
           </w:r>
           <w:r>
+            <w:rPr>
+              <w:rFonts w:ascii="Times New Roman" w:hAnsi="Times New Roman" w:cs="Times New Roman"/>
+            </w:rPr>
             <w:fldChar w:fldCharType="separate"/>
           </w:r>
           <w:hyperlink w:anchor="_Toc241327756" w:history="1">
@@ -359,12 +370,15 @@
               <w:rPr>
                 <w:rStyle w:val="Hyperlink"/>
                 <w:rFonts w:ascii="Times New Roman" w:hAnsi="Times New Roman" w:cs="Times New Roman"/>
+                <w:b/>
+                <w:bCs/>
                 <w:noProof/>
               </w:rPr>
               <w:t>MỞ ĐẦU</w:t>
             </w:r>
             <w:r>
               <w:rPr>
+                <w:rFonts w:ascii="Times New Roman" w:hAnsi="Times New Roman" w:cs="Times New Roman"/>
                 <w:noProof/>
                 <w:webHidden/>
               </w:rPr>
@@ -372,6 +386,7 @@
             </w:r>
             <w:r>
               <w:rPr>
+                <w:rFonts w:ascii="Times New Roman" w:hAnsi="Times New Roman" w:cs="Times New Roman"/>
                 <w:noProof/>
                 <w:webHidden/>
               </w:rPr>
@@ -379,6 +394,7 @@
             </w:r>
             <w:r>
               <w:rPr>
+                <w:rFonts w:ascii="Times New Roman" w:hAnsi="Times New Roman" w:cs="Times New Roman"/>
                 <w:noProof/>
                 <w:webHidden/>
               </w:rPr>
@@ -386,12 +402,14 @@
             </w:r>
             <w:r>
               <w:rPr>
+                <w:rFonts w:ascii="Times New Roman" w:hAnsi="Times New Roman" w:cs="Times New Roman"/>
                 <w:noProof/>
                 <w:webHidden/>
               </w:rPr>
             </w:r>
             <w:r>
               <w:rPr>
+                <w:rFonts w:ascii="Times New Roman" w:hAnsi="Times New Roman" w:cs="Times New Roman"/>
                 <w:noProof/>
                 <w:webHidden/>
               </w:rPr>
@@ -399,6 +417,7 @@
             </w:r>
             <w:r>
               <w:rPr>
+                <w:rFonts w:ascii="Times New Roman" w:hAnsi="Times New Roman" w:cs="Times New Roman"/>
                 <w:noProof/>
                 <w:webHidden/>
               </w:rPr>
@@ -406,6 +425,7 @@
             </w:r>
             <w:r>
               <w:rPr>
+                <w:rFonts w:ascii="Times New Roman" w:hAnsi="Times New Roman" w:cs="Times New Roman"/>
                 <w:noProof/>
                 <w:webHidden/>
               </w:rPr>
@@ -421,7 +441,9 @@
               <w:tab w:val="right" w:leader="dot" w:pos="9061"/>
             </w:tabs>
             <w:rPr>
-              <w:rFonts w:asciiTheme="minorHAnsi" w:eastAsiaTheme="minorEastAsia" w:hAnsiTheme="minorHAnsi"/>
+              <w:rFonts w:ascii="Times New Roman" w:eastAsiaTheme="minorEastAsia" w:hAnsi="Times New Roman" w:cs="Times New Roman"/>
+              <w:b/>
+              <w:bCs/>
               <w:noProof/>
               <w:color w:val="auto"/>
               <w:kern w:val="2"/>
@@ -434,13 +456,18 @@
             <w:r>
               <w:rPr>
                 <w:rStyle w:val="Hyperlink"/>
+                <w:rFonts w:ascii="Times New Roman" w:hAnsi="Times New Roman" w:cs="Times New Roman"/>
+                <w:b/>
+                <w:bCs/>
                 <w:noProof/>
               </w:rPr>
               <w:t>Chương 1.</w:t>
             </w:r>
             <w:r>
               <w:rPr>
-                <w:rFonts w:asciiTheme="minorHAnsi" w:eastAsiaTheme="minorEastAsia" w:hAnsiTheme="minorHAnsi"/>
+                <w:rFonts w:ascii="Times New Roman" w:eastAsiaTheme="minorEastAsia" w:hAnsi="Times New Roman" w:cs="Times New Roman"/>
+                <w:b/>
+                <w:bCs/>
                 <w:noProof/>
                 <w:color w:val="auto"/>
                 <w:kern w:val="2"/>
@@ -453,12 +480,18 @@
             <w:r>
               <w:rPr>
                 <w:rStyle w:val="Hyperlink"/>
+                <w:rFonts w:ascii="Times New Roman" w:hAnsi="Times New Roman" w:cs="Times New Roman"/>
+                <w:b/>
+                <w:bCs/>
                 <w:noProof/>
               </w:rPr>
               <w:t>TỔNG QUAN ĐỀ TÀI</w:t>
             </w:r>
             <w:r>
               <w:rPr>
+                <w:rFonts w:ascii="Times New Roman" w:hAnsi="Times New Roman" w:cs="Times New Roman"/>
+                <w:b/>
+                <w:bCs/>
                 <w:noProof/>
                 <w:webHidden/>
               </w:rPr>
@@ -466,6 +499,9 @@
             </w:r>
             <w:r>
               <w:rPr>
+                <w:rFonts w:ascii="Times New Roman" w:hAnsi="Times New Roman" w:cs="Times New Roman"/>
+                <w:b/>
+                <w:bCs/>
                 <w:noProof/>
                 <w:webHidden/>
               </w:rPr>
@@ -473,6 +509,9 @@
             </w:r>
             <w:r>
               <w:rPr>
+                <w:rFonts w:ascii="Times New Roman" w:hAnsi="Times New Roman" w:cs="Times New Roman"/>
+                <w:b/>
+                <w:bCs/>
                 <w:noProof/>
                 <w:webHidden/>
               </w:rPr>
@@ -480,12 +519,18 @@
             </w:r>
             <w:r>
               <w:rPr>
+                <w:rFonts w:ascii="Times New Roman" w:hAnsi="Times New Roman" w:cs="Times New Roman"/>
+                <w:b/>
+                <w:bCs/>
                 <w:noProof/>
                 <w:webHidden/>
               </w:rPr>
             </w:r>
             <w:r>
               <w:rPr>
+                <w:rFonts w:ascii="Times New Roman" w:hAnsi="Times New Roman" w:cs="Times New Roman"/>
+                <w:b/>
+                <w:bCs/>
                 <w:noProof/>
                 <w:webHidden/>
               </w:rPr>
@@ -493,6 +538,9 @@
             </w:r>
             <w:r>
               <w:rPr>
+                <w:rFonts w:ascii="Times New Roman" w:hAnsi="Times New Roman" w:cs="Times New Roman"/>
+                <w:b/>
+                <w:bCs/>
                 <w:noProof/>
                 <w:webHidden/>
               </w:rPr>
@@ -500,6 +548,9 @@
             </w:r>
             <w:r>
               <w:rPr>
+                <w:rFonts w:ascii="Times New Roman" w:hAnsi="Times New Roman" w:cs="Times New Roman"/>
+                <w:b/>
+                <w:bCs/>
                 <w:noProof/>
                 <w:webHidden/>
               </w:rPr>
@@ -515,7 +566,7 @@
               <w:tab w:val="right" w:leader="dot" w:pos="9061"/>
             </w:tabs>
             <w:rPr>
-              <w:rFonts w:asciiTheme="minorHAnsi" w:eastAsiaTheme="minorEastAsia" w:hAnsiTheme="minorHAnsi"/>
+              <w:rFonts w:ascii="Times New Roman" w:eastAsiaTheme="minorEastAsia" w:hAnsi="Times New Roman" w:cs="Times New Roman"/>
               <w:noProof/>
               <w:color w:val="auto"/>
               <w:kern w:val="2"/>
@@ -528,14 +579,14 @@
             <w:r>
               <w:rPr>
                 <w:rStyle w:val="Hyperlink"/>
-                <w:rFonts w:cs="Times New Roman"/>
+                <w:rFonts w:ascii="Times New Roman" w:hAnsi="Times New Roman" w:cs="Times New Roman"/>
                 <w:noProof/>
               </w:rPr>
               <w:t>1.1.</w:t>
             </w:r>
             <w:r>
               <w:rPr>
-                <w:rFonts w:asciiTheme="minorHAnsi" w:eastAsiaTheme="minorEastAsia" w:hAnsiTheme="minorHAnsi"/>
+                <w:rFonts w:ascii="Times New Roman" w:eastAsiaTheme="minorEastAsia" w:hAnsi="Times New Roman" w:cs="Times New Roman"/>
                 <w:noProof/>
                 <w:color w:val="auto"/>
                 <w:kern w:val="2"/>
@@ -548,13 +599,14 @@
             <w:r>
               <w:rPr>
                 <w:rStyle w:val="Hyperlink"/>
-                <w:rFonts w:cs="Times New Roman"/>
+                <w:rFonts w:ascii="Times New Roman" w:hAnsi="Times New Roman" w:cs="Times New Roman"/>
                 <w:noProof/>
               </w:rPr>
               <w:t>Bài toán và mục tiêu</w:t>
             </w:r>
             <w:r>
               <w:rPr>
+                <w:rFonts w:ascii="Times New Roman" w:hAnsi="Times New Roman" w:cs="Times New Roman"/>
                 <w:noProof/>
                 <w:webHidden/>
               </w:rPr>
@@ -562,6 +614,7 @@
             </w:r>
             <w:r>
               <w:rPr>
+                <w:rFonts w:ascii="Times New Roman" w:hAnsi="Times New Roman" w:cs="Times New Roman"/>
                 <w:noProof/>
                 <w:webHidden/>
               </w:rPr>
@@ -569,6 +622,7 @@
             </w:r>
             <w:r>
               <w:rPr>
+                <w:rFonts w:ascii="Times New Roman" w:hAnsi="Times New Roman" w:cs="Times New Roman"/>
                 <w:noProof/>
                 <w:webHidden/>
               </w:rPr>
@@ -576,12 +630,14 @@
             </w:r>
             <w:r>
               <w:rPr>
+                <w:rFonts w:ascii="Times New Roman" w:hAnsi="Times New Roman" w:cs="Times New Roman"/>
                 <w:noProof/>
                 <w:webHidden/>
               </w:rPr>
             </w:r>
             <w:r>
               <w:rPr>
+                <w:rFonts w:ascii="Times New Roman" w:hAnsi="Times New Roman" w:cs="Times New Roman"/>
                 <w:noProof/>
                 <w:webHidden/>
               </w:rPr>
@@ -589,6 +645,7 @@
             </w:r>
             <w:r>
               <w:rPr>
+                <w:rFonts w:ascii="Times New Roman" w:hAnsi="Times New Roman" w:cs="Times New Roman"/>
                 <w:noProof/>
                 <w:webHidden/>
               </w:rPr>
@@ -596,6 +653,7 @@
             </w:r>
             <w:r>
               <w:rPr>
+                <w:rFonts w:ascii="Times New Roman" w:hAnsi="Times New Roman" w:cs="Times New Roman"/>
                 <w:noProof/>
                 <w:webHidden/>
               </w:rPr>
@@ -611,7 +669,7 @@
               <w:tab w:val="right" w:leader="dot" w:pos="9061"/>
             </w:tabs>
             <w:rPr>
-              <w:rFonts w:asciiTheme="minorHAnsi" w:eastAsiaTheme="minorEastAsia" w:hAnsiTheme="minorHAnsi"/>
+              <w:rFonts w:ascii="Times New Roman" w:eastAsiaTheme="minorEastAsia" w:hAnsi="Times New Roman" w:cs="Times New Roman"/>
               <w:noProof/>
               <w:color w:val="auto"/>
               <w:kern w:val="2"/>
@@ -624,14 +682,14 @@
             <w:r>
               <w:rPr>
                 <w:rStyle w:val="Hyperlink"/>
-                <w:rFonts w:cs="Times New Roman"/>
+                <w:rFonts w:ascii="Times New Roman" w:hAnsi="Times New Roman" w:cs="Times New Roman"/>
                 <w:noProof/>
               </w:rPr>
               <w:t>1.2.</w:t>
             </w:r>
             <w:r>
               <w:rPr>
-                <w:rFonts w:asciiTheme="minorHAnsi" w:eastAsiaTheme="minorEastAsia" w:hAnsiTheme="minorHAnsi"/>
+                <w:rFonts w:ascii="Times New Roman" w:eastAsiaTheme="minorEastAsia" w:hAnsi="Times New Roman" w:cs="Times New Roman"/>
                 <w:noProof/>
                 <w:color w:val="auto"/>
                 <w:kern w:val="2"/>
@@ -644,13 +702,14 @@
             <w:r>
               <w:rPr>
                 <w:rStyle w:val="Hyperlink"/>
-                <w:rFonts w:cs="Times New Roman"/>
+                <w:rFonts w:ascii="Times New Roman" w:hAnsi="Times New Roman" w:cs="Times New Roman"/>
                 <w:noProof/>
               </w:rPr>
               <w:t>Đối tượng người dùng và phạm vi chức năng</w:t>
             </w:r>
             <w:r>
               <w:rPr>
+                <w:rFonts w:ascii="Times New Roman" w:hAnsi="Times New Roman" w:cs="Times New Roman"/>
                 <w:noProof/>
                 <w:webHidden/>
               </w:rPr>
@@ -658,6 +717,7 @@
             </w:r>
             <w:r>
               <w:rPr>
+                <w:rFonts w:ascii="Times New Roman" w:hAnsi="Times New Roman" w:cs="Times New Roman"/>
                 <w:noProof/>
                 <w:webHidden/>
               </w:rPr>
@@ -665,6 +725,7 @@
             </w:r>
             <w:r>
               <w:rPr>
+                <w:rFonts w:ascii="Times New Roman" w:hAnsi="Times New Roman" w:cs="Times New Roman"/>
                 <w:noProof/>
                 <w:webHidden/>
               </w:rPr>
@@ -672,12 +733,14 @@
             </w:r>
             <w:r>
               <w:rPr>
+                <w:rFonts w:ascii="Times New Roman" w:hAnsi="Times New Roman" w:cs="Times New Roman"/>
                 <w:noProof/>
                 <w:webHidden/>
               </w:rPr>
             </w:r>
             <w:r>
               <w:rPr>
+                <w:rFonts w:ascii="Times New Roman" w:hAnsi="Times New Roman" w:cs="Times New Roman"/>
                 <w:noProof/>
                 <w:webHidden/>
               </w:rPr>
@@ -685,6 +748,7 @@
             </w:r>
             <w:r>
               <w:rPr>
+                <w:rFonts w:ascii="Times New Roman" w:hAnsi="Times New Roman" w:cs="Times New Roman"/>
                 <w:noProof/>
                 <w:webHidden/>
               </w:rPr>
@@ -692,6 +756,7 @@
             </w:r>
             <w:r>
               <w:rPr>
+                <w:rFonts w:ascii="Times New Roman" w:hAnsi="Times New Roman" w:cs="Times New Roman"/>
                 <w:noProof/>
                 <w:webHidden/>
               </w:rPr>
@@ -707,7 +772,7 @@
               <w:tab w:val="right" w:leader="dot" w:pos="9061"/>
             </w:tabs>
             <w:rPr>
-              <w:rFonts w:asciiTheme="minorHAnsi" w:eastAsiaTheme="minorEastAsia" w:hAnsiTheme="minorHAnsi"/>
+              <w:rFonts w:ascii="Times New Roman" w:eastAsiaTheme="minorEastAsia" w:hAnsi="Times New Roman" w:cs="Times New Roman"/>
               <w:noProof/>
               <w:color w:val="auto"/>
               <w:kern w:val="2"/>
@@ -720,14 +785,14 @@
             <w:r>
               <w:rPr>
                 <w:rStyle w:val="Hyperlink"/>
-                <w:rFonts w:cs="Times New Roman"/>
+                <w:rFonts w:ascii="Times New Roman" w:hAnsi="Times New Roman" w:cs="Times New Roman"/>
                 <w:noProof/>
               </w:rPr>
               <w:t>1.3.</w:t>
             </w:r>
             <w:r>
               <w:rPr>
-                <w:rFonts w:asciiTheme="minorHAnsi" w:eastAsiaTheme="minorEastAsia" w:hAnsiTheme="minorHAnsi"/>
+                <w:rFonts w:ascii="Times New Roman" w:eastAsiaTheme="minorEastAsia" w:hAnsi="Times New Roman" w:cs="Times New Roman"/>
                 <w:noProof/>
                 <w:color w:val="auto"/>
                 <w:kern w:val="2"/>
@@ -740,13 +805,14 @@
             <w:r>
               <w:rPr>
                 <w:rStyle w:val="Hyperlink"/>
-                <w:rFonts w:cs="Times New Roman"/>
+                <w:rFonts w:ascii="Times New Roman" w:hAnsi="Times New Roman" w:cs="Times New Roman"/>
                 <w:noProof/>
               </w:rPr>
               <w:t>Công nghệ sử dụng</w:t>
             </w:r>
             <w:r>
               <w:rPr>
+                <w:rFonts w:ascii="Times New Roman" w:hAnsi="Times New Roman" w:cs="Times New Roman"/>
                 <w:noProof/>
                 <w:webHidden/>
               </w:rPr>
@@ -754,6 +820,7 @@
             </w:r>
             <w:r>
               <w:rPr>
+                <w:rFonts w:ascii="Times New Roman" w:hAnsi="Times New Roman" w:cs="Times New Roman"/>
                 <w:noProof/>
                 <w:webHidden/>
               </w:rPr>
@@ -761,6 +828,7 @@
             </w:r>
             <w:r>
               <w:rPr>
+                <w:rFonts w:ascii="Times New Roman" w:hAnsi="Times New Roman" w:cs="Times New Roman"/>
                 <w:noProof/>
                 <w:webHidden/>
               </w:rPr>
@@ -768,12 +836,14 @@
             </w:r>
             <w:r>
               <w:rPr>
+                <w:rFonts w:ascii="Times New Roman" w:hAnsi="Times New Roman" w:cs="Times New Roman"/>
                 <w:noProof/>
                 <w:webHidden/>
               </w:rPr>
             </w:r>
             <w:r>
               <w:rPr>
+                <w:rFonts w:ascii="Times New Roman" w:hAnsi="Times New Roman" w:cs="Times New Roman"/>
                 <w:noProof/>
                 <w:webHidden/>
               </w:rPr>
@@ -781,6 +851,7 @@
             </w:r>
             <w:r>
               <w:rPr>
+                <w:rFonts w:ascii="Times New Roman" w:hAnsi="Times New Roman" w:cs="Times New Roman"/>
                 <w:noProof/>
                 <w:webHidden/>
               </w:rPr>
@@ -788,6 +859,7 @@
             </w:r>
             <w:r>
               <w:rPr>
+                <w:rFonts w:ascii="Times New Roman" w:hAnsi="Times New Roman" w:cs="Times New Roman"/>
                 <w:noProof/>
                 <w:webHidden/>
               </w:rPr>
@@ -803,7 +875,9 @@
               <w:tab w:val="right" w:leader="dot" w:pos="9061"/>
             </w:tabs>
             <w:rPr>
-              <w:rFonts w:asciiTheme="minorHAnsi" w:eastAsiaTheme="minorEastAsia" w:hAnsiTheme="minorHAnsi"/>
+              <w:rFonts w:ascii="Times New Roman" w:eastAsiaTheme="minorEastAsia" w:hAnsi="Times New Roman" w:cs="Times New Roman"/>
+              <w:b/>
+              <w:bCs/>
               <w:noProof/>
               <w:color w:val="auto"/>
               <w:kern w:val="2"/>
@@ -816,13 +890,18 @@
             <w:r>
               <w:rPr>
                 <w:rStyle w:val="Hyperlink"/>
+                <w:rFonts w:ascii="Times New Roman" w:hAnsi="Times New Roman" w:cs="Times New Roman"/>
+                <w:b/>
+                <w:bCs/>
                 <w:noProof/>
               </w:rPr>
               <w:t>Chương 2.</w:t>
             </w:r>
             <w:r>
               <w:rPr>
-                <w:rFonts w:asciiTheme="minorHAnsi" w:eastAsiaTheme="minorEastAsia" w:hAnsiTheme="minorHAnsi"/>
+                <w:rFonts w:ascii="Times New Roman" w:eastAsiaTheme="minorEastAsia" w:hAnsi="Times New Roman" w:cs="Times New Roman"/>
+                <w:b/>
+                <w:bCs/>
                 <w:noProof/>
                 <w:color w:val="auto"/>
                 <w:kern w:val="2"/>
@@ -835,12 +914,18 @@
             <w:r>
               <w:rPr>
                 <w:rStyle w:val="Hyperlink"/>
+                <w:rFonts w:ascii="Times New Roman" w:hAnsi="Times New Roman" w:cs="Times New Roman"/>
+                <w:b/>
+                <w:bCs/>
                 <w:noProof/>
               </w:rPr>
               <w:t>PHÂN TÍCH VÀ THIẾT KẾ HỆ THỐNG</w:t>
             </w:r>
             <w:r>
               <w:rPr>
+                <w:rFonts w:ascii="Times New Roman" w:hAnsi="Times New Roman" w:cs="Times New Roman"/>
+                <w:b/>
+                <w:bCs/>
                 <w:noProof/>
                 <w:webHidden/>
               </w:rPr>
@@ -848,6 +933,9 @@
             </w:r>
             <w:r>
               <w:rPr>
+                <w:rFonts w:ascii="Times New Roman" w:hAnsi="Times New Roman" w:cs="Times New Roman"/>
+                <w:b/>
+                <w:bCs/>
                 <w:noProof/>
                 <w:webHidden/>
               </w:rPr>
@@ -855,6 +943,9 @@
             </w:r>
             <w:r>
               <w:rPr>
+                <w:rFonts w:ascii="Times New Roman" w:hAnsi="Times New Roman" w:cs="Times New Roman"/>
+                <w:b/>
+                <w:bCs/>
                 <w:noProof/>
                 <w:webHidden/>
               </w:rPr>
@@ -862,12 +953,18 @@
             </w:r>
             <w:r>
               <w:rPr>
+                <w:rFonts w:ascii="Times New Roman" w:hAnsi="Times New Roman" w:cs="Times New Roman"/>
+                <w:b/>
+                <w:bCs/>
                 <w:noProof/>
                 <w:webHidden/>
               </w:rPr>
             </w:r>
             <w:r>
               <w:rPr>
+                <w:rFonts w:ascii="Times New Roman" w:hAnsi="Times New Roman" w:cs="Times New Roman"/>
+                <w:b/>
+                <w:bCs/>
                 <w:noProof/>
                 <w:webHidden/>
               </w:rPr>
@@ -875,6 +972,9 @@
             </w:r>
             <w:r>
               <w:rPr>
+                <w:rFonts w:ascii="Times New Roman" w:hAnsi="Times New Roman" w:cs="Times New Roman"/>
+                <w:b/>
+                <w:bCs/>
                 <w:noProof/>
                 <w:webHidden/>
               </w:rPr>
@@ -882,6 +982,9 @@
             </w:r>
             <w:r>
               <w:rPr>
+                <w:rFonts w:ascii="Times New Roman" w:hAnsi="Times New Roman" w:cs="Times New Roman"/>
+                <w:b/>
+                <w:bCs/>
                 <w:noProof/>
                 <w:webHidden/>
               </w:rPr>
@@ -897,7 +1000,7 @@
               <w:tab w:val="right" w:leader="dot" w:pos="9061"/>
             </w:tabs>
             <w:rPr>
-              <w:rFonts w:asciiTheme="minorHAnsi" w:eastAsiaTheme="minorEastAsia" w:hAnsiTheme="minorHAnsi"/>
+              <w:rFonts w:ascii="Times New Roman" w:eastAsiaTheme="minorEastAsia" w:hAnsi="Times New Roman" w:cs="Times New Roman"/>
               <w:noProof/>
               <w:color w:val="auto"/>
               <w:kern w:val="2"/>
@@ -910,14 +1013,14 @@
             <w:r>
               <w:rPr>
                 <w:rStyle w:val="Hyperlink"/>
-                <w:rFonts w:cs="Times New Roman"/>
+                <w:rFonts w:ascii="Times New Roman" w:hAnsi="Times New Roman" w:cs="Times New Roman"/>
                 <w:noProof/>
               </w:rPr>
               <w:t>2.1.</w:t>
             </w:r>
             <w:r>
               <w:rPr>
-                <w:rFonts w:asciiTheme="minorHAnsi" w:eastAsiaTheme="minorEastAsia" w:hAnsiTheme="minorHAnsi"/>
+                <w:rFonts w:ascii="Times New Roman" w:eastAsiaTheme="minorEastAsia" w:hAnsi="Times New Roman" w:cs="Times New Roman"/>
                 <w:noProof/>
                 <w:color w:val="auto"/>
                 <w:kern w:val="2"/>
@@ -930,13 +1033,14 @@
             <w:r>
               <w:rPr>
                 <w:rStyle w:val="Hyperlink"/>
-                <w:rFonts w:cs="Times New Roman"/>
+                <w:rFonts w:ascii="Times New Roman" w:hAnsi="Times New Roman" w:cs="Times New Roman"/>
                 <w:noProof/>
               </w:rPr>
               <w:t>Yêu cầu chức năng chi tiết</w:t>
             </w:r>
             <w:r>
               <w:rPr>
+                <w:rFonts w:ascii="Times New Roman" w:hAnsi="Times New Roman" w:cs="Times New Roman"/>
                 <w:noProof/>
                 <w:webHidden/>
               </w:rPr>
@@ -944,6 +1048,7 @@
             </w:r>
             <w:r>
               <w:rPr>
+                <w:rFonts w:ascii="Times New Roman" w:hAnsi="Times New Roman" w:cs="Times New Roman"/>
                 <w:noProof/>
                 <w:webHidden/>
               </w:rPr>
@@ -951,6 +1056,7 @@
             </w:r>
             <w:r>
               <w:rPr>
+                <w:rFonts w:ascii="Times New Roman" w:hAnsi="Times New Roman" w:cs="Times New Roman"/>
                 <w:noProof/>
                 <w:webHidden/>
               </w:rPr>
@@ -958,12 +1064,14 @@
             </w:r>
             <w:r>
               <w:rPr>
+                <w:rFonts w:ascii="Times New Roman" w:hAnsi="Times New Roman" w:cs="Times New Roman"/>
                 <w:noProof/>
                 <w:webHidden/>
               </w:rPr>
             </w:r>
             <w:r>
               <w:rPr>
+                <w:rFonts w:ascii="Times New Roman" w:hAnsi="Times New Roman" w:cs="Times New Roman"/>
                 <w:noProof/>
                 <w:webHidden/>
               </w:rPr>
@@ -971,6 +1079,7 @@
             </w:r>
             <w:r>
               <w:rPr>
+                <w:rFonts w:ascii="Times New Roman" w:hAnsi="Times New Roman" w:cs="Times New Roman"/>
                 <w:noProof/>
                 <w:webHidden/>
               </w:rPr>
@@ -978,6 +1087,7 @@
             </w:r>
             <w:r>
               <w:rPr>
+                <w:rFonts w:ascii="Times New Roman" w:hAnsi="Times New Roman" w:cs="Times New Roman"/>
                 <w:noProof/>
                 <w:webHidden/>
               </w:rPr>
@@ -993,7 +1103,7 @@
               <w:tab w:val="right" w:leader="dot" w:pos="9061"/>
             </w:tabs>
             <w:rPr>
-              <w:rFonts w:asciiTheme="minorHAnsi" w:eastAsiaTheme="minorEastAsia" w:hAnsiTheme="minorHAnsi"/>
+              <w:rFonts w:ascii="Times New Roman" w:eastAsiaTheme="minorEastAsia" w:hAnsi="Times New Roman" w:cs="Times New Roman"/>
               <w:noProof/>
               <w:color w:val="auto"/>
               <w:kern w:val="2"/>
@@ -1006,14 +1116,14 @@
             <w:r>
               <w:rPr>
                 <w:rStyle w:val="Hyperlink"/>
-                <w:rFonts w:cs="Times New Roman"/>
+                <w:rFonts w:ascii="Times New Roman" w:hAnsi="Times New Roman" w:cs="Times New Roman"/>
                 <w:noProof/>
               </w:rPr>
               <w:t>2.2.</w:t>
             </w:r>
             <w:r>
               <w:rPr>
-                <w:rFonts w:asciiTheme="minorHAnsi" w:eastAsiaTheme="minorEastAsia" w:hAnsiTheme="minorHAnsi"/>
+                <w:rFonts w:ascii="Times New Roman" w:eastAsiaTheme="minorEastAsia" w:hAnsi="Times New Roman" w:cs="Times New Roman"/>
                 <w:noProof/>
                 <w:color w:val="auto"/>
                 <w:kern w:val="2"/>
@@ -1026,13 +1136,14 @@
             <w:r>
               <w:rPr>
                 <w:rStyle w:val="Hyperlink"/>
-                <w:rFonts w:cs="Times New Roman"/>
+                <w:rFonts w:ascii="Times New Roman" w:hAnsi="Times New Roman" w:cs="Times New Roman"/>
                 <w:noProof/>
               </w:rPr>
               <w:t>Kiến trúc hệ thống</w:t>
             </w:r>
             <w:r>
               <w:rPr>
+                <w:rFonts w:ascii="Times New Roman" w:hAnsi="Times New Roman" w:cs="Times New Roman"/>
                 <w:noProof/>
                 <w:webHidden/>
               </w:rPr>
@@ -1040,6 +1151,7 @@
             </w:r>
             <w:r>
               <w:rPr>
+                <w:rFonts w:ascii="Times New Roman" w:hAnsi="Times New Roman" w:cs="Times New Roman"/>
                 <w:noProof/>
                 <w:webHidden/>
               </w:rPr>
@@ -1047,6 +1159,7 @@
             </w:r>
             <w:r>
               <w:rPr>
+                <w:rFonts w:ascii="Times New Roman" w:hAnsi="Times New Roman" w:cs="Times New Roman"/>
                 <w:noProof/>
                 <w:webHidden/>
               </w:rPr>
@@ -1054,12 +1167,14 @@
             </w:r>
             <w:r>
               <w:rPr>
+                <w:rFonts w:ascii="Times New Roman" w:hAnsi="Times New Roman" w:cs="Times New Roman"/>
                 <w:noProof/>
                 <w:webHidden/>
               </w:rPr>
             </w:r>
             <w:r>
               <w:rPr>
+                <w:rFonts w:ascii="Times New Roman" w:hAnsi="Times New Roman" w:cs="Times New Roman"/>
                 <w:noProof/>
                 <w:webHidden/>
               </w:rPr>
@@ -1067,6 +1182,7 @@
             </w:r>
             <w:r>
               <w:rPr>
+                <w:rFonts w:ascii="Times New Roman" w:hAnsi="Times New Roman" w:cs="Times New Roman"/>
                 <w:noProof/>
                 <w:webHidden/>
               </w:rPr>
@@ -1074,6 +1190,7 @@
             </w:r>
             <w:r>
               <w:rPr>
+                <w:rFonts w:ascii="Times New Roman" w:hAnsi="Times New Roman" w:cs="Times New Roman"/>
                 <w:noProof/>
                 <w:webHidden/>
               </w:rPr>
@@ -1089,7 +1206,7 @@
               <w:tab w:val="right" w:leader="dot" w:pos="9061"/>
             </w:tabs>
             <w:rPr>
-              <w:rFonts w:asciiTheme="minorHAnsi" w:eastAsiaTheme="minorEastAsia" w:hAnsiTheme="minorHAnsi"/>
+              <w:rFonts w:ascii="Times New Roman" w:eastAsiaTheme="minorEastAsia" w:hAnsi="Times New Roman" w:cs="Times New Roman"/>
               <w:noProof/>
               <w:color w:val="auto"/>
               <w:kern w:val="2"/>
@@ -1102,14 +1219,14 @@
             <w:r>
               <w:rPr>
                 <w:rStyle w:val="Hyperlink"/>
-                <w:rFonts w:cs="Times New Roman"/>
+                <w:rFonts w:ascii="Times New Roman" w:hAnsi="Times New Roman" w:cs="Times New Roman"/>
                 <w:noProof/>
               </w:rPr>
               <w:t>2.2.1.</w:t>
             </w:r>
             <w:r>
               <w:rPr>
-                <w:rFonts w:asciiTheme="minorHAnsi" w:eastAsiaTheme="minorEastAsia" w:hAnsiTheme="minorHAnsi"/>
+                <w:rFonts w:ascii="Times New Roman" w:eastAsiaTheme="minorEastAsia" w:hAnsi="Times New Roman" w:cs="Times New Roman"/>
                 <w:noProof/>
                 <w:color w:val="auto"/>
                 <w:kern w:val="2"/>
@@ -1122,7 +1239,7 @@
             <w:r>
               <w:rPr>
                 <w:rStyle w:val="Hyperlink"/>
-                <w:rFonts w:cs="Times New Roman"/>
+                <w:rFonts w:ascii="Times New Roman" w:hAnsi="Times New Roman" w:cs="Times New Roman"/>
                 <w:i/>
                 <w:noProof/>
               </w:rPr>
@@ -1130,6 +1247,7 @@
             </w:r>
             <w:r>
               <w:rPr>
+                <w:rFonts w:ascii="Times New Roman" w:hAnsi="Times New Roman" w:cs="Times New Roman"/>
                 <w:noProof/>
                 <w:webHidden/>
               </w:rPr>
@@ -1137,6 +1255,7 @@
             </w:r>
             <w:r>
               <w:rPr>
+                <w:rFonts w:ascii="Times New Roman" w:hAnsi="Times New Roman" w:cs="Times New Roman"/>
                 <w:noProof/>
                 <w:webHidden/>
               </w:rPr>
@@ -1144,6 +1263,7 @@
             </w:r>
             <w:r>
               <w:rPr>
+                <w:rFonts w:ascii="Times New Roman" w:hAnsi="Times New Roman" w:cs="Times New Roman"/>
                 <w:noProof/>
                 <w:webHidden/>
               </w:rPr>
@@ -1151,12 +1271,14 @@
             </w:r>
             <w:r>
               <w:rPr>
+                <w:rFonts w:ascii="Times New Roman" w:hAnsi="Times New Roman" w:cs="Times New Roman"/>
                 <w:noProof/>
                 <w:webHidden/>
               </w:rPr>
             </w:r>
             <w:r>
               <w:rPr>
+                <w:rFonts w:ascii="Times New Roman" w:hAnsi="Times New Roman" w:cs="Times New Roman"/>
                 <w:noProof/>
                 <w:webHidden/>
               </w:rPr>
@@ -1164,6 +1286,7 @@
             </w:r>
             <w:r>
               <w:rPr>
+                <w:rFonts w:ascii="Times New Roman" w:hAnsi="Times New Roman" w:cs="Times New Roman"/>
                 <w:noProof/>
                 <w:webHidden/>
               </w:rPr>
@@ -1171,6 +1294,7 @@
             </w:r>
             <w:r>
               <w:rPr>
+                <w:rFonts w:ascii="Times New Roman" w:hAnsi="Times New Roman" w:cs="Times New Roman"/>
                 <w:noProof/>
                 <w:webHidden/>
               </w:rPr>
@@ -1186,7 +1310,7 @@
               <w:tab w:val="right" w:leader="dot" w:pos="9061"/>
             </w:tabs>
             <w:rPr>
-              <w:rFonts w:asciiTheme="minorHAnsi" w:eastAsiaTheme="minorEastAsia" w:hAnsiTheme="minorHAnsi"/>
+              <w:rFonts w:ascii="Times New Roman" w:eastAsiaTheme="minorEastAsia" w:hAnsi="Times New Roman" w:cs="Times New Roman"/>
               <w:noProof/>
               <w:color w:val="auto"/>
               <w:kern w:val="2"/>
@@ -1199,14 +1323,14 @@
             <w:r>
               <w:rPr>
                 <w:rStyle w:val="Hyperlink"/>
-                <w:rFonts w:cs="Times New Roman"/>
+                <w:rFonts w:ascii="Times New Roman" w:hAnsi="Times New Roman" w:cs="Times New Roman"/>
                 <w:noProof/>
               </w:rPr>
               <w:t>2.2.2.</w:t>
             </w:r>
             <w:r>
               <w:rPr>
-                <w:rFonts w:asciiTheme="minorHAnsi" w:eastAsiaTheme="minorEastAsia" w:hAnsiTheme="minorHAnsi"/>
+                <w:rFonts w:ascii="Times New Roman" w:eastAsiaTheme="minorEastAsia" w:hAnsi="Times New Roman" w:cs="Times New Roman"/>
                 <w:noProof/>
                 <w:color w:val="auto"/>
                 <w:kern w:val="2"/>
@@ -1219,7 +1343,7 @@
             <w:r>
               <w:rPr>
                 <w:rStyle w:val="Hyperlink"/>
-                <w:rFonts w:cs="Times New Roman"/>
+                <w:rFonts w:ascii="Times New Roman" w:hAnsi="Times New Roman" w:cs="Times New Roman"/>
                 <w:i/>
                 <w:noProof/>
               </w:rPr>
@@ -1227,6 +1351,7 @@
             </w:r>
             <w:r>
               <w:rPr>
+                <w:rFonts w:ascii="Times New Roman" w:hAnsi="Times New Roman" w:cs="Times New Roman"/>
                 <w:noProof/>
                 <w:webHidden/>
               </w:rPr>
@@ -1234,6 +1359,7 @@
             </w:r>
             <w:r>
               <w:rPr>
+                <w:rFonts w:ascii="Times New Roman" w:hAnsi="Times New Roman" w:cs="Times New Roman"/>
                 <w:noProof/>
                 <w:webHidden/>
               </w:rPr>
@@ -1241,6 +1367,7 @@
             </w:r>
             <w:r>
               <w:rPr>
+                <w:rFonts w:ascii="Times New Roman" w:hAnsi="Times New Roman" w:cs="Times New Roman"/>
                 <w:noProof/>
                 <w:webHidden/>
               </w:rPr>
@@ -1248,12 +1375,14 @@
             </w:r>
             <w:r>
               <w:rPr>
+                <w:rFonts w:ascii="Times New Roman" w:hAnsi="Times New Roman" w:cs="Times New Roman"/>
                 <w:noProof/>
                 <w:webHidden/>
               </w:rPr>
             </w:r>
             <w:r>
               <w:rPr>
+                <w:rFonts w:ascii="Times New Roman" w:hAnsi="Times New Roman" w:cs="Times New Roman"/>
                 <w:noProof/>
                 <w:webHidden/>
               </w:rPr>
@@ -1261,6 +1390,7 @@
             </w:r>
             <w:r>
               <w:rPr>
+                <w:rFonts w:ascii="Times New Roman" w:hAnsi="Times New Roman" w:cs="Times New Roman"/>
                 <w:noProof/>
                 <w:webHidden/>
               </w:rPr>
@@ -1268,6 +1398,7 @@
             </w:r>
             <w:r>
               <w:rPr>
+                <w:rFonts w:ascii="Times New Roman" w:hAnsi="Times New Roman" w:cs="Times New Roman"/>
                 <w:noProof/>
                 <w:webHidden/>
               </w:rPr>
@@ -1283,7 +1414,7 @@
               <w:tab w:val="right" w:leader="dot" w:pos="9061"/>
             </w:tabs>
             <w:rPr>
-              <w:rFonts w:asciiTheme="minorHAnsi" w:eastAsiaTheme="minorEastAsia" w:hAnsiTheme="minorHAnsi"/>
+              <w:rFonts w:ascii="Times New Roman" w:eastAsiaTheme="minorEastAsia" w:hAnsi="Times New Roman" w:cs="Times New Roman"/>
               <w:noProof/>
               <w:color w:val="auto"/>
               <w:kern w:val="2"/>
@@ -1296,14 +1427,14 @@
             <w:r>
               <w:rPr>
                 <w:rStyle w:val="Hyperlink"/>
-                <w:rFonts w:cs="Times New Roman"/>
+                <w:rFonts w:ascii="Times New Roman" w:hAnsi="Times New Roman" w:cs="Times New Roman"/>
                 <w:noProof/>
               </w:rPr>
               <w:t>2.3.</w:t>
             </w:r>
             <w:r>
               <w:rPr>
-                <w:rFonts w:asciiTheme="minorHAnsi" w:eastAsiaTheme="minorEastAsia" w:hAnsiTheme="minorHAnsi"/>
+                <w:rFonts w:ascii="Times New Roman" w:eastAsiaTheme="minorEastAsia" w:hAnsi="Times New Roman" w:cs="Times New Roman"/>
                 <w:noProof/>
                 <w:color w:val="auto"/>
                 <w:kern w:val="2"/>
@@ -1316,13 +1447,14 @@
             <w:r>
               <w:rPr>
                 <w:rStyle w:val="Hyperlink"/>
-                <w:rFonts w:cs="Times New Roman"/>
+                <w:rFonts w:ascii="Times New Roman" w:hAnsi="Times New Roman" w:cs="Times New Roman"/>
                 <w:noProof/>
               </w:rPr>
               <w:t>Thiết kế cơ sở dữ liệu</w:t>
             </w:r>
             <w:r>
               <w:rPr>
+                <w:rFonts w:ascii="Times New Roman" w:hAnsi="Times New Roman" w:cs="Times New Roman"/>
                 <w:noProof/>
                 <w:webHidden/>
               </w:rPr>
@@ -1330,6 +1462,7 @@
             </w:r>
             <w:r>
               <w:rPr>
+                <w:rFonts w:ascii="Times New Roman" w:hAnsi="Times New Roman" w:cs="Times New Roman"/>
                 <w:noProof/>
                 <w:webHidden/>
               </w:rPr>
@@ -1337,6 +1470,7 @@
             </w:r>
             <w:r>
               <w:rPr>
+                <w:rFonts w:ascii="Times New Roman" w:hAnsi="Times New Roman" w:cs="Times New Roman"/>
                 <w:noProof/>
                 <w:webHidden/>
               </w:rPr>
@@ -1344,12 +1478,14 @@
             </w:r>
             <w:r>
               <w:rPr>
+                <w:rFonts w:ascii="Times New Roman" w:hAnsi="Times New Roman" w:cs="Times New Roman"/>
                 <w:noProof/>
                 <w:webHidden/>
               </w:rPr>
             </w:r>
             <w:r>
               <w:rPr>
+                <w:rFonts w:ascii="Times New Roman" w:hAnsi="Times New Roman" w:cs="Times New Roman"/>
                 <w:noProof/>
                 <w:webHidden/>
               </w:rPr>
@@ -1357,6 +1493,7 @@
             </w:r>
             <w:r>
               <w:rPr>
+                <w:rFonts w:ascii="Times New Roman" w:hAnsi="Times New Roman" w:cs="Times New Roman"/>
                 <w:noProof/>
                 <w:webHidden/>
               </w:rPr>
@@ -1364,6 +1501,7 @@
             </w:r>
             <w:r>
               <w:rPr>
+                <w:rFonts w:ascii="Times New Roman" w:hAnsi="Times New Roman" w:cs="Times New Roman"/>
                 <w:noProof/>
                 <w:webHidden/>
               </w:rPr>
@@ -1379,7 +1517,7 @@
               <w:tab w:val="right" w:leader="dot" w:pos="9061"/>
             </w:tabs>
             <w:rPr>
-              <w:rFonts w:asciiTheme="minorHAnsi" w:eastAsiaTheme="minorEastAsia" w:hAnsiTheme="minorHAnsi"/>
+              <w:rFonts w:ascii="Times New Roman" w:eastAsiaTheme="minorEastAsia" w:hAnsi="Times New Roman" w:cs="Times New Roman"/>
               <w:noProof/>
               <w:color w:val="auto"/>
               <w:kern w:val="2"/>
@@ -1392,14 +1530,14 @@
             <w:r>
               <w:rPr>
                 <w:rStyle w:val="Hyperlink"/>
-                <w:rFonts w:cs="Times New Roman"/>
+                <w:rFonts w:ascii="Times New Roman" w:hAnsi="Times New Roman" w:cs="Times New Roman"/>
                 <w:noProof/>
               </w:rPr>
               <w:t>2.4.</w:t>
             </w:r>
             <w:r>
               <w:rPr>
-                <w:rFonts w:asciiTheme="minorHAnsi" w:eastAsiaTheme="minorEastAsia" w:hAnsiTheme="minorHAnsi"/>
+                <w:rFonts w:ascii="Times New Roman" w:eastAsiaTheme="minorEastAsia" w:hAnsi="Times New Roman" w:cs="Times New Roman"/>
                 <w:noProof/>
                 <w:color w:val="auto"/>
                 <w:kern w:val="2"/>
@@ -1412,13 +1550,14 @@
             <w:r>
               <w:rPr>
                 <w:rStyle w:val="Hyperlink"/>
-                <w:rFonts w:cs="Times New Roman"/>
+                <w:rFonts w:ascii="Times New Roman" w:hAnsi="Times New Roman" w:cs="Times New Roman"/>
                 <w:noProof/>
               </w:rPr>
               <w:t>Thiết kế API tiêu biểu</w:t>
             </w:r>
             <w:r>
               <w:rPr>
+                <w:rFonts w:ascii="Times New Roman" w:hAnsi="Times New Roman" w:cs="Times New Roman"/>
                 <w:noProof/>
                 <w:webHidden/>
               </w:rPr>
@@ -1426,6 +1565,7 @@
             </w:r>
             <w:r>
               <w:rPr>
+                <w:rFonts w:ascii="Times New Roman" w:hAnsi="Times New Roman" w:cs="Times New Roman"/>
                 <w:noProof/>
                 <w:webHidden/>
               </w:rPr>
@@ -1433,6 +1573,7 @@
             </w:r>
             <w:r>
               <w:rPr>
+                <w:rFonts w:ascii="Times New Roman" w:hAnsi="Times New Roman" w:cs="Times New Roman"/>
                 <w:noProof/>
                 <w:webHidden/>
               </w:rPr>
@@ -1440,12 +1581,14 @@
             </w:r>
             <w:r>
               <w:rPr>
+                <w:rFonts w:ascii="Times New Roman" w:hAnsi="Times New Roman" w:cs="Times New Roman"/>
                 <w:noProof/>
                 <w:webHidden/>
               </w:rPr>
             </w:r>
             <w:r>
               <w:rPr>
+                <w:rFonts w:ascii="Times New Roman" w:hAnsi="Times New Roman" w:cs="Times New Roman"/>
                 <w:noProof/>
                 <w:webHidden/>
               </w:rPr>
@@ -1453,6 +1596,7 @@
             </w:r>
             <w:r>
               <w:rPr>
+                <w:rFonts w:ascii="Times New Roman" w:hAnsi="Times New Roman" w:cs="Times New Roman"/>
                 <w:noProof/>
                 <w:webHidden/>
               </w:rPr>
@@ -1460,6 +1604,7 @@
             </w:r>
             <w:r>
               <w:rPr>
+                <w:rFonts w:ascii="Times New Roman" w:hAnsi="Times New Roman" w:cs="Times New Roman"/>
                 <w:noProof/>
                 <w:webHidden/>
               </w:rPr>
@@ -1475,7 +1620,7 @@
               <w:tab w:val="right" w:leader="dot" w:pos="9061"/>
             </w:tabs>
             <w:rPr>
-              <w:rFonts w:asciiTheme="minorHAnsi" w:eastAsiaTheme="minorEastAsia" w:hAnsiTheme="minorHAnsi"/>
+              <w:rFonts w:ascii="Times New Roman" w:eastAsiaTheme="minorEastAsia" w:hAnsi="Times New Roman" w:cs="Times New Roman"/>
               <w:noProof/>
               <w:color w:val="auto"/>
               <w:kern w:val="2"/>
@@ -1488,14 +1633,14 @@
             <w:r>
               <w:rPr>
                 <w:rStyle w:val="Hyperlink"/>
-                <w:rFonts w:cs="Times New Roman"/>
+                <w:rFonts w:ascii="Times New Roman" w:hAnsi="Times New Roman" w:cs="Times New Roman"/>
                 <w:noProof/>
               </w:rPr>
               <w:t>2.5.</w:t>
             </w:r>
             <w:r>
               <w:rPr>
-                <w:rFonts w:asciiTheme="minorHAnsi" w:eastAsiaTheme="minorEastAsia" w:hAnsiTheme="minorHAnsi"/>
+                <w:rFonts w:ascii="Times New Roman" w:eastAsiaTheme="minorEastAsia" w:hAnsi="Times New Roman" w:cs="Times New Roman"/>
                 <w:noProof/>
                 <w:color w:val="auto"/>
                 <w:kern w:val="2"/>
@@ -1508,13 +1653,14 @@
             <w:r>
               <w:rPr>
                 <w:rStyle w:val="Hyperlink"/>
-                <w:rFonts w:cs="Times New Roman"/>
+                <w:rFonts w:ascii="Times New Roman" w:hAnsi="Times New Roman" w:cs="Times New Roman"/>
                 <w:noProof/>
               </w:rPr>
               <w:t>Bảo mật và phân quyền</w:t>
             </w:r>
             <w:r>
               <w:rPr>
+                <w:rFonts w:ascii="Times New Roman" w:hAnsi="Times New Roman" w:cs="Times New Roman"/>
                 <w:noProof/>
                 <w:webHidden/>
               </w:rPr>
@@ -1522,6 +1668,7 @@
             </w:r>
             <w:r>
               <w:rPr>
+                <w:rFonts w:ascii="Times New Roman" w:hAnsi="Times New Roman" w:cs="Times New Roman"/>
                 <w:noProof/>
                 <w:webHidden/>
               </w:rPr>
@@ -1529,6 +1676,7 @@
             </w:r>
             <w:r>
               <w:rPr>
+                <w:rFonts w:ascii="Times New Roman" w:hAnsi="Times New Roman" w:cs="Times New Roman"/>
                 <w:noProof/>
                 <w:webHidden/>
               </w:rPr>
@@ -1536,12 +1684,14 @@
             </w:r>
             <w:r>
               <w:rPr>
+                <w:rFonts w:ascii="Times New Roman" w:hAnsi="Times New Roman" w:cs="Times New Roman"/>
                 <w:noProof/>
                 <w:webHidden/>
               </w:rPr>
             </w:r>
             <w:r>
               <w:rPr>
+                <w:rFonts w:ascii="Times New Roman" w:hAnsi="Times New Roman" w:cs="Times New Roman"/>
                 <w:noProof/>
                 <w:webHidden/>
               </w:rPr>
@@ -1549,6 +1699,7 @@
             </w:r>
             <w:r>
               <w:rPr>
+                <w:rFonts w:ascii="Times New Roman" w:hAnsi="Times New Roman" w:cs="Times New Roman"/>
                 <w:noProof/>
                 <w:webHidden/>
               </w:rPr>
@@ -1556,6 +1707,7 @@
             </w:r>
             <w:r>
               <w:rPr>
+                <w:rFonts w:ascii="Times New Roman" w:hAnsi="Times New Roman" w:cs="Times New Roman"/>
                 <w:noProof/>
                 <w:webHidden/>
               </w:rPr>
@@ -1571,7 +1723,9 @@
               <w:tab w:val="right" w:leader="dot" w:pos="9061"/>
             </w:tabs>
             <w:rPr>
-              <w:rFonts w:asciiTheme="minorHAnsi" w:eastAsiaTheme="minorEastAsia" w:hAnsiTheme="minorHAnsi"/>
+              <w:rFonts w:ascii="Times New Roman" w:eastAsiaTheme="minorEastAsia" w:hAnsi="Times New Roman" w:cs="Times New Roman"/>
+              <w:b/>
+              <w:bCs/>
               <w:noProof/>
               <w:color w:val="auto"/>
               <w:kern w:val="2"/>
@@ -1584,13 +1738,18 @@
             <w:r>
               <w:rPr>
                 <w:rStyle w:val="Hyperlink"/>
+                <w:rFonts w:ascii="Times New Roman" w:hAnsi="Times New Roman" w:cs="Times New Roman"/>
+                <w:b/>
+                <w:bCs/>
                 <w:noProof/>
               </w:rPr>
               <w:t>Chương 3.</w:t>
             </w:r>
             <w:r>
               <w:rPr>
-                <w:rFonts w:asciiTheme="minorHAnsi" w:eastAsiaTheme="minorEastAsia" w:hAnsiTheme="minorHAnsi"/>
+                <w:rFonts w:ascii="Times New Roman" w:eastAsiaTheme="minorEastAsia" w:hAnsi="Times New Roman" w:cs="Times New Roman"/>
+                <w:b/>
+                <w:bCs/>
                 <w:noProof/>
                 <w:color w:val="auto"/>
                 <w:kern w:val="2"/>
@@ -1603,12 +1762,18 @@
             <w:r>
               <w:rPr>
                 <w:rStyle w:val="Hyperlink"/>
+                <w:rFonts w:ascii="Times New Roman" w:hAnsi="Times New Roman" w:cs="Times New Roman"/>
+                <w:b/>
+                <w:bCs/>
                 <w:noProof/>
               </w:rPr>
               <w:t>TRIỂN KHAI VÀ KẾT QUẢ</w:t>
             </w:r>
             <w:r>
               <w:rPr>
+                <w:rFonts w:ascii="Times New Roman" w:hAnsi="Times New Roman" w:cs="Times New Roman"/>
+                <w:b/>
+                <w:bCs/>
                 <w:noProof/>
                 <w:webHidden/>
               </w:rPr>
@@ -1616,6 +1781,9 @@
             </w:r>
             <w:r>
               <w:rPr>
+                <w:rFonts w:ascii="Times New Roman" w:hAnsi="Times New Roman" w:cs="Times New Roman"/>
+                <w:b/>
+                <w:bCs/>
                 <w:noProof/>
                 <w:webHidden/>
               </w:rPr>
@@ -1623,6 +1791,9 @@
             </w:r>
             <w:r>
               <w:rPr>
+                <w:rFonts w:ascii="Times New Roman" w:hAnsi="Times New Roman" w:cs="Times New Roman"/>
+                <w:b/>
+                <w:bCs/>
                 <w:noProof/>
                 <w:webHidden/>
               </w:rPr>
@@ -1630,12 +1801,18 @@
             </w:r>
             <w:r>
               <w:rPr>
+                <w:rFonts w:ascii="Times New Roman" w:hAnsi="Times New Roman" w:cs="Times New Roman"/>
+                <w:b/>
+                <w:bCs/>
                 <w:noProof/>
                 <w:webHidden/>
               </w:rPr>
             </w:r>
             <w:r>
               <w:rPr>
+                <w:rFonts w:ascii="Times New Roman" w:hAnsi="Times New Roman" w:cs="Times New Roman"/>
+                <w:b/>
+                <w:bCs/>
                 <w:noProof/>
                 <w:webHidden/>
               </w:rPr>
@@ -1643,6 +1820,9 @@
             </w:r>
             <w:r>
               <w:rPr>
+                <w:rFonts w:ascii="Times New Roman" w:hAnsi="Times New Roman" w:cs="Times New Roman"/>
+                <w:b/>
+                <w:bCs/>
                 <w:noProof/>
                 <w:webHidden/>
               </w:rPr>
@@ -1650,6 +1830,9 @@
             </w:r>
             <w:r>
               <w:rPr>
+                <w:rFonts w:ascii="Times New Roman" w:hAnsi="Times New Roman" w:cs="Times New Roman"/>
+                <w:b/>
+                <w:bCs/>
                 <w:noProof/>
                 <w:webHidden/>
               </w:rPr>
@@ -1665,7 +1848,7 @@
               <w:tab w:val="right" w:leader="dot" w:pos="9061"/>
             </w:tabs>
             <w:rPr>
-              <w:rFonts w:asciiTheme="minorHAnsi" w:eastAsiaTheme="minorEastAsia" w:hAnsiTheme="minorHAnsi"/>
+              <w:rFonts w:ascii="Times New Roman" w:eastAsiaTheme="minorEastAsia" w:hAnsi="Times New Roman" w:cs="Times New Roman"/>
               <w:noProof/>
               <w:color w:val="auto"/>
               <w:kern w:val="2"/>
@@ -1678,14 +1861,14 @@
             <w:r>
               <w:rPr>
                 <w:rStyle w:val="Hyperlink"/>
-                <w:rFonts w:cs="Times New Roman"/>
+                <w:rFonts w:ascii="Times New Roman" w:hAnsi="Times New Roman" w:cs="Times New Roman"/>
                 <w:noProof/>
               </w:rPr>
               <w:t>3.1.</w:t>
             </w:r>
             <w:r>
               <w:rPr>
-                <w:rFonts w:asciiTheme="minorHAnsi" w:eastAsiaTheme="minorEastAsia" w:hAnsiTheme="minorHAnsi"/>
+                <w:rFonts w:ascii="Times New Roman" w:eastAsiaTheme="minorEastAsia" w:hAnsi="Times New Roman" w:cs="Times New Roman"/>
                 <w:noProof/>
                 <w:color w:val="auto"/>
                 <w:kern w:val="2"/>
@@ -1698,13 +1881,14 @@
             <w:r>
               <w:rPr>
                 <w:rStyle w:val="Hyperlink"/>
-                <w:rFonts w:cs="Times New Roman"/>
+                <w:rFonts w:ascii="Times New Roman" w:hAnsi="Times New Roman" w:cs="Times New Roman"/>
                 <w:noProof/>
               </w:rPr>
               <w:t>Môi trường triển khai</w:t>
             </w:r>
             <w:r>
               <w:rPr>
+                <w:rFonts w:ascii="Times New Roman" w:hAnsi="Times New Roman" w:cs="Times New Roman"/>
                 <w:noProof/>
                 <w:webHidden/>
               </w:rPr>
@@ -1712,6 +1896,7 @@
             </w:r>
             <w:r>
               <w:rPr>
+                <w:rFonts w:ascii="Times New Roman" w:hAnsi="Times New Roman" w:cs="Times New Roman"/>
                 <w:noProof/>
                 <w:webHidden/>
               </w:rPr>
@@ -1719,6 +1904,7 @@
             </w:r>
             <w:r>
               <w:rPr>
+                <w:rFonts w:ascii="Times New Roman" w:hAnsi="Times New Roman" w:cs="Times New Roman"/>
                 <w:noProof/>
                 <w:webHidden/>
               </w:rPr>
@@ -1726,12 +1912,14 @@
             </w:r>
             <w:r>
               <w:rPr>
+                <w:rFonts w:ascii="Times New Roman" w:hAnsi="Times New Roman" w:cs="Times New Roman"/>
                 <w:noProof/>
                 <w:webHidden/>
               </w:rPr>
             </w:r>
             <w:r>
               <w:rPr>
+                <w:rFonts w:ascii="Times New Roman" w:hAnsi="Times New Roman" w:cs="Times New Roman"/>
                 <w:noProof/>
                 <w:webHidden/>
               </w:rPr>
@@ -1739,6 +1927,7 @@
             </w:r>
             <w:r>
               <w:rPr>
+                <w:rFonts w:ascii="Times New Roman" w:hAnsi="Times New Roman" w:cs="Times New Roman"/>
                 <w:noProof/>
                 <w:webHidden/>
               </w:rPr>
@@ -1746,6 +1935,7 @@
             </w:r>
             <w:r>
               <w:rPr>
+                <w:rFonts w:ascii="Times New Roman" w:hAnsi="Times New Roman" w:cs="Times New Roman"/>
                 <w:noProof/>
                 <w:webHidden/>
               </w:rPr>
@@ -1761,7 +1951,7 @@
               <w:tab w:val="right" w:leader="dot" w:pos="9061"/>
             </w:tabs>
             <w:rPr>
-              <w:rFonts w:asciiTheme="minorHAnsi" w:eastAsiaTheme="minorEastAsia" w:hAnsiTheme="minorHAnsi"/>
+              <w:rFonts w:ascii="Times New Roman" w:eastAsiaTheme="minorEastAsia" w:hAnsi="Times New Roman" w:cs="Times New Roman"/>
               <w:noProof/>
               <w:color w:val="auto"/>
               <w:kern w:val="2"/>
@@ -1774,14 +1964,14 @@
             <w:r>
               <w:rPr>
                 <w:rStyle w:val="Hyperlink"/>
-                <w:rFonts w:cs="Times New Roman"/>
+                <w:rFonts w:ascii="Times New Roman" w:hAnsi="Times New Roman" w:cs="Times New Roman"/>
                 <w:noProof/>
               </w:rPr>
               <w:t>3.2.</w:t>
             </w:r>
             <w:r>
               <w:rPr>
-                <w:rFonts w:asciiTheme="minorHAnsi" w:eastAsiaTheme="minorEastAsia" w:hAnsiTheme="minorHAnsi"/>
+                <w:rFonts w:ascii="Times New Roman" w:eastAsiaTheme="minorEastAsia" w:hAnsi="Times New Roman" w:cs="Times New Roman"/>
                 <w:noProof/>
                 <w:color w:val="auto"/>
                 <w:kern w:val="2"/>
@@ -1794,13 +1984,14 @@
             <w:r>
               <w:rPr>
                 <w:rStyle w:val="Hyperlink"/>
-                <w:rFonts w:cs="Times New Roman"/>
+                <w:rFonts w:ascii="Times New Roman" w:hAnsi="Times New Roman" w:cs="Times New Roman"/>
                 <w:noProof/>
               </w:rPr>
               <w:t>Kết quả các chức năng chính</w:t>
             </w:r>
             <w:r>
               <w:rPr>
+                <w:rFonts w:ascii="Times New Roman" w:hAnsi="Times New Roman" w:cs="Times New Roman"/>
                 <w:noProof/>
                 <w:webHidden/>
               </w:rPr>
@@ -1808,6 +1999,7 @@
             </w:r>
             <w:r>
               <w:rPr>
+                <w:rFonts w:ascii="Times New Roman" w:hAnsi="Times New Roman" w:cs="Times New Roman"/>
                 <w:noProof/>
                 <w:webHidden/>
               </w:rPr>
@@ -1815,6 +2007,7 @@
             </w:r>
             <w:r>
               <w:rPr>
+                <w:rFonts w:ascii="Times New Roman" w:hAnsi="Times New Roman" w:cs="Times New Roman"/>
                 <w:noProof/>
                 <w:webHidden/>
               </w:rPr>
@@ -1822,12 +2015,14 @@
             </w:r>
             <w:r>
               <w:rPr>
+                <w:rFonts w:ascii="Times New Roman" w:hAnsi="Times New Roman" w:cs="Times New Roman"/>
                 <w:noProof/>
                 <w:webHidden/>
               </w:rPr>
             </w:r>
             <w:r>
               <w:rPr>
+                <w:rFonts w:ascii="Times New Roman" w:hAnsi="Times New Roman" w:cs="Times New Roman"/>
                 <w:noProof/>
                 <w:webHidden/>
               </w:rPr>
@@ -1835,6 +2030,7 @@
             </w:r>
             <w:r>
               <w:rPr>
+                <w:rFonts w:ascii="Times New Roman" w:hAnsi="Times New Roman" w:cs="Times New Roman"/>
                 <w:noProof/>
                 <w:webHidden/>
               </w:rPr>
@@ -1842,6 +2038,7 @@
             </w:r>
             <w:r>
               <w:rPr>
+                <w:rFonts w:ascii="Times New Roman" w:hAnsi="Times New Roman" w:cs="Times New Roman"/>
                 <w:noProof/>
                 <w:webHidden/>
               </w:rPr>
@@ -1857,7 +2054,7 @@
               <w:tab w:val="right" w:leader="dot" w:pos="9061"/>
             </w:tabs>
             <w:rPr>
-              <w:rFonts w:asciiTheme="minorHAnsi" w:eastAsiaTheme="minorEastAsia" w:hAnsiTheme="minorHAnsi"/>
+              <w:rFonts w:ascii="Times New Roman" w:eastAsiaTheme="minorEastAsia" w:hAnsi="Times New Roman" w:cs="Times New Roman"/>
               <w:noProof/>
               <w:color w:val="auto"/>
               <w:kern w:val="2"/>
@@ -1870,14 +2067,14 @@
             <w:r>
               <w:rPr>
                 <w:rStyle w:val="Hyperlink"/>
-                <w:rFonts w:cs="Times New Roman"/>
+                <w:rFonts w:ascii="Times New Roman" w:hAnsi="Times New Roman" w:cs="Times New Roman"/>
                 <w:noProof/>
               </w:rPr>
               <w:t>3.2.1.</w:t>
             </w:r>
             <w:r>
               <w:rPr>
-                <w:rFonts w:asciiTheme="minorHAnsi" w:eastAsiaTheme="minorEastAsia" w:hAnsiTheme="minorHAnsi"/>
+                <w:rFonts w:ascii="Times New Roman" w:eastAsiaTheme="minorEastAsia" w:hAnsi="Times New Roman" w:cs="Times New Roman"/>
                 <w:noProof/>
                 <w:color w:val="auto"/>
                 <w:kern w:val="2"/>
@@ -1890,7 +2087,7 @@
             <w:r>
               <w:rPr>
                 <w:rStyle w:val="Hyperlink"/>
-                <w:rFonts w:cs="Times New Roman"/>
+                <w:rFonts w:ascii="Times New Roman" w:hAnsi="Times New Roman" w:cs="Times New Roman"/>
                 <w:i/>
                 <w:noProof/>
               </w:rPr>
@@ -1898,6 +2095,7 @@
             </w:r>
             <w:r>
               <w:rPr>
+                <w:rFonts w:ascii="Times New Roman" w:hAnsi="Times New Roman" w:cs="Times New Roman"/>
                 <w:noProof/>
                 <w:webHidden/>
               </w:rPr>
@@ -1905,6 +2103,7 @@
             </w:r>
             <w:r>
               <w:rPr>
+                <w:rFonts w:ascii="Times New Roman" w:hAnsi="Times New Roman" w:cs="Times New Roman"/>
                 <w:noProof/>
                 <w:webHidden/>
               </w:rPr>
@@ -1912,6 +2111,7 @@
             </w:r>
             <w:r>
               <w:rPr>
+                <w:rFonts w:ascii="Times New Roman" w:hAnsi="Times New Roman" w:cs="Times New Roman"/>
                 <w:noProof/>
                 <w:webHidden/>
               </w:rPr>
@@ -1919,12 +2119,14 @@
             </w:r>
             <w:r>
               <w:rPr>
+                <w:rFonts w:ascii="Times New Roman" w:hAnsi="Times New Roman" w:cs="Times New Roman"/>
                 <w:noProof/>
                 <w:webHidden/>
               </w:rPr>
             </w:r>
             <w:r>
               <w:rPr>
+                <w:rFonts w:ascii="Times New Roman" w:hAnsi="Times New Roman" w:cs="Times New Roman"/>
                 <w:noProof/>
                 <w:webHidden/>
               </w:rPr>
@@ -1932,6 +2134,7 @@
             </w:r>
             <w:r>
               <w:rPr>
+                <w:rFonts w:ascii="Times New Roman" w:hAnsi="Times New Roman" w:cs="Times New Roman"/>
                 <w:noProof/>
                 <w:webHidden/>
               </w:rPr>
@@ -1939,6 +2142,7 @@
             </w:r>
             <w:r>
               <w:rPr>
+                <w:rFonts w:ascii="Times New Roman" w:hAnsi="Times New Roman" w:cs="Times New Roman"/>
                 <w:noProof/>
                 <w:webHidden/>
               </w:rPr>
@@ -1954,7 +2158,7 @@
               <w:tab w:val="right" w:leader="dot" w:pos="9061"/>
             </w:tabs>
             <w:rPr>
-              <w:rFonts w:asciiTheme="minorHAnsi" w:eastAsiaTheme="minorEastAsia" w:hAnsiTheme="minorHAnsi"/>
+              <w:rFonts w:ascii="Times New Roman" w:eastAsiaTheme="minorEastAsia" w:hAnsi="Times New Roman" w:cs="Times New Roman"/>
               <w:noProof/>
               <w:color w:val="auto"/>
               <w:kern w:val="2"/>
@@ -1967,14 +2171,14 @@
             <w:r>
               <w:rPr>
                 <w:rStyle w:val="Hyperlink"/>
-                <w:rFonts w:cs="Times New Roman"/>
+                <w:rFonts w:ascii="Times New Roman" w:hAnsi="Times New Roman" w:cs="Times New Roman"/>
                 <w:noProof/>
               </w:rPr>
               <w:t>3.2.2.</w:t>
             </w:r>
             <w:r>
               <w:rPr>
-                <w:rFonts w:asciiTheme="minorHAnsi" w:eastAsiaTheme="minorEastAsia" w:hAnsiTheme="minorHAnsi"/>
+                <w:rFonts w:ascii="Times New Roman" w:eastAsiaTheme="minorEastAsia" w:hAnsi="Times New Roman" w:cs="Times New Roman"/>
                 <w:noProof/>
                 <w:color w:val="auto"/>
                 <w:kern w:val="2"/>
@@ -1987,7 +2191,7 @@
             <w:r>
               <w:rPr>
                 <w:rStyle w:val="Hyperlink"/>
-                <w:rFonts w:cs="Times New Roman"/>
+                <w:rFonts w:ascii="Times New Roman" w:hAnsi="Times New Roman" w:cs="Times New Roman"/>
                 <w:i/>
                 <w:noProof/>
               </w:rPr>
@@ -1995,6 +2199,7 @@
             </w:r>
             <w:r>
               <w:rPr>
+                <w:rFonts w:ascii="Times New Roman" w:hAnsi="Times New Roman" w:cs="Times New Roman"/>
                 <w:noProof/>
                 <w:webHidden/>
               </w:rPr>
@@ -2002,6 +2207,7 @@
             </w:r>
             <w:r>
               <w:rPr>
+                <w:rFonts w:ascii="Times New Roman" w:hAnsi="Times New Roman" w:cs="Times New Roman"/>
                 <w:noProof/>
                 <w:webHidden/>
               </w:rPr>
@@ -2009,6 +2215,7 @@
             </w:r>
             <w:r>
               <w:rPr>
+                <w:rFonts w:ascii="Times New Roman" w:hAnsi="Times New Roman" w:cs="Times New Roman"/>
                 <w:noProof/>
                 <w:webHidden/>
               </w:rPr>
@@ -2016,12 +2223,14 @@
             </w:r>
             <w:r>
               <w:rPr>
+                <w:rFonts w:ascii="Times New Roman" w:hAnsi="Times New Roman" w:cs="Times New Roman"/>
                 <w:noProof/>
                 <w:webHidden/>
               </w:rPr>
             </w:r>
             <w:r>
               <w:rPr>
+                <w:rFonts w:ascii="Times New Roman" w:hAnsi="Times New Roman" w:cs="Times New Roman"/>
                 <w:noProof/>
                 <w:webHidden/>
               </w:rPr>
@@ -2029,6 +2238,7 @@
             </w:r>
             <w:r>
               <w:rPr>
+                <w:rFonts w:ascii="Times New Roman" w:hAnsi="Times New Roman" w:cs="Times New Roman"/>
                 <w:noProof/>
                 <w:webHidden/>
               </w:rPr>
@@ -2036,6 +2246,7 @@
             </w:r>
             <w:r>
               <w:rPr>
+                <w:rFonts w:ascii="Times New Roman" w:hAnsi="Times New Roman" w:cs="Times New Roman"/>
                 <w:noProof/>
                 <w:webHidden/>
               </w:rPr>
@@ -2051,7 +2262,7 @@
               <w:tab w:val="right" w:leader="dot" w:pos="9061"/>
             </w:tabs>
             <w:rPr>
-              <w:rFonts w:asciiTheme="minorHAnsi" w:eastAsiaTheme="minorEastAsia" w:hAnsiTheme="minorHAnsi"/>
+              <w:rFonts w:ascii="Times New Roman" w:eastAsiaTheme="minorEastAsia" w:hAnsi="Times New Roman" w:cs="Times New Roman"/>
               <w:noProof/>
               <w:color w:val="auto"/>
               <w:kern w:val="2"/>
@@ -2064,14 +2275,14 @@
             <w:r>
               <w:rPr>
                 <w:rStyle w:val="Hyperlink"/>
-                <w:rFonts w:cs="Times New Roman"/>
+                <w:rFonts w:ascii="Times New Roman" w:hAnsi="Times New Roman" w:cs="Times New Roman"/>
                 <w:noProof/>
               </w:rPr>
               <w:t>3.2.3.</w:t>
             </w:r>
             <w:r>
               <w:rPr>
-                <w:rFonts w:asciiTheme="minorHAnsi" w:eastAsiaTheme="minorEastAsia" w:hAnsiTheme="minorHAnsi"/>
+                <w:rFonts w:ascii="Times New Roman" w:eastAsiaTheme="minorEastAsia" w:hAnsi="Times New Roman" w:cs="Times New Roman"/>
                 <w:noProof/>
                 <w:color w:val="auto"/>
                 <w:kern w:val="2"/>
@@ -2084,7 +2295,7 @@
             <w:r>
               <w:rPr>
                 <w:rStyle w:val="Hyperlink"/>
-                <w:rFonts w:cs="Times New Roman"/>
+                <w:rFonts w:ascii="Times New Roman" w:hAnsi="Times New Roman" w:cs="Times New Roman"/>
                 <w:i/>
                 <w:noProof/>
               </w:rPr>
@@ -2092,6 +2303,7 @@
             </w:r>
             <w:r>
               <w:rPr>
+                <w:rFonts w:ascii="Times New Roman" w:hAnsi="Times New Roman" w:cs="Times New Roman"/>
                 <w:noProof/>
                 <w:webHidden/>
               </w:rPr>
@@ -2099,6 +2311,7 @@
             </w:r>
             <w:r>
               <w:rPr>
+                <w:rFonts w:ascii="Times New Roman" w:hAnsi="Times New Roman" w:cs="Times New Roman"/>
                 <w:noProof/>
                 <w:webHidden/>
               </w:rPr>
@@ -2106,6 +2319,7 @@
             </w:r>
             <w:r>
               <w:rPr>
+                <w:rFonts w:ascii="Times New Roman" w:hAnsi="Times New Roman" w:cs="Times New Roman"/>
                 <w:noProof/>
                 <w:webHidden/>
               </w:rPr>
@@ -2113,12 +2327,14 @@
             </w:r>
             <w:r>
               <w:rPr>
+                <w:rFonts w:ascii="Times New Roman" w:hAnsi="Times New Roman" w:cs="Times New Roman"/>
                 <w:noProof/>
                 <w:webHidden/>
               </w:rPr>
             </w:r>
             <w:r>
               <w:rPr>
+                <w:rFonts w:ascii="Times New Roman" w:hAnsi="Times New Roman" w:cs="Times New Roman"/>
                 <w:noProof/>
                 <w:webHidden/>
               </w:rPr>
@@ -2126,6 +2342,7 @@
             </w:r>
             <w:r>
               <w:rPr>
+                <w:rFonts w:ascii="Times New Roman" w:hAnsi="Times New Roman" w:cs="Times New Roman"/>
                 <w:noProof/>
                 <w:webHidden/>
               </w:rPr>
@@ -2133,6 +2350,7 @@
             </w:r>
             <w:r>
               <w:rPr>
+                <w:rFonts w:ascii="Times New Roman" w:hAnsi="Times New Roman" w:cs="Times New Roman"/>
                 <w:noProof/>
                 <w:webHidden/>
               </w:rPr>
@@ -2148,7 +2366,7 @@
               <w:tab w:val="right" w:leader="dot" w:pos="9061"/>
             </w:tabs>
             <w:rPr>
-              <w:rFonts w:asciiTheme="minorHAnsi" w:eastAsiaTheme="minorEastAsia" w:hAnsiTheme="minorHAnsi"/>
+              <w:rFonts w:ascii="Times New Roman" w:eastAsiaTheme="minorEastAsia" w:hAnsi="Times New Roman" w:cs="Times New Roman"/>
               <w:noProof/>
               <w:color w:val="auto"/>
               <w:kern w:val="2"/>
@@ -2161,14 +2379,14 @@
             <w:r>
               <w:rPr>
                 <w:rStyle w:val="Hyperlink"/>
-                <w:rFonts w:cs="Times New Roman"/>
+                <w:rFonts w:ascii="Times New Roman" w:hAnsi="Times New Roman" w:cs="Times New Roman"/>
                 <w:noProof/>
               </w:rPr>
               <w:t>3.2.4.</w:t>
             </w:r>
             <w:r>
               <w:rPr>
-                <w:rFonts w:asciiTheme="minorHAnsi" w:eastAsiaTheme="minorEastAsia" w:hAnsiTheme="minorHAnsi"/>
+                <w:rFonts w:ascii="Times New Roman" w:eastAsiaTheme="minorEastAsia" w:hAnsi="Times New Roman" w:cs="Times New Roman"/>
                 <w:noProof/>
                 <w:color w:val="auto"/>
                 <w:kern w:val="2"/>
@@ -2181,7 +2399,7 @@
             <w:r>
               <w:rPr>
                 <w:rStyle w:val="Hyperlink"/>
-                <w:rFonts w:cs="Times New Roman"/>
+                <w:rFonts w:ascii="Times New Roman" w:hAnsi="Times New Roman" w:cs="Times New Roman"/>
                 <w:i/>
                 <w:noProof/>
               </w:rPr>
@@ -2189,6 +2407,7 @@
             </w:r>
             <w:r>
               <w:rPr>
+                <w:rFonts w:ascii="Times New Roman" w:hAnsi="Times New Roman" w:cs="Times New Roman"/>
                 <w:noProof/>
                 <w:webHidden/>
               </w:rPr>
@@ -2196,6 +2415,7 @@
             </w:r>
             <w:r>
               <w:rPr>
+                <w:rFonts w:ascii="Times New Roman" w:hAnsi="Times New Roman" w:cs="Times New Roman"/>
                 <w:noProof/>
                 <w:webHidden/>
               </w:rPr>
@@ -2203,6 +2423,7 @@
             </w:r>
             <w:r>
               <w:rPr>
+                <w:rFonts w:ascii="Times New Roman" w:hAnsi="Times New Roman" w:cs="Times New Roman"/>
                 <w:noProof/>
                 <w:webHidden/>
               </w:rPr>
@@ -2210,12 +2431,14 @@
             </w:r>
             <w:r>
               <w:rPr>
+                <w:rFonts w:ascii="Times New Roman" w:hAnsi="Times New Roman" w:cs="Times New Roman"/>
                 <w:noProof/>
                 <w:webHidden/>
               </w:rPr>
             </w:r>
             <w:r>
               <w:rPr>
+                <w:rFonts w:ascii="Times New Roman" w:hAnsi="Times New Roman" w:cs="Times New Roman"/>
                 <w:noProof/>
                 <w:webHidden/>
               </w:rPr>
@@ -2223,6 +2446,7 @@
             </w:r>
             <w:r>
               <w:rPr>
+                <w:rFonts w:ascii="Times New Roman" w:hAnsi="Times New Roman" w:cs="Times New Roman"/>
                 <w:noProof/>
                 <w:webHidden/>
               </w:rPr>
@@ -2230,6 +2454,7 @@
             </w:r>
             <w:r>
               <w:rPr>
+                <w:rFonts w:ascii="Times New Roman" w:hAnsi="Times New Roman" w:cs="Times New Roman"/>
                 <w:noProof/>
                 <w:webHidden/>
               </w:rPr>
@@ -2245,7 +2470,7 @@
               <w:tab w:val="right" w:leader="dot" w:pos="9061"/>
             </w:tabs>
             <w:rPr>
-              <w:rFonts w:asciiTheme="minorHAnsi" w:eastAsiaTheme="minorEastAsia" w:hAnsiTheme="minorHAnsi"/>
+              <w:rFonts w:ascii="Times New Roman" w:eastAsiaTheme="minorEastAsia" w:hAnsi="Times New Roman" w:cs="Times New Roman"/>
               <w:noProof/>
               <w:color w:val="auto"/>
               <w:kern w:val="2"/>
@@ -2258,14 +2483,14 @@
             <w:r>
               <w:rPr>
                 <w:rStyle w:val="Hyperlink"/>
-                <w:rFonts w:cs="Times New Roman"/>
+                <w:rFonts w:ascii="Times New Roman" w:hAnsi="Times New Roman" w:cs="Times New Roman"/>
                 <w:noProof/>
               </w:rPr>
               <w:t>3.3.</w:t>
             </w:r>
             <w:r>
               <w:rPr>
-                <w:rFonts w:asciiTheme="minorHAnsi" w:eastAsiaTheme="minorEastAsia" w:hAnsiTheme="minorHAnsi"/>
+                <w:rFonts w:ascii="Times New Roman" w:eastAsiaTheme="minorEastAsia" w:hAnsi="Times New Roman" w:cs="Times New Roman"/>
                 <w:noProof/>
                 <w:color w:val="auto"/>
                 <w:kern w:val="2"/>
@@ -2278,13 +2503,14 @@
             <w:r>
               <w:rPr>
                 <w:rStyle w:val="Hyperlink"/>
-                <w:rFonts w:cs="Times New Roman"/>
+                <w:rFonts w:ascii="Times New Roman" w:hAnsi="Times New Roman" w:cs="Times New Roman"/>
                 <w:noProof/>
               </w:rPr>
               <w:t>Khai báo sử dụng AI</w:t>
             </w:r>
             <w:r>
               <w:rPr>
+                <w:rFonts w:ascii="Times New Roman" w:hAnsi="Times New Roman" w:cs="Times New Roman"/>
                 <w:noProof/>
                 <w:webHidden/>
               </w:rPr>
@@ -2292,6 +2518,7 @@
             </w:r>
             <w:r>
               <w:rPr>
+                <w:rFonts w:ascii="Times New Roman" w:hAnsi="Times New Roman" w:cs="Times New Roman"/>
                 <w:noProof/>
                 <w:webHidden/>
               </w:rPr>
@@ -2299,6 +2526,7 @@
             </w:r>
             <w:r>
               <w:rPr>
+                <w:rFonts w:ascii="Times New Roman" w:hAnsi="Times New Roman" w:cs="Times New Roman"/>
                 <w:noProof/>
                 <w:webHidden/>
               </w:rPr>
@@ -2306,12 +2534,14 @@
             </w:r>
             <w:r>
               <w:rPr>
+                <w:rFonts w:ascii="Times New Roman" w:hAnsi="Times New Roman" w:cs="Times New Roman"/>
                 <w:noProof/>
                 <w:webHidden/>
               </w:rPr>
             </w:r>
             <w:r>
               <w:rPr>
+                <w:rFonts w:ascii="Times New Roman" w:hAnsi="Times New Roman" w:cs="Times New Roman"/>
                 <w:noProof/>
                 <w:webHidden/>
               </w:rPr>
@@ -2319,6 +2549,7 @@
             </w:r>
             <w:r>
               <w:rPr>
+                <w:rFonts w:ascii="Times New Roman" w:hAnsi="Times New Roman" w:cs="Times New Roman"/>
                 <w:noProof/>
                 <w:webHidden/>
               </w:rPr>
@@ -2326,6 +2557,7 @@
             </w:r>
             <w:r>
               <w:rPr>
+                <w:rFonts w:ascii="Times New Roman" w:hAnsi="Times New Roman" w:cs="Times New Roman"/>
                 <w:noProof/>
                 <w:webHidden/>
               </w:rPr>
@@ -2340,7 +2572,9 @@
               <w:tab w:val="right" w:leader="dot" w:pos="9061"/>
             </w:tabs>
             <w:rPr>
-              <w:rFonts w:asciiTheme="minorHAnsi" w:eastAsiaTheme="minorEastAsia" w:hAnsiTheme="minorHAnsi"/>
+              <w:rFonts w:ascii="Times New Roman" w:eastAsiaTheme="minorEastAsia" w:hAnsi="Times New Roman" w:cs="Times New Roman"/>
+              <w:b/>
+              <w:bCs/>
               <w:noProof/>
               <w:color w:val="auto"/>
               <w:kern w:val="2"/>
@@ -2354,12 +2588,17 @@
               <w:rPr>
                 <w:rStyle w:val="Hyperlink"/>
                 <w:rFonts w:ascii="Times New Roman" w:hAnsi="Times New Roman" w:cs="Times New Roman"/>
+                <w:b/>
+                <w:bCs/>
                 <w:noProof/>
               </w:rPr>
               <w:t>KẾT LUẬN</w:t>
             </w:r>
             <w:r>
               <w:rPr>
+                <w:rFonts w:ascii="Times New Roman" w:hAnsi="Times New Roman" w:cs="Times New Roman"/>
+                <w:b/>
+                <w:bCs/>
                 <w:noProof/>
                 <w:webHidden/>
               </w:rPr>
@@ -2367,6 +2606,9 @@
             </w:r>
             <w:r>
               <w:rPr>
+                <w:rFonts w:ascii="Times New Roman" w:hAnsi="Times New Roman" w:cs="Times New Roman"/>
+                <w:b/>
+                <w:bCs/>
                 <w:noProof/>
                 <w:webHidden/>
               </w:rPr>
@@ -2374,6 +2616,9 @@
             </w:r>
             <w:r>
               <w:rPr>
+                <w:rFonts w:ascii="Times New Roman" w:hAnsi="Times New Roman" w:cs="Times New Roman"/>
+                <w:b/>
+                <w:bCs/>
                 <w:noProof/>
                 <w:webHidden/>
               </w:rPr>
@@ -2381,12 +2626,18 @@
             </w:r>
             <w:r>
               <w:rPr>
+                <w:rFonts w:ascii="Times New Roman" w:hAnsi="Times New Roman" w:cs="Times New Roman"/>
+                <w:b/>
+                <w:bCs/>
                 <w:noProof/>
                 <w:webHidden/>
               </w:rPr>
             </w:r>
             <w:r>
               <w:rPr>
+                <w:rFonts w:ascii="Times New Roman" w:hAnsi="Times New Roman" w:cs="Times New Roman"/>
+                <w:b/>
+                <w:bCs/>
                 <w:noProof/>
                 <w:webHidden/>
               </w:rPr>
@@ -2394,6 +2645,9 @@
             </w:r>
             <w:r>
               <w:rPr>
+                <w:rFonts w:ascii="Times New Roman" w:hAnsi="Times New Roman" w:cs="Times New Roman"/>
+                <w:b/>
+                <w:bCs/>
                 <w:noProof/>
                 <w:webHidden/>
               </w:rPr>
@@ -2401,6 +2655,9 @@
             </w:r>
             <w:r>
               <w:rPr>
+                <w:rFonts w:ascii="Times New Roman" w:hAnsi="Times New Roman" w:cs="Times New Roman"/>
+                <w:b/>
+                <w:bCs/>
                 <w:noProof/>
                 <w:webHidden/>
               </w:rPr>
@@ -2411,6 +2668,7 @@
         <w:p>
           <w:r>
             <w:rPr>
+              <w:rFonts w:ascii="Times New Roman" w:hAnsi="Times New Roman" w:cs="Times New Roman"/>
               <w:b/>
               <w:bCs/>
               <w:noProof/>
@@ -3987,13 +4245,28 @@
     </w:p>
     <w:p>
       <w:pPr>
-        <w:pStyle w:val="Title"/>
-        <w:pageBreakBefore/>
-        <w:outlineLvl w:val="0"/>
-        <w:rPr>
-          <w:rFonts w:ascii="Times New Roman" w:hAnsi="Times New Roman" w:cs="Times New Roman"/>
+        <w:spacing w:after="200" w:line="276" w:lineRule="auto"/>
+        <w:rPr>
+          <w:rFonts w:ascii="Times New Roman" w:hAnsi="Times New Roman" w:cs="Times New Roman"/>
+        </w:rPr>
+      </w:pPr>
+      <w:r>
+        <w:rPr>
+          <w:rFonts w:ascii="Times New Roman" w:hAnsi="Times New Roman" w:cs="Times New Roman"/>
+        </w:rPr>
+        <w:br w:type="page"/>
+      </w:r>
+    </w:p>
+    <w:p>
+      <w:pPr>
+        <w:jc w:val="center"/>
+        <w:rPr>
+          <w:rFonts w:ascii="Times New Roman" w:hAnsi="Times New Roman" w:cs="Times New Roman"/>
+          <w:b/>
+          <w:bCs/>
           <w:sz w:val="32"/>
           <w:szCs w:val="32"/>
+          <w:lang w:val="en-US"/>
         </w:rPr>
       </w:pPr>
       <w:bookmarkStart w:id="0" w:name="_Toc_100"/>
@@ -4002,188 +4275,15 @@
       <w:r>
         <w:rPr>
           <w:rFonts w:ascii="Times New Roman" w:hAnsi="Times New Roman" w:cs="Times New Roman"/>
+          <w:b/>
+          <w:bCs/>
           <w:sz w:val="32"/>
           <w:szCs w:val="32"/>
+          <w:lang w:val="en-US"/>
         </w:rPr>
         <w:lastRenderedPageBreak/>
-        <w:t>MỞ ĐẦU</w:t>
-      </w:r>
-      <w:bookmarkEnd w:id="0"/>
-      <w:bookmarkEnd w:id="1"/>
-      <w:bookmarkEnd w:id="2"/>
-    </w:p>
-    <w:p>
-      <w:pPr>
-        <w:spacing w:after="50" w:line="276" w:lineRule="auto"/>
-        <w:jc w:val="both"/>
-        <w:rPr>
-          <w:rFonts w:ascii="Times New Roman" w:hAnsi="Times New Roman" w:cs="Times New Roman"/>
-        </w:rPr>
-      </w:pPr>
-      <w:r>
-        <w:rPr>
-          <w:rFonts w:ascii="Times New Roman" w:hAnsi="Times New Roman" w:cs="Times New Roman"/>
-          <w:b/>
-        </w:rPr>
-        <w:t>1. Lý do chọn đề tài</w:t>
-      </w:r>
-    </w:p>
-    <w:p>
-      <w:pPr>
-        <w:spacing w:after="50" w:line="276" w:lineRule="auto"/>
-        <w:ind w:firstLine="720"/>
-        <w:jc w:val="both"/>
-        <w:rPr>
-          <w:rFonts w:ascii="Times New Roman" w:hAnsi="Times New Roman" w:cs="Times New Roman"/>
-        </w:rPr>
-      </w:pPr>
-      <w:r>
-        <w:rPr>
-          <w:rFonts w:ascii="Times New Roman" w:hAnsi="Times New Roman" w:cs="Times New Roman"/>
-        </w:rPr>
-        <w:t>Nhu cầu tìm và cho thuê nhà, nhất là phòng trọ và căn hộ cho sinh viên, người đi làm ở các thành phố lớn, luôn ở mức cao. Tuy nhiên phần lớn giao dịch hiện nay vẫn diễn ra qua các kênh phi tập trung như mạng xã hội, môi giới truyền miệng, thiếu công cụ tìm kiếm/lọc hiệu quả và thiếu cơ chế kiểm duyệt tin đăng. Vì vậy nhóm chọn xây dựng một nền tảng web cho thuê nhà hoàn chỉnh, từ đăng tin, tìm kiếm, duyệt tin đến thống kê thị trường, để vận dụng kiến thức lập trình Python (FastAPI) và kỹ năng phát triển web full-stack vào một bài toán thực tế, có quy mô đủ lớn để thực hành thiết kế cơ sở dữ liệu, phân quyền, kiểm thử và triển khai bằng container.</w:t>
-      </w:r>
-    </w:p>
-    <w:p>
-      <w:pPr>
-        <w:spacing w:after="50" w:line="276" w:lineRule="auto"/>
-        <w:jc w:val="both"/>
-        <w:rPr>
-          <w:rFonts w:ascii="Times New Roman" w:hAnsi="Times New Roman" w:cs="Times New Roman"/>
-        </w:rPr>
-      </w:pPr>
-      <w:r>
-        <w:rPr>
-          <w:rFonts w:ascii="Times New Roman" w:hAnsi="Times New Roman" w:cs="Times New Roman"/>
-          <w:b/>
-        </w:rPr>
-        <w:t>2. Mục tiêu và phạm vi thực hiện</w:t>
-      </w:r>
-    </w:p>
-    <w:p>
-      <w:pPr>
-        <w:spacing w:after="50" w:line="276" w:lineRule="auto"/>
-        <w:ind w:firstLine="720"/>
-        <w:jc w:val="both"/>
-        <w:rPr>
-          <w:rFonts w:ascii="Times New Roman" w:hAnsi="Times New Roman" w:cs="Times New Roman"/>
-        </w:rPr>
-      </w:pPr>
-      <w:r>
-        <w:rPr>
-          <w:rFonts w:ascii="Times New Roman" w:hAnsi="Times New Roman" w:cs="Times New Roman"/>
-        </w:rPr>
-        <w:t>Mục tiêu là xây dựng hệ thống web cho thuê nhà hoàn chỉnh, đáp ứng đúng và đủ các chức năng môn học yêu cầu, với kiến trúc tách bạch backend/frontend, có kiểm thử tự động và quy trình Git rõ ràng theo nhánh tính năng. Đối tượng phục vụ gồm ba nhóm: khách chưa đăng nhập, người dùng đã đăng nhập (vừa đăng tin, vừa tìm nhà) và quản trị viên. Phạm vi thực hiện bám sát đề bài môn học (chi tiết tại Bảng 2.1), không mở rộng sang thanh toán trực tuyến, ký hợp đồng điện tử hay nhắn tin real-time.</w:t>
-      </w:r>
-    </w:p>
-    <w:p>
-      <w:pPr>
-        <w:spacing w:after="50" w:line="276" w:lineRule="auto"/>
-        <w:jc w:val="both"/>
-        <w:rPr>
-          <w:rFonts w:ascii="Times New Roman" w:hAnsi="Times New Roman" w:cs="Times New Roman"/>
-        </w:rPr>
-      </w:pPr>
-      <w:r>
-        <w:rPr>
-          <w:rFonts w:ascii="Times New Roman" w:hAnsi="Times New Roman" w:cs="Times New Roman"/>
-          <w:b/>
-        </w:rPr>
-        <w:t>3. Bố cục báo cáo</w:t>
-      </w:r>
-    </w:p>
-    <w:p>
-      <w:pPr>
-        <w:spacing w:after="50" w:line="276" w:lineRule="auto"/>
-        <w:ind w:firstLine="720"/>
-        <w:jc w:val="both"/>
-        <w:rPr>
-          <w:rFonts w:ascii="Times New Roman" w:hAnsi="Times New Roman" w:cs="Times New Roman"/>
-        </w:rPr>
-      </w:pPr>
-      <w:r>
-        <w:rPr>
-          <w:rFonts w:ascii="Times New Roman" w:hAnsi="Times New Roman" w:cs="Times New Roman"/>
-        </w:rPr>
-        <w:t>Báo cáo gồm ba chương: Chương 1 trình bày bài toán, mục tiêu và công nghệ sử dụng; Chương 2 phân tích yêu cầu và thiết kế hệ thống (kiến trúc, cơ sở dữ liệu, API); Chương 3 trình bày kết quả các chức năng đã hoàn thành và phần khai báo sử dụng AI trong quá trình làm đồ án.</w:t>
-      </w:r>
-    </w:p>
-    <w:p>
-      <w:pPr>
-        <w:pStyle w:val="Heading1"/>
-        <w:pageBreakBefore/>
-        <w:spacing w:before="160" w:after="60"/>
-        <w:jc w:val="center"/>
-      </w:pPr>
-      <w:bookmarkStart w:id="3" w:name="_Toc_101"/>
-      <w:bookmarkStart w:id="4" w:name="_Toc_Ch1"/>
-      <w:bookmarkStart w:id="5" w:name="_Toc241327757"/>
-      <w:r>
-        <w:lastRenderedPageBreak/>
-        <w:t>TỔNG QUAN ĐỀ TÀI</w:t>
-      </w:r>
-      <w:bookmarkEnd w:id="3"/>
-      <w:bookmarkEnd w:id="4"/>
-      <w:bookmarkEnd w:id="5"/>
-    </w:p>
-    <w:p>
-      <w:pPr>
-        <w:pStyle w:val="Heading2"/>
-        <w:spacing w:before="100" w:after="40"/>
-        <w:rPr>
-          <w:rFonts w:cs="Times New Roman"/>
-        </w:rPr>
-      </w:pPr>
-      <w:bookmarkStart w:id="6" w:name="_Toc_102"/>
-      <w:bookmarkStart w:id="7" w:name="_Toc_11"/>
-      <w:bookmarkStart w:id="8" w:name="_Toc241327758"/>
-      <w:r>
-        <w:rPr>
-          <w:rFonts w:cs="Times New Roman"/>
-        </w:rPr>
-        <w:t>Bài toán và mục tiêu</w:t>
-      </w:r>
-      <w:bookmarkEnd w:id="6"/>
-      <w:bookmarkEnd w:id="7"/>
-      <w:bookmarkEnd w:id="8"/>
-    </w:p>
-    <w:p>
-      <w:pPr>
-        <w:spacing w:after="50" w:line="276" w:lineRule="auto"/>
-        <w:ind w:firstLine="567"/>
-        <w:jc w:val="both"/>
-        <w:rPr>
-          <w:rFonts w:ascii="Times New Roman" w:hAnsi="Times New Roman" w:cs="Times New Roman"/>
-        </w:rPr>
-      </w:pPr>
-      <w:r>
-        <w:rPr>
-          <w:rFonts w:ascii="Times New Roman" w:hAnsi="Times New Roman" w:cs="Times New Roman"/>
-        </w:rPr>
-        <w:t>Bài toán đặt ra là xây dựng một website cho thuê nhà cho phép: người tìm nhà xem, tìm kiếm và lọc tin đăng theo nhiều tiêu chí; người có nhà cho thuê tự đăng và quản lý tin của mình; quản trị viên kiểm duyệt nội dung và theo dõi hoạt động toàn hệ thống. Mục tiêu là hoàn thiện cả ba nhóm chức năng này với chất lượng đủ để demo trực tiếp, có dữ liệu mẫu thực tế, có kiểm thử tự động và quy trình Git rõ ràng.</w:t>
-      </w:r>
-    </w:p>
-    <w:p>
-      <w:pPr>
-        <w:pStyle w:val="Caption"/>
-        <w:spacing w:before="40"/>
-        <w:rPr>
-          <w:rFonts w:ascii="Times New Roman" w:hAnsi="Times New Roman" w:cs="Times New Roman"/>
-          <w:bCs w:val="0"/>
-          <w:szCs w:val="26"/>
-        </w:rPr>
-      </w:pPr>
-      <w:bookmarkStart w:id="9" w:name="_Toc_Tbl_11"/>
-      <w:r>
-        <w:rPr>
-          <w:rFonts w:ascii="Times New Roman" w:hAnsi="Times New Roman" w:cs="Times New Roman"/>
-          <w:bCs w:val="0"/>
-          <w:i/>
-          <w:szCs w:val="26"/>
-        </w:rPr>
-        <w:t>Bảng 1.1: Phân công thành viên nhóm</w:t>
-      </w:r>
-      <w:bookmarkEnd w:id="9"/>
+        <w:t>BẢNG PHÂN CÔNG THÀNH VIÊN</w:t>
+      </w:r>
     </w:p>
     <w:tbl>
       <w:tblPr>
@@ -4642,25 +4742,37 @@
     </w:tbl>
     <w:p>
       <w:pPr>
-        <w:spacing w:after="50" w:line="276" w:lineRule="auto"/>
-        <w:rPr>
-          <w:rFonts w:ascii="Times New Roman" w:hAnsi="Times New Roman" w:cs="Times New Roman"/>
+        <w:rPr>
+          <w:rFonts w:ascii="Times New Roman" w:eastAsiaTheme="majorEastAsia" w:hAnsi="Times New Roman" w:cs="Times New Roman"/>
+          <w:b/>
+          <w:bCs/>
+          <w:spacing w:val="5"/>
+          <w:kern w:val="28"/>
+          <w:szCs w:val="26"/>
+          <w:lang w:val="en-US"/>
         </w:rPr>
       </w:pPr>
     </w:p>
     <w:p>
       <w:pPr>
-        <w:spacing w:after="200" w:line="276" w:lineRule="auto"/>
-        <w:rPr>
-          <w:rFonts w:ascii="Times New Roman" w:hAnsi="Times New Roman" w:cs="Times New Roman"/>
-        </w:rPr>
-      </w:pPr>
-      <w:r>
-        <w:rPr>
-          <w:rFonts w:ascii="Times New Roman" w:hAnsi="Times New Roman" w:cs="Times New Roman"/>
-        </w:rPr>
-        <w:br w:type="page"/>
-      </w:r>
+        <w:pStyle w:val="Heading1"/>
+        <w:pageBreakBefore/>
+        <w:spacing w:before="160" w:after="60"/>
+        <w:jc w:val="center"/>
+      </w:pPr>
+      <w:bookmarkStart w:id="3" w:name="_Toc_101"/>
+      <w:bookmarkStart w:id="4" w:name="_Toc_Ch1"/>
+      <w:bookmarkStart w:id="5" w:name="_Toc241327757"/>
+      <w:bookmarkEnd w:id="0"/>
+      <w:bookmarkEnd w:id="1"/>
+      <w:bookmarkEnd w:id="2"/>
+      <w:r>
+        <w:lastRenderedPageBreak/>
+        <w:t>TỔNG QUAN ĐỀ TÀI</w:t>
+      </w:r>
+      <w:bookmarkEnd w:id="3"/>
+      <w:bookmarkEnd w:id="4"/>
+      <w:bookmarkEnd w:id="5"/>
     </w:p>
     <w:p>
       <w:pPr>
@@ -4670,41 +4782,299 @@
           <w:rFonts w:cs="Times New Roman"/>
         </w:rPr>
       </w:pPr>
-      <w:bookmarkStart w:id="10" w:name="_Toc_103"/>
-      <w:bookmarkStart w:id="11" w:name="_Toc_12"/>
-      <w:bookmarkStart w:id="12" w:name="_Toc241327759"/>
+      <w:bookmarkStart w:id="6" w:name="_Toc_102"/>
+      <w:bookmarkStart w:id="7" w:name="_Toc_11"/>
+      <w:bookmarkStart w:id="8" w:name="_Toc241327758"/>
       <w:r>
         <w:rPr>
           <w:rFonts w:cs="Times New Roman"/>
         </w:rPr>
-        <w:lastRenderedPageBreak/>
+        <w:t>Bài toán</w:t>
+      </w:r>
+      <w:r>
+        <w:rPr>
+          <w:rFonts w:cs="Times New Roman"/>
+          <w:lang w:val="en-US"/>
+        </w:rPr>
+        <w:t>,</w:t>
+      </w:r>
+      <w:r>
+        <w:rPr>
+          <w:rFonts w:cs="Times New Roman"/>
+        </w:rPr>
+        <w:t xml:space="preserve"> mục tiêu</w:t>
+      </w:r>
+      <w:bookmarkEnd w:id="6"/>
+      <w:bookmarkEnd w:id="7"/>
+      <w:bookmarkEnd w:id="8"/>
+      <w:r>
+        <w:rPr>
+          <w:rFonts w:cs="Times New Roman"/>
+          <w:lang w:val="en-US"/>
+        </w:rPr>
+        <w:t xml:space="preserve"> và phạm vi thực  hiện</w:t>
+      </w:r>
+    </w:p>
+    <w:p>
+      <w:pPr>
+        <w:spacing w:after="50" w:line="276" w:lineRule="auto"/>
+        <w:ind w:firstLine="720"/>
+        <w:jc w:val="both"/>
+        <w:rPr>
+          <w:rFonts w:ascii="Times New Roman" w:hAnsi="Times New Roman" w:cs="Times New Roman"/>
+          <w:lang w:val="en-US"/>
+        </w:rPr>
+      </w:pPr>
+      <w:bookmarkStart w:id="9" w:name="_Toc_103"/>
+      <w:bookmarkStart w:id="10" w:name="_Toc_12"/>
+      <w:bookmarkStart w:id="11" w:name="_Toc241327759"/>
+      <w:r>
+        <w:rPr>
+          <w:rFonts w:ascii="Times New Roman" w:hAnsi="Times New Roman" w:cs="Times New Roman"/>
+        </w:rPr>
+        <w:t xml:space="preserve">Nhu cầu tìm và cho thuê nhà, </w:t>
+      </w:r>
+      <w:r>
+        <w:rPr>
+          <w:rFonts w:ascii="Times New Roman" w:hAnsi="Times New Roman" w:cs="Times New Roman"/>
+          <w:lang w:val="en-US"/>
+        </w:rPr>
+        <w:t>đặc biệt</w:t>
+      </w:r>
+      <w:r>
+        <w:rPr>
+          <w:rFonts w:ascii="Times New Roman" w:hAnsi="Times New Roman" w:cs="Times New Roman"/>
+        </w:rPr>
+        <w:t xml:space="preserve"> là phòng trọ và căn hộ cho sinh viên, người đi làm </w:t>
+      </w:r>
+      <w:r>
+        <w:rPr>
+          <w:rFonts w:ascii="Times New Roman" w:hAnsi="Times New Roman" w:cs="Times New Roman"/>
+          <w:lang w:val="en-US"/>
+        </w:rPr>
+        <w:t>tại</w:t>
+      </w:r>
+      <w:r>
+        <w:rPr>
+          <w:rFonts w:ascii="Times New Roman" w:hAnsi="Times New Roman" w:cs="Times New Roman"/>
+        </w:rPr>
+        <w:t xml:space="preserve"> các thành phố lớn luôn ở mức cao. Tuy nhiên phần lớn </w:t>
+      </w:r>
+      <w:r>
+        <w:rPr>
+          <w:rFonts w:ascii="Times New Roman" w:hAnsi="Times New Roman" w:cs="Times New Roman"/>
+          <w:lang w:val="en-US"/>
+        </w:rPr>
+        <w:t>việc tìm kiếm và đăng tin</w:t>
+      </w:r>
+      <w:r>
+        <w:rPr>
+          <w:rFonts w:ascii="Times New Roman" w:hAnsi="Times New Roman" w:cs="Times New Roman"/>
+        </w:rPr>
+        <w:t xml:space="preserve"> hiện nay </w:t>
+      </w:r>
+      <w:r>
+        <w:rPr>
+          <w:rFonts w:ascii="Times New Roman" w:hAnsi="Times New Roman" w:cs="Times New Roman"/>
+          <w:lang w:val="en-US"/>
+        </w:rPr>
+        <w:t>chủ yếu</w:t>
+      </w:r>
+      <w:r>
+        <w:rPr>
+          <w:rFonts w:ascii="Times New Roman" w:hAnsi="Times New Roman" w:cs="Times New Roman"/>
+        </w:rPr>
+        <w:t xml:space="preserve"> diễn ra qua các kênh phi tập trung như mạng xã hội, môi giới, thiếu công cụ tìm kiếm/lọc hiệu quả và thiếu cơ chế kiểm duyệt tin đăng. </w:t>
+      </w:r>
+    </w:p>
+    <w:p>
+      <w:pPr>
+        <w:spacing w:after="50" w:line="276" w:lineRule="auto"/>
+        <w:ind w:firstLine="720"/>
+        <w:jc w:val="both"/>
+        <w:rPr>
+          <w:rFonts w:ascii="Times New Roman" w:hAnsi="Times New Roman" w:cs="Times New Roman"/>
+          <w:lang w:val="en-US"/>
+        </w:rPr>
+      </w:pPr>
+      <w:r>
+        <w:rPr>
+          <w:rFonts w:ascii="Times New Roman" w:hAnsi="Times New Roman" w:cs="Times New Roman"/>
+        </w:rPr>
+        <w:t>Vì vậy nhóm chọn xây dựng</w:t>
+      </w:r>
+      <w:r>
+        <w:rPr>
+          <w:rFonts w:ascii="Times New Roman" w:hAnsi="Times New Roman" w:cs="Times New Roman"/>
+          <w:lang w:val="en-US"/>
+        </w:rPr>
+        <w:t xml:space="preserve"> UrbanLease -</w:t>
+      </w:r>
+      <w:r>
+        <w:rPr>
+          <w:rFonts w:ascii="Times New Roman" w:hAnsi="Times New Roman" w:cs="Times New Roman"/>
+        </w:rPr>
+        <w:t xml:space="preserve"> nền tảng web</w:t>
+      </w:r>
+      <w:r>
+        <w:rPr>
+          <w:rFonts w:ascii="Times New Roman" w:hAnsi="Times New Roman" w:cs="Times New Roman"/>
+          <w:lang w:val="en-US"/>
+        </w:rPr>
+        <w:t xml:space="preserve"> hỗ trợ tìm kiếm, đăng và quản lý tin</w:t>
+      </w:r>
+      <w:r>
+        <w:rPr>
+          <w:rFonts w:ascii="Times New Roman" w:hAnsi="Times New Roman" w:cs="Times New Roman"/>
+        </w:rPr>
+        <w:t xml:space="preserve"> cho thuê nhà</w:t>
+      </w:r>
+      <w:r>
+        <w:rPr>
+          <w:rFonts w:ascii="Times New Roman" w:hAnsi="Times New Roman" w:cs="Times New Roman"/>
+          <w:lang w:val="en-US"/>
+        </w:rPr>
+        <w:t xml:space="preserve">. Đề tài cũng giúp nhóm </w:t>
+      </w:r>
+      <w:r>
+        <w:rPr>
+          <w:rFonts w:ascii="Times New Roman" w:hAnsi="Times New Roman" w:cs="Times New Roman"/>
+        </w:rPr>
+        <w:t>vận dụng kiến thức lập trình Python</w:t>
+      </w:r>
+      <w:r>
+        <w:rPr>
+          <w:rFonts w:ascii="Times New Roman" w:hAnsi="Times New Roman" w:cs="Times New Roman"/>
+          <w:lang w:val="en-US"/>
+        </w:rPr>
+        <w:t xml:space="preserve"> </w:t>
+      </w:r>
+      <w:r>
+        <w:rPr>
+          <w:rFonts w:ascii="Times New Roman" w:hAnsi="Times New Roman" w:cs="Times New Roman"/>
+        </w:rPr>
+        <w:t>và kỹ năng phát triển web vào một bài toán thực tế, có quy mô đủ lớn để thực hành thiết kế cơ sở dữ liệu, phân quyền</w:t>
+      </w:r>
+      <w:r>
+        <w:rPr>
+          <w:rFonts w:ascii="Times New Roman" w:hAnsi="Times New Roman" w:cs="Times New Roman"/>
+          <w:lang w:val="en-US"/>
+        </w:rPr>
+        <w:t xml:space="preserve"> </w:t>
+      </w:r>
+      <w:r>
+        <w:rPr>
+          <w:rFonts w:ascii="Times New Roman" w:hAnsi="Times New Roman" w:cs="Times New Roman"/>
+        </w:rPr>
+        <w:t>và triển khai bằng container.</w:t>
+      </w:r>
+    </w:p>
+    <w:p>
+      <w:pPr>
+        <w:spacing w:after="50" w:line="276" w:lineRule="auto"/>
+        <w:ind w:firstLine="720"/>
+        <w:jc w:val="both"/>
+        <w:rPr>
+          <w:rFonts w:ascii="Times New Roman" w:hAnsi="Times New Roman" w:cs="Times New Roman"/>
+          <w:lang w:val="en-US"/>
+        </w:rPr>
+      </w:pPr>
+      <w:r>
+        <w:rPr>
+          <w:rFonts w:ascii="Times New Roman" w:hAnsi="Times New Roman" w:cs="Times New Roman"/>
+        </w:rPr>
+        <w:t>Mục tiêu là xây dựng hệ thống web cho thuê nhà</w:t>
+      </w:r>
+      <w:r>
+        <w:rPr>
+          <w:rFonts w:ascii="Times New Roman" w:hAnsi="Times New Roman" w:cs="Times New Roman"/>
+          <w:lang w:val="en-US"/>
+        </w:rPr>
+        <w:t xml:space="preserve"> với các chức năng chính dành cho 3 nhóm người dùng: khách, người dùng và quản trị viên. Hệ thống cho phép khách tìm kiếm và lọc tin đăng, người dùng đăng tin, quản lý tin và xem nhiều thông tin chi tiết hơn, quản trị viên kiểm duyệt nội dung, theo dõi thống kê và hoạt động của hệ thống.</w:t>
+      </w:r>
+    </w:p>
+    <w:p>
+      <w:pPr>
+        <w:spacing w:after="50" w:line="276" w:lineRule="auto"/>
+        <w:ind w:firstLine="720"/>
+        <w:jc w:val="both"/>
+        <w:rPr>
+          <w:rFonts w:ascii="Times New Roman" w:hAnsi="Times New Roman" w:cs="Times New Roman"/>
+          <w:lang w:val="en-US"/>
+        </w:rPr>
+      </w:pPr>
+      <w:r>
+        <w:rPr>
+          <w:rFonts w:ascii="Times New Roman" w:hAnsi="Times New Roman" w:cs="Times New Roman"/>
+          <w:lang w:val="en-US"/>
+        </w:rPr>
+        <w:t>Hệ thống được xây dựng với kiến trúc tách biệt frontend/backend</w:t>
+      </w:r>
+      <w:r>
+        <w:rPr>
+          <w:rFonts w:ascii="Times New Roman" w:hAnsi="Times New Roman" w:cs="Times New Roman"/>
+          <w:lang w:val="en-US"/>
+        </w:rPr>
+        <w:t>, trong đó frontend đảm nhiệm giao diện và tương tác với người dùng, còn backend xử lý nghiệp vụ và cung cấp API cho hệ thống.</w:t>
+      </w:r>
+    </w:p>
+    <w:p>
+      <w:pPr>
+        <w:pStyle w:val="Heading2"/>
+        <w:spacing w:before="100" w:after="40"/>
+        <w:rPr>
+          <w:rFonts w:cs="Times New Roman"/>
+        </w:rPr>
+      </w:pPr>
+      <w:r>
+        <w:rPr>
+          <w:rFonts w:cs="Times New Roman"/>
+        </w:rPr>
         <w:t>Đối tượng người dùng và phạm vi chức năng</w:t>
       </w:r>
+      <w:bookmarkEnd w:id="9"/>
       <w:bookmarkEnd w:id="10"/>
       <w:bookmarkEnd w:id="11"/>
-      <w:bookmarkEnd w:id="12"/>
     </w:p>
     <w:p>
       <w:pPr>
         <w:pStyle w:val="Caption"/>
-        <w:spacing w:before="40"/>
-        <w:rPr>
-          <w:rFonts w:ascii="Times New Roman" w:hAnsi="Times New Roman" w:cs="Times New Roman"/>
-          <w:bCs w:val="0"/>
-          <w:szCs w:val="26"/>
-        </w:rPr>
-      </w:pPr>
-      <w:bookmarkStart w:id="13" w:name="_Toc_Tbl_12"/>
-      <w:r>
-        <w:rPr>
-          <w:rFonts w:ascii="Times New Roman" w:hAnsi="Times New Roman" w:cs="Times New Roman"/>
-          <w:bCs w:val="0"/>
-          <w:i/>
-          <w:szCs w:val="26"/>
-        </w:rPr>
-        <w:t>Bảng 1.2: Đối tượng người dùng và phạm vi chức năng</w:t>
-      </w:r>
-      <w:bookmarkEnd w:id="13"/>
+        <w:keepNext/>
+      </w:pPr>
+      <w:r>
+        <w:t xml:space="preserve">Bảng </w:t>
+      </w:r>
+      <w:fldSimple w:instr=" STYLEREF 1 \s ">
+        <w:r>
+          <w:rPr>
+            <w:noProof/>
+          </w:rPr>
+          <w:t>1</w:t>
+        </w:r>
+      </w:fldSimple>
+      <w:r>
+        <w:t>.</w:t>
+      </w:r>
+      <w:fldSimple w:instr=" SEQ Bảng \* ARABIC \s 1 ">
+        <w:r>
+          <w:rPr>
+            <w:noProof/>
+          </w:rPr>
+          <w:t>1</w:t>
+        </w:r>
+      </w:fldSimple>
+      <w:r>
+        <w:rPr>
+          <w:lang w:val="en-US"/>
+        </w:rPr>
+        <w:t xml:space="preserve"> </w:t>
+      </w:r>
+      <w:r>
+        <w:rPr>
+          <w:lang w:val="en-US"/>
+        </w:rPr>
+        <w:t>Đối tượng người dùng và phạm vi chức năng</w:t>
+      </w:r>
     </w:p>
     <w:tbl>
       <w:tblPr>
@@ -4974,46 +5344,81 @@
     </w:p>
     <w:p>
       <w:pPr>
+        <w:spacing w:after="200" w:line="276" w:lineRule="auto"/>
+        <w:rPr>
+          <w:rFonts w:ascii="Times New Roman" w:hAnsi="Times New Roman" w:cs="Times New Roman"/>
+          <w:szCs w:val="26"/>
+        </w:rPr>
+      </w:pPr>
+      <w:r>
+        <w:rPr>
+          <w:rFonts w:ascii="Times New Roman" w:hAnsi="Times New Roman" w:cs="Times New Roman"/>
+          <w:szCs w:val="26"/>
+        </w:rPr>
+        <w:br w:type="page"/>
+      </w:r>
+    </w:p>
+    <w:p>
+      <w:pPr>
         <w:pStyle w:val="Heading2"/>
         <w:spacing w:before="100" w:after="40"/>
         <w:rPr>
           <w:rFonts w:cs="Times New Roman"/>
         </w:rPr>
       </w:pPr>
-      <w:bookmarkStart w:id="14" w:name="_Toc_104"/>
-      <w:bookmarkStart w:id="15" w:name="_Toc_13"/>
-      <w:bookmarkStart w:id="16" w:name="_Toc241327760"/>
+      <w:bookmarkStart w:id="12" w:name="_Toc_104"/>
+      <w:bookmarkStart w:id="13" w:name="_Toc_13"/>
+      <w:bookmarkStart w:id="14" w:name="_Toc241327760"/>
       <w:r>
         <w:rPr>
           <w:rFonts w:cs="Times New Roman"/>
         </w:rPr>
+        <w:lastRenderedPageBreak/>
         <w:t>Công nghệ sử dụng</w:t>
       </w:r>
+      <w:bookmarkEnd w:id="12"/>
+      <w:bookmarkEnd w:id="13"/>
       <w:bookmarkEnd w:id="14"/>
-      <w:bookmarkEnd w:id="15"/>
-      <w:bookmarkEnd w:id="16"/>
     </w:p>
     <w:p>
       <w:pPr>
         <w:pStyle w:val="Caption"/>
-        <w:spacing w:before="40"/>
-        <w:rPr>
-          <w:rFonts w:ascii="Times New Roman" w:hAnsi="Times New Roman" w:cs="Times New Roman"/>
-          <w:bCs w:val="0"/>
-          <w:szCs w:val="26"/>
-        </w:rPr>
-      </w:pPr>
-      <w:bookmarkStart w:id="17" w:name="_Toc_Tbl_13"/>
-      <w:r>
-        <w:rPr>
-          <w:rFonts w:ascii="Times New Roman" w:hAnsi="Times New Roman" w:cs="Times New Roman"/>
-          <w:bCs w:val="0"/>
-          <w:i/>
-          <w:szCs w:val="26"/>
-        </w:rPr>
-        <w:t>Bảng 1.3: Công nghệ sử dụng</w:t>
-      </w:r>
-      <w:bookmarkEnd w:id="17"/>
+        <w:keepNext/>
+      </w:pPr>
+      <w:r>
+        <w:t xml:space="preserve">Bảng </w:t>
+      </w:r>
+      <w:fldSimple w:instr=" STYLEREF 1 \s ">
+        <w:r>
+          <w:rPr>
+            <w:noProof/>
+          </w:rPr>
+          <w:t>1</w:t>
+        </w:r>
+      </w:fldSimple>
+      <w:r>
+        <w:t>.</w:t>
+      </w:r>
+      <w:fldSimple w:instr=" SEQ Bảng \* ARABIC \s 1 ">
+        <w:r>
+          <w:rPr>
+            <w:noProof/>
+          </w:rPr>
+          <w:t>2</w:t>
+        </w:r>
+      </w:fldSimple>
+      <w:r>
+        <w:rPr>
+          <w:lang w:val="en-US"/>
+        </w:rPr>
+        <w:t xml:space="preserve"> </w:t>
+      </w:r>
+      <w:r>
+        <w:rPr>
+          <w:lang w:val="en-US"/>
+        </w:rPr>
+        <w:t>Công nghệ sử dụng</w:t>
+      </w:r>
     </w:p>
     <w:tbl>
       <w:tblPr>
@@ -5139,6 +5544,7 @@
               <w:rPr>
                 <w:rFonts w:ascii="Times New Roman" w:hAnsi="Times New Roman"/>
                 <w:szCs w:val="26"/>
+                <w:lang w:val="en-US"/>
               </w:rPr>
             </w:pPr>
             <w:r>
@@ -5146,7 +5552,15 @@
                 <w:rFonts w:ascii="Times New Roman" w:hAnsi="Times New Roman"/>
                 <w:szCs w:val="26"/>
               </w:rPr>
-              <w:t>Python, FastAPI, SQLAlchemy, Alembic (migration), Pydantic, JWT (xác thực), pytest</w:t>
+              <w:t>Python, FastAPI, SQLAlchemy, Alembic (migration), Pydantic, JWT (xác thực)</w:t>
+            </w:r>
+            <w:r>
+              <w:rPr>
+                <w:rFonts w:ascii="Times New Roman" w:hAnsi="Times New Roman"/>
+                <w:szCs w:val="26"/>
+                <w:lang w:val="en-US"/>
+              </w:rPr>
+              <w:t>s</w:t>
             </w:r>
           </w:p>
         </w:tc>
@@ -5467,12 +5881,33 @@
         <w:spacing w:before="160" w:after="60"/>
         <w:jc w:val="center"/>
       </w:pPr>
-      <w:bookmarkStart w:id="18" w:name="_Toc_105"/>
-      <w:bookmarkStart w:id="19" w:name="_Toc_Ch2"/>
-      <w:bookmarkStart w:id="20" w:name="_Toc241327761"/>
+      <w:bookmarkStart w:id="15" w:name="_Toc_105"/>
+      <w:bookmarkStart w:id="16" w:name="_Toc_Ch2"/>
+      <w:bookmarkStart w:id="17" w:name="_Toc241327761"/>
       <w:r>
         <w:lastRenderedPageBreak/>
         <w:t>PHÂN TÍCH VÀ THIẾT KẾ HỆ THỐNG</w:t>
+      </w:r>
+      <w:bookmarkEnd w:id="15"/>
+      <w:bookmarkEnd w:id="16"/>
+      <w:bookmarkEnd w:id="17"/>
+    </w:p>
+    <w:p>
+      <w:pPr>
+        <w:pStyle w:val="Heading2"/>
+        <w:spacing w:before="100" w:after="40"/>
+        <w:rPr>
+          <w:rFonts w:cs="Times New Roman"/>
+        </w:rPr>
+      </w:pPr>
+      <w:bookmarkStart w:id="18" w:name="_Toc_106"/>
+      <w:bookmarkStart w:id="19" w:name="_Toc_21"/>
+      <w:bookmarkStart w:id="20" w:name="_Toc241327762"/>
+      <w:r>
+        <w:rPr>
+          <w:rFonts w:cs="Times New Roman"/>
+        </w:rPr>
+        <w:t>Yêu cầu chức năng chi tiết</w:t>
       </w:r>
       <w:bookmarkEnd w:id="18"/>
       <w:bookmarkEnd w:id="19"/>
@@ -5480,62 +5915,67 @@
     </w:p>
     <w:p>
       <w:pPr>
-        <w:pStyle w:val="Heading2"/>
-        <w:spacing w:before="100" w:after="40"/>
-        <w:rPr>
-          <w:rFonts w:cs="Times New Roman"/>
-        </w:rPr>
-      </w:pPr>
-      <w:bookmarkStart w:id="21" w:name="_Toc_106"/>
-      <w:bookmarkStart w:id="22" w:name="_Toc_21"/>
-      <w:bookmarkStart w:id="23" w:name="_Toc241327762"/>
-      <w:r>
-        <w:rPr>
-          <w:rFonts w:cs="Times New Roman"/>
-        </w:rPr>
-        <w:t>Yêu cầu chức năng chi tiết</w:t>
-      </w:r>
-      <w:bookmarkEnd w:id="21"/>
-      <w:bookmarkEnd w:id="22"/>
-      <w:bookmarkEnd w:id="23"/>
-    </w:p>
-    <w:p>
-      <w:pPr>
         <w:spacing w:after="50" w:line="283" w:lineRule="auto"/>
         <w:ind w:firstLine="567"/>
         <w:jc w:val="both"/>
         <w:rPr>
           <w:rFonts w:ascii="Times New Roman" w:hAnsi="Times New Roman" w:cs="Times New Roman"/>
-        </w:rPr>
-      </w:pPr>
-      <w:r>
-        <w:rPr>
-          <w:rFonts w:ascii="Times New Roman" w:hAnsi="Times New Roman" w:cs="Times New Roman"/>
-        </w:rPr>
-        <w:t>Yêu cầu chức năng được nhóm đối chiếu trực tiếp với đề bài môn học, trình bày ở Bảng 2.1.</w:t>
+          <w:lang w:val="en-US"/>
+        </w:rPr>
+      </w:pPr>
+      <w:r>
+        <w:rPr>
+          <w:rFonts w:ascii="Times New Roman" w:hAnsi="Times New Roman" w:cs="Times New Roman"/>
+        </w:rPr>
+        <w:t>Yêu cầu chức năng được nhóm đối chiếu trực tiếp với đề bài môn học</w:t>
+      </w:r>
+      <w:r>
+        <w:rPr>
+          <w:rFonts w:ascii="Times New Roman" w:hAnsi="Times New Roman" w:cs="Times New Roman"/>
+          <w:lang w:val="en-US"/>
+        </w:rPr>
+        <w:t>.</w:t>
       </w:r>
     </w:p>
     <w:p>
       <w:pPr>
         <w:pStyle w:val="Caption"/>
-        <w:spacing w:before="40"/>
-        <w:rPr>
-          <w:rFonts w:ascii="Times New Roman" w:hAnsi="Times New Roman" w:cs="Times New Roman"/>
-          <w:bCs w:val="0"/>
-          <w:szCs w:val="26"/>
-        </w:rPr>
-      </w:pPr>
-      <w:bookmarkStart w:id="24" w:name="_Toc_Tbl_21"/>
-      <w:r>
-        <w:rPr>
-          <w:rFonts w:ascii="Times New Roman" w:hAnsi="Times New Roman" w:cs="Times New Roman"/>
-          <w:bCs w:val="0"/>
-          <w:i/>
-          <w:szCs w:val="26"/>
-        </w:rPr>
-        <w:t>Bảng 2.1: Yêu cầu chức năng chi tiết theo nhóm người dùng</w:t>
-      </w:r>
-      <w:bookmarkEnd w:id="24"/>
+        <w:keepNext/>
+      </w:pPr>
+      <w:r>
+        <w:t xml:space="preserve">Bảng </w:t>
+      </w:r>
+      <w:fldSimple w:instr=" STYLEREF 1 \s ">
+        <w:r>
+          <w:rPr>
+            <w:noProof/>
+          </w:rPr>
+          <w:t>2</w:t>
+        </w:r>
+      </w:fldSimple>
+      <w:r>
+        <w:t>.</w:t>
+      </w:r>
+      <w:fldSimple w:instr=" SEQ Bảng \* ARABIC \s 1 ">
+        <w:r>
+          <w:rPr>
+            <w:noProof/>
+          </w:rPr>
+          <w:t>1</w:t>
+        </w:r>
+      </w:fldSimple>
+      <w:r>
+        <w:rPr>
+          <w:lang w:val="en-US"/>
+        </w:rPr>
+        <w:t xml:space="preserve"> </w:t>
+      </w:r>
+      <w:r>
+        <w:rPr>
+          <w:lang w:val="en-US"/>
+        </w:rPr>
+        <w:t>Yêu cầu chức năng chi tiết theo nhóm người dùng</w:t>
+      </w:r>
     </w:p>
     <w:tbl>
       <w:tblPr>
@@ -6182,40 +6622,40 @@
           <w:rFonts w:cs="Times New Roman"/>
         </w:rPr>
       </w:pPr>
-      <w:bookmarkStart w:id="25" w:name="_Toc_107"/>
-      <w:bookmarkStart w:id="26" w:name="_Toc_22"/>
-      <w:bookmarkStart w:id="27" w:name="_Toc241327763"/>
+      <w:bookmarkStart w:id="21" w:name="_Toc_107"/>
+      <w:bookmarkStart w:id="22" w:name="_Toc_22"/>
+      <w:bookmarkStart w:id="23" w:name="_Toc241327763"/>
       <w:r>
         <w:rPr>
           <w:rFonts w:cs="Times New Roman"/>
         </w:rPr>
         <w:t>Kiến trúc hệ thống</w:t>
       </w:r>
+      <w:bookmarkEnd w:id="21"/>
+      <w:bookmarkEnd w:id="22"/>
+      <w:bookmarkEnd w:id="23"/>
+    </w:p>
+    <w:p>
+      <w:pPr>
+        <w:pStyle w:val="Heading3"/>
+        <w:spacing w:before="80" w:after="40"/>
+        <w:rPr>
+          <w:rFonts w:cs="Times New Roman"/>
+        </w:rPr>
+      </w:pPr>
+      <w:bookmarkStart w:id="24" w:name="_Toc_108"/>
+      <w:bookmarkStart w:id="25" w:name="_Toc_221"/>
+      <w:bookmarkStart w:id="26" w:name="_Toc241327764"/>
+      <w:r>
+        <w:rPr>
+          <w:rFonts w:cs="Times New Roman"/>
+          <w:i/>
+        </w:rPr>
+        <w:t>Kiến trúc tổng thể</w:t>
+      </w:r>
+      <w:bookmarkEnd w:id="24"/>
       <w:bookmarkEnd w:id="25"/>
       <w:bookmarkEnd w:id="26"/>
-      <w:bookmarkEnd w:id="27"/>
-    </w:p>
-    <w:p>
-      <w:pPr>
-        <w:pStyle w:val="Heading3"/>
-        <w:spacing w:before="80" w:after="40"/>
-        <w:rPr>
-          <w:rFonts w:cs="Times New Roman"/>
-        </w:rPr>
-      </w:pPr>
-      <w:bookmarkStart w:id="28" w:name="_Toc_108"/>
-      <w:bookmarkStart w:id="29" w:name="_Toc_221"/>
-      <w:bookmarkStart w:id="30" w:name="_Toc241327764"/>
-      <w:r>
-        <w:rPr>
-          <w:rFonts w:cs="Times New Roman"/>
-          <w:i/>
-        </w:rPr>
-        <w:t>Kiến trúc tổng thể</w:t>
-      </w:r>
-      <w:bookmarkEnd w:id="28"/>
-      <w:bookmarkEnd w:id="29"/>
-      <w:bookmarkEnd w:id="30"/>
     </w:p>
     <w:p>
       <w:pPr>
@@ -6235,11 +6675,9 @@
     </w:p>
     <w:p>
       <w:pPr>
+        <w:keepNext/>
         <w:spacing w:after="50" w:line="276" w:lineRule="auto"/>
         <w:jc w:val="center"/>
-        <w:rPr>
-          <w:rFonts w:ascii="Times New Roman" w:hAnsi="Times New Roman" w:cs="Times New Roman"/>
-        </w:rPr>
       </w:pPr>
       <w:r>
         <w:rPr>
@@ -6287,24 +6725,44 @@
     <w:p>
       <w:pPr>
         <w:pStyle w:val="Caption"/>
-        <w:spacing w:before="40"/>
-        <w:rPr>
-          <w:rFonts w:ascii="Times New Roman" w:hAnsi="Times New Roman" w:cs="Times New Roman"/>
-          <w:bCs w:val="0"/>
-          <w:szCs w:val="26"/>
-        </w:rPr>
-      </w:pPr>
-      <w:bookmarkStart w:id="31" w:name="_Toc_Fig_21"/>
-      <w:r>
-        <w:rPr>
-          <w:rFonts w:ascii="Times New Roman" w:hAnsi="Times New Roman" w:cs="Times New Roman"/>
-          <w:bCs w:val="0"/>
-          <w:i/>
-          <w:szCs w:val="26"/>
-        </w:rPr>
-        <w:t>Hình 2.1: Kiến trúc tổng thể hệ thống UrbanLease</w:t>
-      </w:r>
-      <w:bookmarkEnd w:id="31"/>
+        <w:rPr>
+          <w:rFonts w:ascii="Times New Roman" w:hAnsi="Times New Roman" w:cs="Times New Roman"/>
+        </w:rPr>
+      </w:pPr>
+      <w:r>
+        <w:t xml:space="preserve">Hình </w:t>
+      </w:r>
+      <w:fldSimple w:instr=" STYLEREF 1 \s ">
+        <w:r>
+          <w:rPr>
+            <w:noProof/>
+          </w:rPr>
+          <w:t>2</w:t>
+        </w:r>
+      </w:fldSimple>
+      <w:r>
+        <w:t>.</w:t>
+      </w:r>
+      <w:fldSimple w:instr=" SEQ Hình \* ARABIC \s 1 ">
+        <w:r>
+          <w:rPr>
+            <w:noProof/>
+          </w:rPr>
+          <w:t>1</w:t>
+        </w:r>
+      </w:fldSimple>
+      <w:r>
+        <w:rPr>
+          <w:lang w:val="en-US"/>
+        </w:rPr>
+        <w:t xml:space="preserve"> </w:t>
+      </w:r>
+      <w:r>
+        <w:rPr>
+          <w:lang w:val="en-US"/>
+        </w:rPr>
+        <w:t>Kiến trúc tổng thể hệ thống UrbanLease</w:t>
+      </w:r>
     </w:p>
     <w:p>
       <w:pPr>
@@ -6314,9 +6772,9 @@
           <w:rFonts w:cs="Times New Roman"/>
         </w:rPr>
       </w:pPr>
-      <w:bookmarkStart w:id="32" w:name="_Toc_109"/>
-      <w:bookmarkStart w:id="33" w:name="_Toc_222"/>
-      <w:bookmarkStart w:id="34" w:name="_Toc241327765"/>
+      <w:bookmarkStart w:id="27" w:name="_Toc_109"/>
+      <w:bookmarkStart w:id="28" w:name="_Toc_222"/>
+      <w:bookmarkStart w:id="29" w:name="_Toc241327765"/>
       <w:r>
         <w:rPr>
           <w:rFonts w:cs="Times New Roman"/>
@@ -6324,9 +6782,9 @@
         </w:rPr>
         <w:t>Tổ chức mã nguồn</w:t>
       </w:r>
-      <w:bookmarkEnd w:id="32"/>
-      <w:bookmarkEnd w:id="33"/>
-      <w:bookmarkEnd w:id="34"/>
+      <w:bookmarkEnd w:id="27"/>
+      <w:bookmarkEnd w:id="28"/>
+      <w:bookmarkEnd w:id="29"/>
     </w:p>
     <w:p>
       <w:pPr>
@@ -6501,18 +6959,18 @@
           <w:rFonts w:cs="Times New Roman"/>
         </w:rPr>
       </w:pPr>
-      <w:bookmarkStart w:id="35" w:name="_Toc_110"/>
-      <w:bookmarkStart w:id="36" w:name="_Toc_23"/>
-      <w:bookmarkStart w:id="37" w:name="_Toc241327766"/>
+      <w:bookmarkStart w:id="30" w:name="_Toc_110"/>
+      <w:bookmarkStart w:id="31" w:name="_Toc_23"/>
+      <w:bookmarkStart w:id="32" w:name="_Toc241327766"/>
       <w:r>
         <w:rPr>
           <w:rFonts w:cs="Times New Roman"/>
         </w:rPr>
         <w:t>Thiết kế cơ sở dữ liệu</w:t>
       </w:r>
-      <w:bookmarkEnd w:id="35"/>
-      <w:bookmarkEnd w:id="36"/>
-      <w:bookmarkEnd w:id="37"/>
+      <w:bookmarkEnd w:id="30"/>
+      <w:bookmarkEnd w:id="31"/>
+      <w:bookmarkEnd w:id="32"/>
     </w:p>
     <w:p>
       <w:pPr>
@@ -6552,11 +7010,9 @@
     </w:p>
     <w:p>
       <w:pPr>
+        <w:keepNext/>
         <w:spacing w:after="50" w:line="276" w:lineRule="auto"/>
         <w:jc w:val="center"/>
-        <w:rPr>
-          <w:rFonts w:ascii="Times New Roman" w:hAnsi="Times New Roman" w:cs="Times New Roman"/>
-        </w:rPr>
       </w:pPr>
       <w:r>
         <w:rPr>
@@ -6603,24 +7059,44 @@
     <w:p>
       <w:pPr>
         <w:pStyle w:val="Caption"/>
-        <w:spacing w:before="40"/>
-        <w:rPr>
-          <w:rFonts w:ascii="Times New Roman" w:hAnsi="Times New Roman" w:cs="Times New Roman"/>
-          <w:bCs w:val="0"/>
-          <w:szCs w:val="26"/>
-        </w:rPr>
-      </w:pPr>
-      <w:bookmarkStart w:id="38" w:name="_Toc_Fig_22"/>
-      <w:r>
-        <w:rPr>
-          <w:rFonts w:ascii="Times New Roman" w:hAnsi="Times New Roman" w:cs="Times New Roman"/>
-          <w:bCs w:val="0"/>
-          <w:i/>
-          <w:szCs w:val="26"/>
-        </w:rPr>
-        <w:t>Hình 2.2: Sơ đồ ERD rút gọn (các bảng chính)</w:t>
-      </w:r>
-      <w:bookmarkEnd w:id="38"/>
+        <w:rPr>
+          <w:rFonts w:ascii="Times New Roman" w:hAnsi="Times New Roman" w:cs="Times New Roman"/>
+        </w:rPr>
+      </w:pPr>
+      <w:r>
+        <w:t xml:space="preserve">Hình </w:t>
+      </w:r>
+      <w:fldSimple w:instr=" STYLEREF 1 \s ">
+        <w:r>
+          <w:rPr>
+            <w:noProof/>
+          </w:rPr>
+          <w:t>2</w:t>
+        </w:r>
+      </w:fldSimple>
+      <w:r>
+        <w:t>.</w:t>
+      </w:r>
+      <w:fldSimple w:instr=" SEQ Hình \* ARABIC \s 1 ">
+        <w:r>
+          <w:rPr>
+            <w:noProof/>
+          </w:rPr>
+          <w:t>2</w:t>
+        </w:r>
+      </w:fldSimple>
+      <w:r>
+        <w:rPr>
+          <w:lang w:val="en-US"/>
+        </w:rPr>
+        <w:t xml:space="preserve"> </w:t>
+      </w:r>
+      <w:r>
+        <w:rPr>
+          <w:lang w:val="en-US"/>
+        </w:rPr>
+        <w:t>Sơ đồ ERD rút gọn (các bảng chính)</w:t>
+      </w:r>
     </w:p>
     <w:p>
       <w:pPr>
@@ -6640,11 +7116,9 @@
     </w:p>
     <w:p>
       <w:pPr>
+        <w:keepNext/>
         <w:spacing w:after="50" w:line="276" w:lineRule="auto"/>
         <w:jc w:val="center"/>
-        <w:rPr>
-          <w:rFonts w:ascii="Times New Roman" w:hAnsi="Times New Roman" w:cs="Times New Roman"/>
-        </w:rPr>
       </w:pPr>
       <w:r>
         <w:rPr>
@@ -6691,24 +7165,45 @@
     <w:p>
       <w:pPr>
         <w:pStyle w:val="Caption"/>
-        <w:spacing w:before="40"/>
-        <w:rPr>
-          <w:rFonts w:ascii="Times New Roman" w:hAnsi="Times New Roman" w:cs="Times New Roman"/>
-          <w:bCs w:val="0"/>
-          <w:szCs w:val="26"/>
-        </w:rPr>
-      </w:pPr>
-      <w:bookmarkStart w:id="39" w:name="_Toc_Fig_23"/>
-      <w:r>
-        <w:rPr>
-          <w:rFonts w:ascii="Times New Roman" w:hAnsi="Times New Roman" w:cs="Times New Roman"/>
-          <w:bCs w:val="0"/>
-          <w:i/>
-          <w:szCs w:val="26"/>
-        </w:rPr>
-        <w:t>Hình 2.3: Sơ đồ lớp (Class Diagram) rút gọn: các model chính</w:t>
-      </w:r>
-      <w:bookmarkEnd w:id="39"/>
+        <w:rPr>
+          <w:rFonts w:ascii="Times New Roman" w:hAnsi="Times New Roman" w:cs="Times New Roman"/>
+          <w:lang w:val="en-US"/>
+        </w:rPr>
+      </w:pPr>
+      <w:r>
+        <w:t xml:space="preserve">Hình </w:t>
+      </w:r>
+      <w:fldSimple w:instr=" STYLEREF 1 \s ">
+        <w:r>
+          <w:rPr>
+            <w:noProof/>
+          </w:rPr>
+          <w:t>2</w:t>
+        </w:r>
+      </w:fldSimple>
+      <w:r>
+        <w:t>.</w:t>
+      </w:r>
+      <w:fldSimple w:instr=" SEQ Hình \* ARABIC \s 1 ">
+        <w:r>
+          <w:rPr>
+            <w:noProof/>
+          </w:rPr>
+          <w:t>3</w:t>
+        </w:r>
+      </w:fldSimple>
+      <w:r>
+        <w:rPr>
+          <w:lang w:val="en-US"/>
+        </w:rPr>
+        <w:t xml:space="preserve"> </w:t>
+      </w:r>
+      <w:r>
+        <w:rPr>
+          <w:lang w:val="en-US"/>
+        </w:rPr>
+        <w:t>Sơ đồ lớp (Class Diagram) rút gọn: các model chính</w:t>
+      </w:r>
     </w:p>
     <w:p>
       <w:pPr>
@@ -6721,7 +7216,7 @@
           <w:szCs w:val="26"/>
         </w:rPr>
       </w:pPr>
-      <w:bookmarkStart w:id="40" w:name="_Toc_Tbl_22"/>
+      <w:bookmarkStart w:id="33" w:name="_Toc_Tbl_22"/>
       <w:r>
         <w:rPr>
           <w:rFonts w:ascii="Times New Roman" w:hAnsi="Times New Roman" w:cs="Times New Roman"/>
@@ -6732,27 +7227,47 @@
         <w:br w:type="page"/>
       </w:r>
     </w:p>
+    <w:bookmarkEnd w:id="33"/>
     <w:p>
       <w:pPr>
         <w:pStyle w:val="Caption"/>
-        <w:spacing w:before="40"/>
-        <w:rPr>
-          <w:rFonts w:ascii="Times New Roman" w:hAnsi="Times New Roman" w:cs="Times New Roman"/>
-          <w:bCs w:val="0"/>
-          <w:szCs w:val="26"/>
-        </w:rPr>
-      </w:pPr>
-      <w:r>
-        <w:rPr>
-          <w:rFonts w:ascii="Times New Roman" w:hAnsi="Times New Roman" w:cs="Times New Roman"/>
-          <w:bCs w:val="0"/>
-          <w:i/>
-          <w:szCs w:val="26"/>
-        </w:rPr>
+        <w:keepNext/>
+      </w:pPr>
+      <w:r>
         <w:lastRenderedPageBreak/>
-        <w:t>Bảng 2.2: Mô tả các bảng dữ liệu chính</w:t>
-      </w:r>
-      <w:bookmarkEnd w:id="40"/>
+        <w:t xml:space="preserve">Bảng </w:t>
+      </w:r>
+      <w:fldSimple w:instr=" STYLEREF 1 \s ">
+        <w:r>
+          <w:rPr>
+            <w:noProof/>
+          </w:rPr>
+          <w:t>2</w:t>
+        </w:r>
+      </w:fldSimple>
+      <w:r>
+        <w:t>.</w:t>
+      </w:r>
+      <w:fldSimple w:instr=" SEQ Bảng \* ARABIC \s 1 ">
+        <w:r>
+          <w:rPr>
+            <w:noProof/>
+          </w:rPr>
+          <w:t>2</w:t>
+        </w:r>
+      </w:fldSimple>
+      <w:r>
+        <w:rPr>
+          <w:lang w:val="en-US"/>
+        </w:rPr>
+        <w:t xml:space="preserve"> </w:t>
+      </w:r>
+      <w:r>
+        <w:rPr>
+          <w:lang w:val="en-US"/>
+        </w:rPr>
+        <w:t>Mô tả các bảng dữ liệu chính</w:t>
+      </w:r>
     </w:p>
     <w:tbl>
       <w:tblPr>
@@ -7447,18 +7962,18 @@
           <w:rFonts w:cs="Times New Roman"/>
         </w:rPr>
       </w:pPr>
-      <w:bookmarkStart w:id="41" w:name="_Toc_111"/>
-      <w:bookmarkStart w:id="42" w:name="_Toc_24"/>
-      <w:bookmarkStart w:id="43" w:name="_Toc241327767"/>
+      <w:bookmarkStart w:id="34" w:name="_Toc_111"/>
+      <w:bookmarkStart w:id="35" w:name="_Toc_24"/>
+      <w:bookmarkStart w:id="36" w:name="_Toc241327767"/>
       <w:r>
         <w:rPr>
           <w:rFonts w:cs="Times New Roman"/>
         </w:rPr>
         <w:t>Thiết kế API tiêu biểu</w:t>
       </w:r>
-      <w:bookmarkEnd w:id="41"/>
-      <w:bookmarkEnd w:id="42"/>
-      <w:bookmarkEnd w:id="43"/>
+      <w:bookmarkEnd w:id="34"/>
+      <w:bookmarkEnd w:id="35"/>
+      <w:bookmarkEnd w:id="36"/>
     </w:p>
     <w:p>
       <w:pPr>
@@ -7478,60 +7993,44 @@
     </w:p>
     <w:p>
       <w:pPr>
-        <w:spacing w:after="200" w:line="276" w:lineRule="auto"/>
-        <w:rPr>
-          <w:rFonts w:ascii="Times New Roman" w:hAnsi="Times New Roman" w:cs="Times New Roman"/>
-        </w:rPr>
-      </w:pPr>
-      <w:r>
-        <w:rPr>
-          <w:rFonts w:ascii="Times New Roman" w:hAnsi="Times New Roman" w:cs="Times New Roman"/>
-        </w:rPr>
+        <w:pStyle w:val="Caption"/>
+        <w:keepNext/>
+      </w:pPr>
+      <w:r>
         <w:lastRenderedPageBreak/>
-        <w:br w:type="page"/>
-      </w:r>
-    </w:p>
-    <w:p>
-      <w:pPr>
-        <w:pStyle w:val="Caption"/>
-        <w:spacing w:before="40"/>
-        <w:rPr>
-          <w:rFonts w:ascii="Times New Roman" w:hAnsi="Times New Roman" w:cs="Times New Roman"/>
-          <w:bCs w:val="0"/>
-          <w:szCs w:val="26"/>
-        </w:rPr>
-      </w:pPr>
-      <w:bookmarkStart w:id="44" w:name="_Toc_Tbl_23"/>
-      <w:r>
-        <w:rPr>
-          <w:rFonts w:ascii="Times New Roman" w:hAnsi="Times New Roman" w:cs="Times New Roman"/>
-          <w:bCs w:val="0"/>
-          <w:i/>
-          <w:szCs w:val="26"/>
-        </w:rPr>
-        <w:lastRenderedPageBreak/>
-        <w:t>Bảng 2.3</w:t>
-      </w:r>
-      <w:r>
-        <w:rPr>
-          <w:rFonts w:ascii="Times New Roman" w:hAnsi="Times New Roman" w:cs="Times New Roman"/>
-          <w:bCs w:val="0"/>
-          <w:i/>
-          <w:szCs w:val="26"/>
+        <w:t xml:space="preserve">Bảng </w:t>
+      </w:r>
+      <w:fldSimple w:instr=" STYLEREF 1 \s ">
+        <w:r>
+          <w:rPr>
+            <w:noProof/>
+          </w:rPr>
+          <w:t>2</w:t>
+        </w:r>
+      </w:fldSimple>
+      <w:r>
+        <w:t>.</w:t>
+      </w:r>
+      <w:fldSimple w:instr=" SEQ Bảng \* ARABIC \s 1 ">
+        <w:r>
+          <w:rPr>
+            <w:noProof/>
+          </w:rPr>
+          <w:t>3</w:t>
+        </w:r>
+      </w:fldSimple>
+      <w:r>
+        <w:rPr>
           <w:lang w:val="en-US"/>
         </w:rPr>
-        <w:t>:</w:t>
-      </w:r>
-      <w:r>
-        <w:rPr>
-          <w:rFonts w:ascii="Times New Roman" w:hAnsi="Times New Roman" w:cs="Times New Roman"/>
-          <w:bCs w:val="0"/>
-          <w:i/>
-          <w:szCs w:val="26"/>
-        </w:rPr>
-        <w:t xml:space="preserve"> Các API tiêu biểu</w:t>
-      </w:r>
-      <w:bookmarkEnd w:id="44"/>
+        <w:t xml:space="preserve"> </w:t>
+      </w:r>
+      <w:r>
+        <w:rPr>
+          <w:lang w:val="en-US"/>
+        </w:rPr>
+        <w:t>Các API tiêu biểu</w:t>
+      </w:r>
     </w:p>
     <w:tbl>
       <w:tblPr>
@@ -8352,18 +8851,18 @@
           <w:rFonts w:cs="Times New Roman"/>
         </w:rPr>
       </w:pPr>
-      <w:bookmarkStart w:id="45" w:name="_Toc_112"/>
-      <w:bookmarkStart w:id="46" w:name="_Toc_25"/>
-      <w:bookmarkStart w:id="47" w:name="_Toc241327768"/>
+      <w:bookmarkStart w:id="37" w:name="_Toc_112"/>
+      <w:bookmarkStart w:id="38" w:name="_Toc_25"/>
+      <w:bookmarkStart w:id="39" w:name="_Toc241327768"/>
       <w:r>
         <w:rPr>
           <w:rFonts w:cs="Times New Roman"/>
         </w:rPr>
         <w:t>Bảo mật và phân quyền</w:t>
       </w:r>
-      <w:bookmarkEnd w:id="45"/>
-      <w:bookmarkEnd w:id="46"/>
-      <w:bookmarkEnd w:id="47"/>
+      <w:bookmarkEnd w:id="37"/>
+      <w:bookmarkEnd w:id="38"/>
+      <w:bookmarkEnd w:id="39"/>
     </w:p>
     <w:p>
       <w:pPr>
@@ -8437,7 +8936,7 @@
           <w:szCs w:val="26"/>
         </w:rPr>
       </w:pPr>
-      <w:bookmarkStart w:id="48" w:name="_Toc_Tbl_24"/>
+      <w:bookmarkStart w:id="40" w:name="_Toc_Tbl_24"/>
       <w:r>
         <w:rPr>
           <w:rFonts w:ascii="Times New Roman" w:hAnsi="Times New Roman" w:cs="Times New Roman"/>
@@ -8467,7 +8966,7 @@
         </w:rPr>
         <w:t xml:space="preserve"> Ma trận phân quyền và bảo vệ hệ thống</w:t>
       </w:r>
-      <w:bookmarkEnd w:id="48"/>
+      <w:bookmarkEnd w:id="40"/>
     </w:p>
     <w:tbl>
       <w:tblPr>
@@ -9621,16 +10120,16 @@
         <w:spacing w:before="160" w:after="60"/>
         <w:jc w:val="center"/>
       </w:pPr>
-      <w:bookmarkStart w:id="49" w:name="_Toc_113"/>
-      <w:bookmarkStart w:id="50" w:name="_Toc_Ch3"/>
-      <w:bookmarkStart w:id="51" w:name="_Toc241327769"/>
+      <w:bookmarkStart w:id="41" w:name="_Toc_113"/>
+      <w:bookmarkStart w:id="42" w:name="_Toc_Ch3"/>
+      <w:bookmarkStart w:id="43" w:name="_Toc241327769"/>
       <w:r>
         <w:lastRenderedPageBreak/>
         <w:t>TRIỂN KHAI VÀ KẾT QUẢ</w:t>
       </w:r>
-      <w:bookmarkEnd w:id="49"/>
-      <w:bookmarkEnd w:id="50"/>
-      <w:bookmarkEnd w:id="51"/>
+      <w:bookmarkEnd w:id="41"/>
+      <w:bookmarkEnd w:id="42"/>
+      <w:bookmarkEnd w:id="43"/>
     </w:p>
     <w:p>
       <w:pPr>
@@ -9640,18 +10139,18 @@
           <w:rFonts w:cs="Times New Roman"/>
         </w:rPr>
       </w:pPr>
-      <w:bookmarkStart w:id="52" w:name="_Toc_114"/>
-      <w:bookmarkStart w:id="53" w:name="_Toc_31"/>
-      <w:bookmarkStart w:id="54" w:name="_Toc241327770"/>
+      <w:bookmarkStart w:id="44" w:name="_Toc_114"/>
+      <w:bookmarkStart w:id="45" w:name="_Toc_31"/>
+      <w:bookmarkStart w:id="46" w:name="_Toc241327770"/>
       <w:r>
         <w:rPr>
           <w:rFonts w:cs="Times New Roman"/>
         </w:rPr>
         <w:t>Môi trường triển khai</w:t>
       </w:r>
-      <w:bookmarkEnd w:id="52"/>
-      <w:bookmarkEnd w:id="53"/>
-      <w:bookmarkEnd w:id="54"/>
+      <w:bookmarkEnd w:id="44"/>
+      <w:bookmarkEnd w:id="45"/>
+      <w:bookmarkEnd w:id="46"/>
     </w:p>
     <w:p>
       <w:pPr>
@@ -9677,18 +10176,18 @@
           <w:rFonts w:cs="Times New Roman"/>
         </w:rPr>
       </w:pPr>
-      <w:bookmarkStart w:id="55" w:name="_Toc_115"/>
-      <w:bookmarkStart w:id="56" w:name="_Toc_32"/>
-      <w:bookmarkStart w:id="57" w:name="_Toc241327771"/>
+      <w:bookmarkStart w:id="47" w:name="_Toc_115"/>
+      <w:bookmarkStart w:id="48" w:name="_Toc_32"/>
+      <w:bookmarkStart w:id="49" w:name="_Toc241327771"/>
       <w:r>
         <w:rPr>
           <w:rFonts w:cs="Times New Roman"/>
         </w:rPr>
         <w:t>Kết quả các chức năng chính</w:t>
       </w:r>
-      <w:bookmarkEnd w:id="55"/>
-      <w:bookmarkEnd w:id="56"/>
-      <w:bookmarkEnd w:id="57"/>
+      <w:bookmarkEnd w:id="47"/>
+      <w:bookmarkEnd w:id="48"/>
+      <w:bookmarkEnd w:id="49"/>
     </w:p>
     <w:p>
       <w:pPr>
@@ -9698,9 +10197,9 @@
           <w:rFonts w:cs="Times New Roman"/>
         </w:rPr>
       </w:pPr>
-      <w:bookmarkStart w:id="58" w:name="_Toc_116"/>
-      <w:bookmarkStart w:id="59" w:name="_Toc_321"/>
-      <w:bookmarkStart w:id="60" w:name="_Toc241327772"/>
+      <w:bookmarkStart w:id="50" w:name="_Toc_116"/>
+      <w:bookmarkStart w:id="51" w:name="_Toc_321"/>
+      <w:bookmarkStart w:id="52" w:name="_Toc241327772"/>
       <w:r>
         <w:rPr>
           <w:rFonts w:cs="Times New Roman"/>
@@ -9708,9 +10207,9 @@
         </w:rPr>
         <w:t>Khách chưa đăng nhập</w:t>
       </w:r>
-      <w:bookmarkEnd w:id="58"/>
-      <w:bookmarkEnd w:id="59"/>
-      <w:bookmarkEnd w:id="60"/>
+      <w:bookmarkEnd w:id="50"/>
+      <w:bookmarkEnd w:id="51"/>
+      <w:bookmarkEnd w:id="52"/>
     </w:p>
     <w:p>
       <w:pPr>
@@ -9788,7 +10287,7 @@
           <w:szCs w:val="26"/>
         </w:rPr>
       </w:pPr>
-      <w:bookmarkStart w:id="61" w:name="_Toc_Fig_31"/>
+      <w:bookmarkStart w:id="53" w:name="_Toc_Fig_31"/>
       <w:r>
         <w:rPr>
           <w:rFonts w:ascii="Times New Roman" w:hAnsi="Times New Roman" w:cs="Times New Roman"/>
@@ -9798,7 +10297,7 @@
         </w:rPr>
         <w:t>Hình 3.1: Trang chủ và danh sách tin đăng (khách chưa đăng nhập)</w:t>
       </w:r>
-      <w:bookmarkEnd w:id="61"/>
+      <w:bookmarkEnd w:id="53"/>
     </w:p>
     <w:p>
       <w:pPr>
@@ -9891,7 +10390,7 @@
           <w:szCs w:val="26"/>
         </w:rPr>
       </w:pPr>
-      <w:bookmarkStart w:id="62" w:name="_Toc_Fig_32"/>
+      <w:bookmarkStart w:id="54" w:name="_Toc_Fig_32"/>
       <w:r>
         <w:rPr>
           <w:rFonts w:ascii="Times New Roman" w:hAnsi="Times New Roman" w:cs="Times New Roman"/>
@@ -9901,7 +10400,7 @@
         </w:rPr>
         <w:t>Hình 3.2: Chi tiết tin đăng phòng trọ và thông tin liên hệ</w:t>
       </w:r>
-      <w:bookmarkEnd w:id="62"/>
+      <w:bookmarkEnd w:id="54"/>
     </w:p>
     <w:p>
       <w:pPr>
@@ -9911,9 +10410,9 @@
           <w:rFonts w:cs="Times New Roman"/>
         </w:rPr>
       </w:pPr>
-      <w:bookmarkStart w:id="63" w:name="_Toc_117"/>
-      <w:bookmarkStart w:id="64" w:name="_Toc_322"/>
-      <w:bookmarkStart w:id="65" w:name="_Toc241327773"/>
+      <w:bookmarkStart w:id="55" w:name="_Toc_117"/>
+      <w:bookmarkStart w:id="56" w:name="_Toc_322"/>
+      <w:bookmarkStart w:id="57" w:name="_Toc241327773"/>
       <w:r>
         <w:rPr>
           <w:rFonts w:cs="Times New Roman"/>
@@ -9921,9 +10420,9 @@
         </w:rPr>
         <w:t>Người dùng đã đăng nhập</w:t>
       </w:r>
-      <w:bookmarkEnd w:id="63"/>
-      <w:bookmarkEnd w:id="64"/>
-      <w:bookmarkEnd w:id="65"/>
+      <w:bookmarkEnd w:id="55"/>
+      <w:bookmarkEnd w:id="56"/>
+      <w:bookmarkEnd w:id="57"/>
     </w:p>
     <w:p>
       <w:pPr>
@@ -10001,7 +10500,7 @@
           <w:szCs w:val="26"/>
         </w:rPr>
       </w:pPr>
-      <w:bookmarkStart w:id="66" w:name="_Toc_Fig_LG1"/>
+      <w:bookmarkStart w:id="58" w:name="_Toc_Fig_LG1"/>
       <w:r>
         <w:rPr>
           <w:rFonts w:ascii="Times New Roman" w:hAnsi="Times New Roman" w:cs="Times New Roman"/>
@@ -10011,7 +10510,7 @@
         </w:rPr>
         <w:t>Hình 3.3: Màn hình đăng nhập</w:t>
       </w:r>
-      <w:bookmarkEnd w:id="66"/>
+      <w:bookmarkEnd w:id="58"/>
     </w:p>
     <w:p>
       <w:pPr>
@@ -10104,7 +10603,7 @@
           <w:szCs w:val="26"/>
         </w:rPr>
       </w:pPr>
-      <w:bookmarkStart w:id="67" w:name="_Toc_Fig_33"/>
+      <w:bookmarkStart w:id="59" w:name="_Toc_Fig_33"/>
       <w:r>
         <w:rPr>
           <w:rFonts w:ascii="Times New Roman" w:hAnsi="Times New Roman" w:cs="Times New Roman"/>
@@ -10114,7 +10613,7 @@
         </w:rPr>
         <w:t>Hình 3.4: Form đăng tin cho thuê và tải ảnh lên MinIO</w:t>
       </w:r>
-      <w:bookmarkEnd w:id="67"/>
+      <w:bookmarkEnd w:id="59"/>
     </w:p>
     <w:p>
       <w:pPr>
@@ -10192,7 +10691,7 @@
           <w:szCs w:val="26"/>
         </w:rPr>
       </w:pPr>
-      <w:bookmarkStart w:id="68" w:name="_Toc_Fig_LG2"/>
+      <w:bookmarkStart w:id="60" w:name="_Toc_Fig_LG2"/>
       <w:r>
         <w:rPr>
           <w:rFonts w:ascii="Times New Roman" w:hAnsi="Times New Roman" w:cs="Times New Roman"/>
@@ -10202,7 +10701,7 @@
         </w:rPr>
         <w:t>Hình 3.5: Quản lý thư viện ảnh cá nhân</w:t>
       </w:r>
-      <w:bookmarkEnd w:id="68"/>
+      <w:bookmarkEnd w:id="60"/>
     </w:p>
     <w:p>
       <w:pPr>
@@ -10295,7 +10794,7 @@
           <w:szCs w:val="26"/>
         </w:rPr>
       </w:pPr>
-      <w:bookmarkStart w:id="69" w:name="_Toc_Fig_LG3"/>
+      <w:bookmarkStart w:id="61" w:name="_Toc_Fig_LG3"/>
       <w:r>
         <w:rPr>
           <w:rFonts w:ascii="Times New Roman" w:hAnsi="Times New Roman" w:cs="Times New Roman"/>
@@ -10305,7 +10804,7 @@
         </w:rPr>
         <w:t>Hình 3.6: Danh sách tin đăng yêu thích</w:t>
       </w:r>
-      <w:bookmarkEnd w:id="69"/>
+      <w:bookmarkEnd w:id="61"/>
     </w:p>
     <w:p>
       <w:pPr>
@@ -10315,9 +10814,9 @@
           <w:rFonts w:cs="Times New Roman"/>
         </w:rPr>
       </w:pPr>
-      <w:bookmarkStart w:id="70" w:name="_Toc_118"/>
-      <w:bookmarkStart w:id="71" w:name="_Toc_323"/>
-      <w:bookmarkStart w:id="72" w:name="_Toc241327774"/>
+      <w:bookmarkStart w:id="62" w:name="_Toc_118"/>
+      <w:bookmarkStart w:id="63" w:name="_Toc_323"/>
+      <w:bookmarkStart w:id="64" w:name="_Toc241327774"/>
       <w:r>
         <w:rPr>
           <w:rFonts w:cs="Times New Roman"/>
@@ -10325,9 +10824,9 @@
         </w:rPr>
         <w:t>Quản trị viên</w:t>
       </w:r>
-      <w:bookmarkEnd w:id="70"/>
-      <w:bookmarkEnd w:id="71"/>
-      <w:bookmarkEnd w:id="72"/>
+      <w:bookmarkEnd w:id="62"/>
+      <w:bookmarkEnd w:id="63"/>
+      <w:bookmarkEnd w:id="64"/>
     </w:p>
     <w:p>
       <w:pPr>
@@ -10421,7 +10920,7 @@
           <w:szCs w:val="26"/>
         </w:rPr>
       </w:pPr>
-      <w:bookmarkStart w:id="73" w:name="_Toc_Fig_34"/>
+      <w:bookmarkStart w:id="65" w:name="_Toc_Fig_34"/>
       <w:r>
         <w:rPr>
           <w:rFonts w:ascii="Times New Roman" w:hAnsi="Times New Roman" w:cs="Times New Roman"/>
@@ -10431,7 +10930,7 @@
         </w:rPr>
         <w:t>Hình 3.7: Hàng đợi duyệt và quản lý trạng thái tin đăng</w:t>
       </w:r>
-      <w:bookmarkEnd w:id="73"/>
+      <w:bookmarkEnd w:id="65"/>
     </w:p>
     <w:p>
       <w:pPr>
@@ -10523,7 +11022,7 @@
           <w:szCs w:val="26"/>
         </w:rPr>
       </w:pPr>
-      <w:bookmarkStart w:id="74" w:name="_Toc_Fig_35"/>
+      <w:bookmarkStart w:id="66" w:name="_Toc_Fig_35"/>
       <w:r>
         <w:rPr>
           <w:rFonts w:ascii="Times New Roman" w:hAnsi="Times New Roman" w:cs="Times New Roman"/>
@@ -10533,7 +11032,7 @@
         </w:rPr>
         <w:t>Hình 3.8: Dashboard biểu đồ phân tích thị trường và giá thuê</w:t>
       </w:r>
-      <w:bookmarkEnd w:id="74"/>
+      <w:bookmarkEnd w:id="66"/>
     </w:p>
     <w:p>
       <w:pPr>
@@ -10576,9 +11075,9 @@
           <w:rFonts w:cs="Times New Roman"/>
         </w:rPr>
       </w:pPr>
-      <w:bookmarkStart w:id="75" w:name="_Toc_119"/>
-      <w:bookmarkStart w:id="76" w:name="_Toc_324"/>
-      <w:bookmarkStart w:id="77" w:name="_Toc241327775"/>
+      <w:bookmarkStart w:id="67" w:name="_Toc_119"/>
+      <w:bookmarkStart w:id="68" w:name="_Toc_324"/>
+      <w:bookmarkStart w:id="69" w:name="_Toc241327775"/>
       <w:r>
         <w:rPr>
           <w:rFonts w:cs="Times New Roman"/>
@@ -10587,9 +11086,9 @@
         <w:lastRenderedPageBreak/>
         <w:t>Tin tức thị trường (module bổ sung)</w:t>
       </w:r>
-      <w:bookmarkEnd w:id="75"/>
-      <w:bookmarkEnd w:id="76"/>
-      <w:bookmarkEnd w:id="77"/>
+      <w:bookmarkEnd w:id="67"/>
+      <w:bookmarkEnd w:id="68"/>
+      <w:bookmarkEnd w:id="69"/>
     </w:p>
     <w:p>
       <w:pPr>
@@ -10667,7 +11166,7 @@
           <w:szCs w:val="26"/>
         </w:rPr>
       </w:pPr>
-      <w:bookmarkStart w:id="78" w:name="_Toc_Fig_36"/>
+      <w:bookmarkStart w:id="70" w:name="_Toc_Fig_36"/>
       <w:r>
         <w:rPr>
           <w:rFonts w:ascii="Times New Roman" w:hAnsi="Times New Roman" w:cs="Times New Roman"/>
@@ -10677,7 +11176,7 @@
         </w:rPr>
         <w:t>Hình 3.9: Trang Tin tức thị trường công khai</w:t>
       </w:r>
-      <w:bookmarkEnd w:id="78"/>
+      <w:bookmarkEnd w:id="70"/>
     </w:p>
     <w:p>
       <w:pPr>
@@ -10687,18 +11186,18 @@
           <w:rFonts w:cs="Times New Roman"/>
         </w:rPr>
       </w:pPr>
-      <w:bookmarkStart w:id="79" w:name="_Toc_121"/>
-      <w:bookmarkStart w:id="80" w:name="_Toc_34"/>
-      <w:bookmarkStart w:id="81" w:name="_Toc241327776"/>
+      <w:bookmarkStart w:id="71" w:name="_Toc_121"/>
+      <w:bookmarkStart w:id="72" w:name="_Toc_34"/>
+      <w:bookmarkStart w:id="73" w:name="_Toc241327776"/>
       <w:r>
         <w:rPr>
           <w:rFonts w:cs="Times New Roman"/>
         </w:rPr>
         <w:t>Khai báo sử dụng AI</w:t>
       </w:r>
-      <w:bookmarkEnd w:id="79"/>
-      <w:bookmarkEnd w:id="80"/>
-      <w:bookmarkEnd w:id="81"/>
+      <w:bookmarkEnd w:id="71"/>
+      <w:bookmarkEnd w:id="72"/>
+      <w:bookmarkEnd w:id="73"/>
     </w:p>
     <w:p>
       <w:pPr>
@@ -10734,31 +11233,33 @@
     </w:p>
     <w:p>
       <w:pPr>
-        <w:pStyle w:val="Title"/>
-        <w:pageBreakBefore/>
-        <w:spacing w:before="280" w:after="160"/>
-        <w:outlineLvl w:val="0"/>
-        <w:rPr>
-          <w:rFonts w:ascii="Times New Roman" w:hAnsi="Times New Roman" w:cs="Times New Roman"/>
-          <w:sz w:val="32"/>
-          <w:szCs w:val="32"/>
-        </w:rPr>
-      </w:pPr>
-      <w:bookmarkStart w:id="82" w:name="_Toc_122"/>
-      <w:bookmarkStart w:id="83" w:name="_Toc_KetLuan"/>
-      <w:bookmarkStart w:id="84" w:name="_Toc241327777"/>
-      <w:r>
-        <w:rPr>
-          <w:rFonts w:ascii="Times New Roman" w:hAnsi="Times New Roman" w:cs="Times New Roman"/>
-          <w:sz w:val="32"/>
-          <w:szCs w:val="32"/>
-        </w:rPr>
+        <w:spacing w:after="200" w:line="276" w:lineRule="auto"/>
+        <w:rPr>
+          <w:rFonts w:ascii="Times New Roman" w:hAnsi="Times New Roman" w:cs="Times New Roman"/>
+        </w:rPr>
+      </w:pPr>
+      <w:r>
+        <w:rPr>
+          <w:rFonts w:ascii="Times New Roman" w:hAnsi="Times New Roman" w:cs="Times New Roman"/>
+        </w:rPr>
+        <w:br w:type="page"/>
+      </w:r>
+    </w:p>
+    <w:p>
+      <w:pPr>
+        <w:pStyle w:val="Heading1"/>
+        <w:jc w:val="center"/>
+      </w:pPr>
+      <w:bookmarkStart w:id="74" w:name="_Toc_122"/>
+      <w:bookmarkStart w:id="75" w:name="_Toc_KetLuan"/>
+      <w:bookmarkStart w:id="76" w:name="_Toc241327777"/>
+      <w:r>
         <w:lastRenderedPageBreak/>
         <w:t>KẾT LUẬN</w:t>
       </w:r>
-      <w:bookmarkEnd w:id="82"/>
-      <w:bookmarkEnd w:id="83"/>
-      <w:bookmarkEnd w:id="84"/>
+      <w:bookmarkEnd w:id="74"/>
+      <w:bookmarkEnd w:id="75"/>
+      <w:bookmarkEnd w:id="76"/>
     </w:p>
     <w:p>
       <w:pPr>
@@ -10874,7 +11375,7 @@
           <w:szCs w:val="52"/>
         </w:rPr>
       </w:pPr>
-      <w:bookmarkStart w:id="85" w:name="_Toc_TaiLieu"/>
+      <w:bookmarkStart w:id="77" w:name="_Toc_TaiLieu"/>
       <w:r>
         <w:rPr>
           <w:rFonts w:ascii="Times New Roman" w:hAnsi="Times New Roman" w:cs="Times New Roman"/>
@@ -10901,7 +11402,7 @@
         <w:lastRenderedPageBreak/>
         <w:t>TÀI LIỆU THAM KHẢO</w:t>
       </w:r>
-      <w:bookmarkEnd w:id="85"/>
+      <w:bookmarkEnd w:id="77"/>
     </w:p>
     <w:p>
       <w:pPr>
@@ -11124,6 +11625,17 @@
         </w:rPr>
         <w:t>[8] Tài liệu đề bài môn học Kỹ thuật lập trình Python, docs/yêu cầu.md, nội bộ nhóm, 2026.</w:t>
       </w:r>
+    </w:p>
+    <w:p>
+      <w:pPr>
+        <w:spacing w:after="50" w:line="276" w:lineRule="auto"/>
+        <w:ind w:left="576" w:hanging="576"/>
+        <w:jc w:val="both"/>
+        <w:rPr>
+          <w:rFonts w:ascii="Times New Roman" w:hAnsi="Times New Roman" w:cs="Times New Roman"/>
+          <w:szCs w:val="26"/>
+        </w:rPr>
+      </w:pPr>
     </w:p>
     <w:sectPr>
       <w:footerReference w:type="default" r:id="rId27"/>

</xml_diff>